<commit_message>
v1.6.0.9001: Fixed formatting issues with table screenshots in vignette; added manual; added linebreaking option
</commit_message>
<xml_diff>
--- a/development/run-vignette/tables/Tern_2_group.docx
+++ b/development/run-vignette/tables/Tern_2_group.docx
@@ -10,7 +10,7 @@
       </w:tblPr>
       <w:tblGrid>
         <w:gridCol w:w="2605"/>
-        <w:gridCol w:w="1375"/>
+        <w:gridCol w:w="1664"/>
         <w:gridCol w:w="1375"/>
         <w:gridCol w:w="1203"/>
         <w:gridCol w:w="1625"/>
@@ -18,16 +18,17 @@
       </w:tblGrid>
       <w:tr>
         <w:trPr>
-          <w:trHeight w:val="842" w:hRule="auto"/>
+          <w:trHeight w:val="711" w:hRule="auto"/>
           <w:tblHeader/>
         </w:trPr>
-        <w:tc>
-          <w:tcPr>
-            <w:tcBorders>
-              <w:bottom w:val="single" w:sz="8" w:space="0" w:color="000000"/>
-              <w:top w:val="none" w:sz="0" w:space="0" w:color="000000"/>
-              <w:left w:val="single" w:sz="6" w:space="0" w:color="CDCDCD"/>
-              <w:right w:val="single" w:sz="6" w:space="0" w:color="CDCDCD"/>
+        header 1
+        <w:tc>
+          <w:tcPr>
+            <w:tcBorders>
+              <w:bottom w:val="single" w:sz="6" w:space="0" w:color="000000"/>
+              <w:top w:val="none" w:sz="0" w:space="0" w:color="000000"/>
+              <w:left w:val="none" w:sz="0" w:space="0" w:color="000000"/>
+              <w:right w:val="none" w:sz="0" w:space="0" w:color="000000"/>
             </w:tcBorders>
             <w:shd w:val="clear" w:color="auto" w:fill="CDCDCD"/>
             <w:tcMar>
@@ -40,7 +41,6 @@
           </w:tcPr>
           <w:p>
             <w:pPr>
-              <w:pStyle w:val="Normal"/>
               <w:jc w:val="left"/>
               <w:pBdr>
                 <w:bottom w:val="none" w:sz="0" w:space="0" w:color="000000"/>
@@ -72,43 +72,17 @@
                 <w:szCs w:val="18"/>
                 <w:color w:val="000000"/>
               </w:rPr>
-              <w:t xml:space="preserve">Category</w:t>
-            </w:r>
-            <w:r>
-              <w:rPr>
-                <w:rFonts w:ascii="Arial" w:hAnsi="Arial" w:eastAsia="Arial" w:cs="Arial"/>
-                <w:i w:val="false"/>
-                <w:b w:val="true"/>
-                <w:u w:val="none"/>
-                <w:strike w:val="false"/>
-                <w:sz w:val="18"/>
-                <w:szCs w:val="18"/>
-                <w:color w:val="000000"/>
-              </w:rPr>
-              <w:br/>
-            </w:r>
-            <w:r>
-              <w:rPr>
-                <w:rFonts w:ascii="Arial" w:hAnsi="Arial" w:eastAsia="Arial" w:cs="Arial"/>
-                <w:i w:val="false"/>
-                <w:b w:val="true"/>
-                <w:u w:val="none"/>
-                <w:strike w:val="false"/>
-                <w:sz w:val="18"/>
-                <w:szCs w:val="18"/>
-                <w:color w:val="000000"/>
-              </w:rPr>
-              <w:t xml:space="preserve">   Variable</w:t>
-            </w:r>
-          </w:p>
-        </w:tc>
-        <w:tc>
-          <w:tcPr>
-            <w:tcBorders>
-              <w:bottom w:val="single" w:sz="8" w:space="0" w:color="000000"/>
-              <w:top w:val="none" w:sz="0" w:space="0" w:color="000000"/>
-              <w:left w:val="single" w:sz="6" w:space="0" w:color="CDCDCD"/>
-              <w:right w:val="single" w:sz="6" w:space="0" w:color="CDCDCD"/>
+              <w:t xml:space="preserve">Variable</w:t>
+            </w:r>
+          </w:p>
+        </w:tc>
+        <w:tc>
+          <w:tcPr>
+            <w:tcBorders>
+              <w:bottom w:val="single" w:sz="6" w:space="0" w:color="000000"/>
+              <w:top w:val="none" w:sz="0" w:space="0" w:color="000000"/>
+              <w:left w:val="none" w:sz="0" w:space="0" w:color="000000"/>
+              <w:right w:val="none" w:sz="0" w:space="0" w:color="000000"/>
             </w:tcBorders>
             <w:shd w:val="clear" w:color="auto" w:fill="CDCDCD"/>
             <w:tcMar>
@@ -121,7 +95,6 @@
           </w:tcPr>
           <w:p>
             <w:pPr>
-              <w:pStyle w:val="Normal"/>
               <w:jc w:val="center"/>
               <w:pBdr>
                 <w:bottom w:val="none" w:sz="0" w:space="0" w:color="000000"/>
@@ -153,7 +126,7 @@
                 <w:szCs w:val="18"/>
                 <w:color w:val="000000"/>
               </w:rPr>
-              <w:t xml:space="preserve">No</w:t>
+              <w:t xml:space="preserve">No Recurrence</w:t>
             </w:r>
             <w:r>
               <w:rPr>
@@ -179,32 +152,6 @@
                 <w:szCs w:val="18"/>
                 <w:color w:val="000000"/>
               </w:rPr>
-              <w:t xml:space="preserve">Recurrence</w:t>
-            </w:r>
-            <w:r>
-              <w:rPr>
-                <w:rFonts w:ascii="Arial" w:hAnsi="Arial" w:eastAsia="Arial" w:cs="Arial"/>
-                <w:i w:val="false"/>
-                <w:b w:val="true"/>
-                <w:u w:val="none"/>
-                <w:strike w:val="false"/>
-                <w:sz w:val="18"/>
-                <w:szCs w:val="18"/>
-                <w:color w:val="000000"/>
-              </w:rPr>
-              <w:br/>
-            </w:r>
-            <w:r>
-              <w:rPr>
-                <w:rFonts w:ascii="Arial" w:hAnsi="Arial" w:eastAsia="Arial" w:cs="Arial"/>
-                <w:i w:val="false"/>
-                <w:b w:val="true"/>
-                <w:u w:val="none"/>
-                <w:strike w:val="false"/>
-                <w:sz w:val="18"/>
-                <w:szCs w:val="18"/>
-                <w:color w:val="000000"/>
-              </w:rPr>
               <w:t xml:space="preserve">(n = 461)</w:t>
             </w:r>
           </w:p>
@@ -212,10 +159,10 @@
         <w:tc>
           <w:tcPr>
             <w:tcBorders>
-              <w:bottom w:val="single" w:sz="8" w:space="0" w:color="000000"/>
-              <w:top w:val="none" w:sz="0" w:space="0" w:color="000000"/>
-              <w:left w:val="single" w:sz="6" w:space="0" w:color="CDCDCD"/>
-              <w:right w:val="single" w:sz="6" w:space="0" w:color="CDCDCD"/>
+              <w:bottom w:val="single" w:sz="6" w:space="0" w:color="000000"/>
+              <w:top w:val="none" w:sz="0" w:space="0" w:color="000000"/>
+              <w:left w:val="none" w:sz="0" w:space="0" w:color="000000"/>
+              <w:right w:val="none" w:sz="0" w:space="0" w:color="000000"/>
             </w:tcBorders>
             <w:shd w:val="clear" w:color="auto" w:fill="CDCDCD"/>
             <w:tcMar>
@@ -228,7 +175,6 @@
           </w:tcPr>
           <w:p>
             <w:pPr>
-              <w:pStyle w:val="Normal"/>
               <w:jc w:val="center"/>
               <w:pBdr>
                 <w:bottom w:val="none" w:sz="0" w:space="0" w:color="000000"/>
@@ -293,10 +239,10 @@
         <w:tc>
           <w:tcPr>
             <w:tcBorders>
-              <w:bottom w:val="single" w:sz="8" w:space="0" w:color="000000"/>
-              <w:top w:val="none" w:sz="0" w:space="0" w:color="000000"/>
-              <w:left w:val="single" w:sz="6" w:space="0" w:color="CDCDCD"/>
-              <w:right w:val="single" w:sz="6" w:space="0" w:color="CDCDCD"/>
+              <w:bottom w:val="single" w:sz="6" w:space="0" w:color="000000"/>
+              <w:top w:val="none" w:sz="0" w:space="0" w:color="000000"/>
+              <w:left w:val="none" w:sz="0" w:space="0" w:color="000000"/>
+              <w:right w:val="none" w:sz="0" w:space="0" w:color="000000"/>
             </w:tcBorders>
             <w:shd w:val="clear" w:color="auto" w:fill="CDCDCD"/>
             <w:tcMar>
@@ -309,7 +255,6 @@
           </w:tcPr>
           <w:p>
             <w:pPr>
-              <w:pStyle w:val="Normal"/>
               <w:jc w:val="center"/>
               <w:pBdr>
                 <w:bottom w:val="none" w:sz="0" w:space="0" w:color="000000"/>
@@ -374,10 +319,10 @@
         <w:tc>
           <w:tcPr>
             <w:tcBorders>
-              <w:bottom w:val="single" w:sz="8" w:space="0" w:color="000000"/>
-              <w:top w:val="none" w:sz="0" w:space="0" w:color="000000"/>
-              <w:left w:val="single" w:sz="6" w:space="0" w:color="CDCDCD"/>
-              <w:right w:val="single" w:sz="6" w:space="0" w:color="CDCDCD"/>
+              <w:bottom w:val="single" w:sz="6" w:space="0" w:color="000000"/>
+              <w:top w:val="none" w:sz="0" w:space="0" w:color="000000"/>
+              <w:left w:val="none" w:sz="0" w:space="0" w:color="000000"/>
+              <w:right w:val="none" w:sz="0" w:space="0" w:color="000000"/>
             </w:tcBorders>
             <w:shd w:val="clear" w:color="auto" w:fill="CDCDCD"/>
             <w:tcMar>
@@ -390,7 +335,6 @@
           </w:tcPr>
           <w:p>
             <w:pPr>
-              <w:pStyle w:val="Normal"/>
               <w:jc w:val="center"/>
               <w:pBdr>
                 <w:bottom w:val="none" w:sz="0" w:space="0" w:color="000000"/>
@@ -429,10 +373,10 @@
         <w:tc>
           <w:tcPr>
             <w:tcBorders>
-              <w:bottom w:val="single" w:sz="8" w:space="0" w:color="000000"/>
-              <w:top w:val="none" w:sz="0" w:space="0" w:color="000000"/>
-              <w:left w:val="single" w:sz="6" w:space="0" w:color="CDCDCD"/>
-              <w:right w:val="single" w:sz="6" w:space="0" w:color="CDCDCD"/>
+              <w:bottom w:val="single" w:sz="6" w:space="0" w:color="000000"/>
+              <w:top w:val="none" w:sz="0" w:space="0" w:color="000000"/>
+              <w:left w:val="none" w:sz="0" w:space="0" w:color="000000"/>
+              <w:right w:val="none" w:sz="0" w:space="0" w:color="000000"/>
             </w:tcBorders>
             <w:shd w:val="clear" w:color="auto" w:fill="CDCDCD"/>
             <w:tcMar>
@@ -445,7 +389,6 @@
           </w:tcPr>
           <w:p>
             <w:pPr>
-              <w:pStyle w:val="Normal"/>
               <w:jc w:val="center"/>
               <w:pBdr>
                 <w:bottom w:val="none" w:sz="0" w:space="0" w:color="000000"/>
@@ -486,27 +429,27 @@
         <w:trPr>
           <w:trHeight w:val="369" w:hRule="exact"/>
         </w:trPr>
+        body 1
         <w:tc>
           <w:tcPr>
             <w:gridSpan w:val="6"/>
             <w:tcBorders>
               <w:bottom w:val="single" w:sz="4" w:space="0" w:color="000000"/>
-              <w:top w:val="single" w:sz="8" w:space="0" w:color="000000"/>
-              <w:left w:val="none" w:sz="0" w:space="0" w:color="000000"/>
-              <w:right w:val="none" w:sz="0" w:space="0" w:color="000000"/>
-            </w:tcBorders>
-            <w:shd w:val="clear" w:color="auto" w:fill="FFFFFF"/>
-            <w:tcMar>
-              <w:top w:w="0" w:type="dxa"/>
-              <w:bottom w:w="0" w:type="dxa"/>
-              <w:left w:w="0" w:type="dxa"/>
-              <w:right w:w="0" w:type="dxa"/>
-            </w:tcMar>
-            <w:vAlign w:val="center"/>
-          </w:tcPr>
-          <w:p>
-            <w:pPr>
-              <w:pStyle w:val="Normal"/>
+              <w:top w:val="single" w:sz="6" w:space="0" w:color="000000"/>
+              <w:left w:val="none" w:sz="0" w:space="0" w:color="000000"/>
+              <w:right w:val="none" w:sz="0" w:space="0" w:color="000000"/>
+            </w:tcBorders>
+            <w:shd w:val="clear" w:color="auto" w:fill="FFFFFF"/>
+            <w:tcMar>
+              <w:top w:w="0" w:type="dxa"/>
+              <w:bottom w:w="0" w:type="dxa"/>
+              <w:left w:w="0" w:type="dxa"/>
+              <w:right w:w="0" w:type="dxa"/>
+            </w:tcMar>
+            <w:vAlign w:val="center"/>
+          </w:tcPr>
+          <w:p>
+            <w:pPr>
               <w:jc w:val="left"/>
               <w:pBdr>
                 <w:bottom w:val="none" w:sz="0" w:space="0" w:color="000000"/>
@@ -547,6 +490,7 @@
         <w:trPr>
           <w:trHeight w:val="270" w:hRule="exact"/>
         </w:trPr>
+        body 2
         <w:tc>
           <w:tcPr>
             <w:tcBorders>
@@ -566,7 +510,6 @@
           </w:tcPr>
           <w:p>
             <w:pPr>
-              <w:pStyle w:val="Normal"/>
               <w:jc w:val="left"/>
               <w:pBdr>
                 <w:bottom w:val="none" w:sz="0" w:space="0" w:color="000000"/>
@@ -621,7 +564,6 @@
           </w:tcPr>
           <w:p>
             <w:pPr>
-              <w:pStyle w:val="Normal"/>
               <w:jc w:val="center"/>
               <w:pBdr>
                 <w:bottom w:val="none" w:sz="0" w:space="0" w:color="000000"/>
@@ -676,7 +618,6 @@
           </w:tcPr>
           <w:p>
             <w:pPr>
-              <w:pStyle w:val="Normal"/>
               <w:jc w:val="center"/>
               <w:pBdr>
                 <w:bottom w:val="none" w:sz="0" w:space="0" w:color="000000"/>
@@ -731,7 +672,6 @@
           </w:tcPr>
           <w:p>
             <w:pPr>
-              <w:pStyle w:val="Normal"/>
               <w:jc w:val="center"/>
               <w:pBdr>
                 <w:bottom w:val="none" w:sz="0" w:space="0" w:color="000000"/>
@@ -786,7 +726,6 @@
           </w:tcPr>
           <w:p>
             <w:pPr>
-              <w:pStyle w:val="Normal"/>
               <w:jc w:val="center"/>
               <w:pBdr>
                 <w:bottom w:val="none" w:sz="0" w:space="0" w:color="000000"/>
@@ -841,7 +780,6 @@
           </w:tcPr>
           <w:p>
             <w:pPr>
-              <w:pStyle w:val="Normal"/>
               <w:jc w:val="center"/>
               <w:pBdr>
                 <w:bottom w:val="none" w:sz="0" w:space="0" w:color="000000"/>
@@ -882,26 +820,26 @@
         <w:trPr>
           <w:trHeight w:val="270" w:hRule="exact"/>
         </w:trPr>
-        <w:tc>
-          <w:tcPr>
-            <w:tcBorders>
-              <w:bottom w:val="none" w:sz="0" w:space="0" w:color="000000"/>
-              <w:top w:val="none" w:sz="0" w:space="0" w:color="000000"/>
-              <w:left w:val="none" w:sz="0" w:space="0" w:color="000000"/>
-              <w:right w:val="none" w:sz="0" w:space="0" w:color="000000"/>
-            </w:tcBorders>
-            <w:shd w:val="clear" w:color="auto" w:fill="FFFFFF"/>
-            <w:tcMar>
-              <w:top w:w="0" w:type="dxa"/>
-              <w:bottom w:w="0" w:type="dxa"/>
-              <w:left w:w="0" w:type="dxa"/>
-              <w:right w:w="0" w:type="dxa"/>
-            </w:tcMar>
-            <w:vAlign w:val="center"/>
-          </w:tcPr>
-          <w:p>
-            <w:pPr>
-              <w:pStyle w:val="Normal"/>
+        body 3
+        <w:tc>
+          <w:tcPr>
+            <w:tcBorders>
+              <w:bottom w:val="none" w:sz="0" w:space="0" w:color="000000"/>
+              <w:top w:val="none" w:sz="0" w:space="0" w:color="000000"/>
+              <w:left w:val="none" w:sz="0" w:space="0" w:color="000000"/>
+              <w:right w:val="none" w:sz="0" w:space="0" w:color="000000"/>
+            </w:tcBorders>
+            <w:shd w:val="clear" w:color="auto" w:fill="FFFFFF"/>
+            <w:tcMar>
+              <w:top w:w="0" w:type="dxa"/>
+              <w:bottom w:w="0" w:type="dxa"/>
+              <w:left w:w="0" w:type="dxa"/>
+              <w:right w:w="0" w:type="dxa"/>
+            </w:tcMar>
+            <w:vAlign w:val="center"/>
+          </w:tcPr>
+          <w:p>
+            <w:pPr>
               <w:jc w:val="left"/>
               <w:pBdr>
                 <w:bottom w:val="none" w:sz="0" w:space="0" w:color="000000"/>
@@ -956,7 +894,6 @@
           </w:tcPr>
           <w:p>
             <w:pPr>
-              <w:pStyle w:val="Normal"/>
               <w:jc w:val="center"/>
               <w:pBdr>
                 <w:bottom w:val="none" w:sz="0" w:space="0" w:color="000000"/>
@@ -1011,7 +948,6 @@
           </w:tcPr>
           <w:p>
             <w:pPr>
-              <w:pStyle w:val="Normal"/>
               <w:jc w:val="center"/>
               <w:pBdr>
                 <w:bottom w:val="none" w:sz="0" w:space="0" w:color="000000"/>
@@ -1066,7 +1002,6 @@
           </w:tcPr>
           <w:p>
             <w:pPr>
-              <w:pStyle w:val="Normal"/>
               <w:jc w:val="center"/>
               <w:pBdr>
                 <w:bottom w:val="none" w:sz="0" w:space="0" w:color="000000"/>
@@ -1121,7 +1056,6 @@
           </w:tcPr>
           <w:p>
             <w:pPr>
-              <w:pStyle w:val="Normal"/>
               <w:jc w:val="center"/>
               <w:pBdr>
                 <w:bottom w:val="none" w:sz="0" w:space="0" w:color="000000"/>
@@ -1176,7 +1110,6 @@
           </w:tcPr>
           <w:p>
             <w:pPr>
-              <w:pStyle w:val="Normal"/>
               <w:jc w:val="center"/>
               <w:pBdr>
                 <w:bottom w:val="none" w:sz="0" w:space="0" w:color="000000"/>
@@ -1217,26 +1150,26 @@
         <w:trPr>
           <w:trHeight w:val="270" w:hRule="exact"/>
         </w:trPr>
-        <w:tc>
-          <w:tcPr>
-            <w:tcBorders>
-              <w:bottom w:val="none" w:sz="0" w:space="0" w:color="000000"/>
-              <w:top w:val="none" w:sz="0" w:space="0" w:color="000000"/>
-              <w:left w:val="none" w:sz="0" w:space="0" w:color="000000"/>
-              <w:right w:val="none" w:sz="0" w:space="0" w:color="000000"/>
-            </w:tcBorders>
-            <w:shd w:val="clear" w:color="auto" w:fill="FFFFFF"/>
-            <w:tcMar>
-              <w:top w:w="0" w:type="dxa"/>
-              <w:bottom w:w="0" w:type="dxa"/>
-              <w:left w:w="0" w:type="dxa"/>
-              <w:right w:w="0" w:type="dxa"/>
-            </w:tcMar>
-            <w:vAlign w:val="center"/>
-          </w:tcPr>
-          <w:p>
-            <w:pPr>
-              <w:pStyle w:val="Normal"/>
+        body 4
+        <w:tc>
+          <w:tcPr>
+            <w:tcBorders>
+              <w:bottom w:val="none" w:sz="0" w:space="0" w:color="000000"/>
+              <w:top w:val="none" w:sz="0" w:space="0" w:color="000000"/>
+              <w:left w:val="none" w:sz="0" w:space="0" w:color="000000"/>
+              <w:right w:val="none" w:sz="0" w:space="0" w:color="000000"/>
+            </w:tcBorders>
+            <w:shd w:val="clear" w:color="auto" w:fill="FFFFFF"/>
+            <w:tcMar>
+              <w:top w:w="0" w:type="dxa"/>
+              <w:bottom w:w="0" w:type="dxa"/>
+              <w:left w:w="0" w:type="dxa"/>
+              <w:right w:w="0" w:type="dxa"/>
+            </w:tcMar>
+            <w:vAlign w:val="center"/>
+          </w:tcPr>
+          <w:p>
+            <w:pPr>
               <w:jc w:val="left"/>
               <w:pBdr>
                 <w:bottom w:val="none" w:sz="0" w:space="0" w:color="000000"/>
@@ -1291,7 +1224,6 @@
           </w:tcPr>
           <w:p>
             <w:pPr>
-              <w:pStyle w:val="Normal"/>
               <w:jc w:val="center"/>
               <w:pBdr>
                 <w:bottom w:val="none" w:sz="0" w:space="0" w:color="000000"/>
@@ -1346,7 +1278,6 @@
           </w:tcPr>
           <w:p>
             <w:pPr>
-              <w:pStyle w:val="Normal"/>
               <w:jc w:val="center"/>
               <w:pBdr>
                 <w:bottom w:val="none" w:sz="0" w:space="0" w:color="000000"/>
@@ -1401,7 +1332,6 @@
           </w:tcPr>
           <w:p>
             <w:pPr>
-              <w:pStyle w:val="Normal"/>
               <w:jc w:val="center"/>
               <w:pBdr>
                 <w:bottom w:val="none" w:sz="0" w:space="0" w:color="000000"/>
@@ -1456,7 +1386,6 @@
           </w:tcPr>
           <w:p>
             <w:pPr>
-              <w:pStyle w:val="Normal"/>
               <w:jc w:val="center"/>
               <w:pBdr>
                 <w:bottom w:val="none" w:sz="0" w:space="0" w:color="000000"/>
@@ -1511,7 +1440,6 @@
           </w:tcPr>
           <w:p>
             <w:pPr>
-              <w:pStyle w:val="Normal"/>
               <w:jc w:val="center"/>
               <w:pBdr>
                 <w:bottom w:val="none" w:sz="0" w:space="0" w:color="000000"/>
@@ -1552,26 +1480,26 @@
         <w:trPr>
           <w:trHeight w:val="270" w:hRule="exact"/>
         </w:trPr>
-        <w:tc>
-          <w:tcPr>
-            <w:tcBorders>
-              <w:bottom w:val="none" w:sz="0" w:space="0" w:color="000000"/>
-              <w:top w:val="none" w:sz="0" w:space="0" w:color="000000"/>
-              <w:left w:val="none" w:sz="0" w:space="0" w:color="000000"/>
-              <w:right w:val="none" w:sz="0" w:space="0" w:color="000000"/>
-            </w:tcBorders>
-            <w:shd w:val="clear" w:color="auto" w:fill="FFFFFF"/>
-            <w:tcMar>
-              <w:top w:w="0" w:type="dxa"/>
-              <w:bottom w:w="0" w:type="dxa"/>
-              <w:left w:w="0" w:type="dxa"/>
-              <w:right w:w="0" w:type="dxa"/>
-            </w:tcMar>
-            <w:vAlign w:val="center"/>
-          </w:tcPr>
-          <w:p>
-            <w:pPr>
-              <w:pStyle w:val="Normal"/>
+        body 5
+        <w:tc>
+          <w:tcPr>
+            <w:tcBorders>
+              <w:bottom w:val="none" w:sz="0" w:space="0" w:color="000000"/>
+              <w:top w:val="none" w:sz="0" w:space="0" w:color="000000"/>
+              <w:left w:val="none" w:sz="0" w:space="0" w:color="000000"/>
+              <w:right w:val="none" w:sz="0" w:space="0" w:color="000000"/>
+            </w:tcBorders>
+            <w:shd w:val="clear" w:color="auto" w:fill="FFFFFF"/>
+            <w:tcMar>
+              <w:top w:w="0" w:type="dxa"/>
+              <w:bottom w:w="0" w:type="dxa"/>
+              <w:left w:w="0" w:type="dxa"/>
+              <w:right w:w="0" w:type="dxa"/>
+            </w:tcMar>
+            <w:vAlign w:val="center"/>
+          </w:tcPr>
+          <w:p>
+            <w:pPr>
               <w:jc w:val="left"/>
               <w:pBdr>
                 <w:bottom w:val="none" w:sz="0" w:space="0" w:color="000000"/>
@@ -1626,7 +1554,6 @@
           </w:tcPr>
           <w:p>
             <w:pPr>
-              <w:pStyle w:val="Normal"/>
               <w:jc w:val="center"/>
               <w:pBdr>
                 <w:bottom w:val="none" w:sz="0" w:space="0" w:color="000000"/>
@@ -1681,7 +1608,6 @@
           </w:tcPr>
           <w:p>
             <w:pPr>
-              <w:pStyle w:val="Normal"/>
               <w:jc w:val="center"/>
               <w:pBdr>
                 <w:bottom w:val="none" w:sz="0" w:space="0" w:color="000000"/>
@@ -1736,7 +1662,6 @@
           </w:tcPr>
           <w:p>
             <w:pPr>
-              <w:pStyle w:val="Normal"/>
               <w:jc w:val="center"/>
               <w:pBdr>
                 <w:bottom w:val="none" w:sz="0" w:space="0" w:color="000000"/>
@@ -1791,7 +1716,6 @@
           </w:tcPr>
           <w:p>
             <w:pPr>
-              <w:pStyle w:val="Normal"/>
               <w:jc w:val="center"/>
               <w:pBdr>
                 <w:bottom w:val="none" w:sz="0" w:space="0" w:color="000000"/>
@@ -1846,7 +1770,6 @@
           </w:tcPr>
           <w:p>
             <w:pPr>
-              <w:pStyle w:val="Normal"/>
               <w:jc w:val="center"/>
               <w:pBdr>
                 <w:bottom w:val="none" w:sz="0" w:space="0" w:color="000000"/>
@@ -1887,6 +1810,7 @@
         <w:trPr>
           <w:trHeight w:val="369" w:hRule="exact"/>
         </w:trPr>
+        body 6
         <w:tc>
           <w:tcPr>
             <w:gridSpan w:val="6"/>
@@ -1907,7 +1831,6 @@
           </w:tcPr>
           <w:p>
             <w:pPr>
-              <w:pStyle w:val="Normal"/>
               <w:jc w:val="left"/>
               <w:pBdr>
                 <w:bottom w:val="none" w:sz="0" w:space="0" w:color="000000"/>
@@ -1948,6 +1871,7 @@
         <w:trPr>
           <w:trHeight w:val="270" w:hRule="exact"/>
         </w:trPr>
+        body 7
         <w:tc>
           <w:tcPr>
             <w:tcBorders>
@@ -1967,7 +1891,6 @@
           </w:tcPr>
           <w:p>
             <w:pPr>
-              <w:pStyle w:val="Normal"/>
               <w:jc w:val="left"/>
               <w:pBdr>
                 <w:bottom w:val="none" w:sz="0" w:space="0" w:color="000000"/>
@@ -2022,7 +1945,6 @@
           </w:tcPr>
           <w:p>
             <w:pPr>
-              <w:pStyle w:val="Normal"/>
               <w:jc w:val="center"/>
               <w:pBdr>
                 <w:bottom w:val="none" w:sz="0" w:space="0" w:color="000000"/>
@@ -2077,7 +1999,6 @@
           </w:tcPr>
           <w:p>
             <w:pPr>
-              <w:pStyle w:val="Normal"/>
               <w:jc w:val="center"/>
               <w:pBdr>
                 <w:bottom w:val="none" w:sz="0" w:space="0" w:color="000000"/>
@@ -2132,7 +2053,6 @@
           </w:tcPr>
           <w:p>
             <w:pPr>
-              <w:pStyle w:val="Normal"/>
               <w:jc w:val="center"/>
               <w:pBdr>
                 <w:bottom w:val="none" w:sz="0" w:space="0" w:color="000000"/>
@@ -2187,7 +2107,6 @@
           </w:tcPr>
           <w:p>
             <w:pPr>
-              <w:pStyle w:val="Normal"/>
               <w:jc w:val="center"/>
               <w:pBdr>
                 <w:bottom w:val="none" w:sz="0" w:space="0" w:color="000000"/>
@@ -2242,7 +2161,6 @@
           </w:tcPr>
           <w:p>
             <w:pPr>
-              <w:pStyle w:val="Normal"/>
               <w:jc w:val="center"/>
               <w:pBdr>
                 <w:bottom w:val="none" w:sz="0" w:space="0" w:color="000000"/>
@@ -2283,26 +2201,26 @@
         <w:trPr>
           <w:trHeight w:val="270" w:hRule="exact"/>
         </w:trPr>
-        <w:tc>
-          <w:tcPr>
-            <w:tcBorders>
-              <w:bottom w:val="none" w:sz="0" w:space="0" w:color="000000"/>
-              <w:top w:val="none" w:sz="0" w:space="0" w:color="000000"/>
-              <w:left w:val="none" w:sz="0" w:space="0" w:color="000000"/>
-              <w:right w:val="none" w:sz="0" w:space="0" w:color="000000"/>
-            </w:tcBorders>
-            <w:shd w:val="clear" w:color="auto" w:fill="FFFFFF"/>
-            <w:tcMar>
-              <w:top w:w="0" w:type="dxa"/>
-              <w:bottom w:w="0" w:type="dxa"/>
-              <w:left w:w="0" w:type="dxa"/>
-              <w:right w:w="0" w:type="dxa"/>
-            </w:tcMar>
-            <w:vAlign w:val="center"/>
-          </w:tcPr>
-          <w:p>
-            <w:pPr>
-              <w:pStyle w:val="Normal"/>
+        body 8
+        <w:tc>
+          <w:tcPr>
+            <w:tcBorders>
+              <w:bottom w:val="none" w:sz="0" w:space="0" w:color="000000"/>
+              <w:top w:val="none" w:sz="0" w:space="0" w:color="000000"/>
+              <w:left w:val="none" w:sz="0" w:space="0" w:color="000000"/>
+              <w:right w:val="none" w:sz="0" w:space="0" w:color="000000"/>
+            </w:tcBorders>
+            <w:shd w:val="clear" w:color="auto" w:fill="FFFFFF"/>
+            <w:tcMar>
+              <w:top w:w="0" w:type="dxa"/>
+              <w:bottom w:w="0" w:type="dxa"/>
+              <w:left w:w="0" w:type="dxa"/>
+              <w:right w:w="0" w:type="dxa"/>
+            </w:tcMar>
+            <w:vAlign w:val="center"/>
+          </w:tcPr>
+          <w:p>
+            <w:pPr>
               <w:jc w:val="left"/>
               <w:pBdr>
                 <w:bottom w:val="none" w:sz="0" w:space="0" w:color="000000"/>
@@ -2357,7 +2275,6 @@
           </w:tcPr>
           <w:p>
             <w:pPr>
-              <w:pStyle w:val="Normal"/>
               <w:jc w:val="center"/>
               <w:pBdr>
                 <w:bottom w:val="none" w:sz="0" w:space="0" w:color="000000"/>
@@ -2412,7 +2329,6 @@
           </w:tcPr>
           <w:p>
             <w:pPr>
-              <w:pStyle w:val="Normal"/>
               <w:jc w:val="center"/>
               <w:pBdr>
                 <w:bottom w:val="none" w:sz="0" w:space="0" w:color="000000"/>
@@ -2467,7 +2383,6 @@
           </w:tcPr>
           <w:p>
             <w:pPr>
-              <w:pStyle w:val="Normal"/>
               <w:jc w:val="center"/>
               <w:pBdr>
                 <w:bottom w:val="none" w:sz="0" w:space="0" w:color="000000"/>
@@ -2522,7 +2437,6 @@
           </w:tcPr>
           <w:p>
             <w:pPr>
-              <w:pStyle w:val="Normal"/>
               <w:jc w:val="center"/>
               <w:pBdr>
                 <w:bottom w:val="none" w:sz="0" w:space="0" w:color="000000"/>
@@ -2577,7 +2491,6 @@
           </w:tcPr>
           <w:p>
             <w:pPr>
-              <w:pStyle w:val="Normal"/>
               <w:jc w:val="center"/>
               <w:pBdr>
                 <w:bottom w:val="none" w:sz="0" w:space="0" w:color="000000"/>
@@ -2618,6 +2531,7 @@
         <w:trPr>
           <w:trHeight w:val="369" w:hRule="exact"/>
         </w:trPr>
+        body 9
         <w:tc>
           <w:tcPr>
             <w:gridSpan w:val="6"/>
@@ -2638,7 +2552,6 @@
           </w:tcPr>
           <w:p>
             <w:pPr>
-              <w:pStyle w:val="Normal"/>
               <w:jc w:val="left"/>
               <w:pBdr>
                 <w:bottom w:val="none" w:sz="0" w:space="0" w:color="000000"/>
@@ -2679,6 +2592,7 @@
         <w:trPr>
           <w:trHeight w:val="270" w:hRule="exact"/>
         </w:trPr>
+        body10
         <w:tc>
           <w:tcPr>
             <w:tcBorders>
@@ -2698,7 +2612,6 @@
           </w:tcPr>
           <w:p>
             <w:pPr>
-              <w:pStyle w:val="Normal"/>
               <w:jc w:val="left"/>
               <w:pBdr>
                 <w:bottom w:val="none" w:sz="0" w:space="0" w:color="000000"/>
@@ -2753,7 +2666,6 @@
           </w:tcPr>
           <w:p>
             <w:pPr>
-              <w:pStyle w:val="Normal"/>
               <w:jc w:val="center"/>
               <w:pBdr>
                 <w:bottom w:val="none" w:sz="0" w:space="0" w:color="000000"/>
@@ -2808,7 +2720,6 @@
           </w:tcPr>
           <w:p>
             <w:pPr>
-              <w:pStyle w:val="Normal"/>
               <w:jc w:val="center"/>
               <w:pBdr>
                 <w:bottom w:val="none" w:sz="0" w:space="0" w:color="000000"/>
@@ -2863,7 +2774,6 @@
           </w:tcPr>
           <w:p>
             <w:pPr>
-              <w:pStyle w:val="Normal"/>
               <w:jc w:val="center"/>
               <w:pBdr>
                 <w:bottom w:val="none" w:sz="0" w:space="0" w:color="000000"/>
@@ -2918,7 +2828,6 @@
           </w:tcPr>
           <w:p>
             <w:pPr>
-              <w:pStyle w:val="Normal"/>
               <w:jc w:val="center"/>
               <w:pBdr>
                 <w:bottom w:val="none" w:sz="0" w:space="0" w:color="000000"/>
@@ -2973,7 +2882,6 @@
           </w:tcPr>
           <w:p>
             <w:pPr>
-              <w:pStyle w:val="Normal"/>
               <w:jc w:val="center"/>
               <w:pBdr>
                 <w:bottom w:val="none" w:sz="0" w:space="0" w:color="000000"/>
@@ -3014,26 +2922,26 @@
         <w:trPr>
           <w:trHeight w:val="270" w:hRule="exact"/>
         </w:trPr>
-        <w:tc>
-          <w:tcPr>
-            <w:tcBorders>
-              <w:bottom w:val="none" w:sz="0" w:space="0" w:color="000000"/>
-              <w:top w:val="none" w:sz="0" w:space="0" w:color="000000"/>
-              <w:left w:val="none" w:sz="0" w:space="0" w:color="000000"/>
-              <w:right w:val="none" w:sz="0" w:space="0" w:color="000000"/>
-            </w:tcBorders>
-            <w:shd w:val="clear" w:color="auto" w:fill="FFFFFF"/>
-            <w:tcMar>
-              <w:top w:w="0" w:type="dxa"/>
-              <w:bottom w:w="0" w:type="dxa"/>
-              <w:left w:w="0" w:type="dxa"/>
-              <w:right w:w="0" w:type="dxa"/>
-            </w:tcMar>
-            <w:vAlign w:val="center"/>
-          </w:tcPr>
-          <w:p>
-            <w:pPr>
-              <w:pStyle w:val="Normal"/>
+        body11
+        <w:tc>
+          <w:tcPr>
+            <w:tcBorders>
+              <w:bottom w:val="none" w:sz="0" w:space="0" w:color="000000"/>
+              <w:top w:val="none" w:sz="0" w:space="0" w:color="000000"/>
+              <w:left w:val="none" w:sz="0" w:space="0" w:color="000000"/>
+              <w:right w:val="none" w:sz="0" w:space="0" w:color="000000"/>
+            </w:tcBorders>
+            <w:shd w:val="clear" w:color="auto" w:fill="FFFFFF"/>
+            <w:tcMar>
+              <w:top w:w="0" w:type="dxa"/>
+              <w:bottom w:w="0" w:type="dxa"/>
+              <w:left w:w="0" w:type="dxa"/>
+              <w:right w:w="0" w:type="dxa"/>
+            </w:tcMar>
+            <w:vAlign w:val="center"/>
+          </w:tcPr>
+          <w:p>
+            <w:pPr>
               <w:jc w:val="left"/>
               <w:pBdr>
                 <w:bottom w:val="none" w:sz="0" w:space="0" w:color="000000"/>
@@ -3088,7 +2996,6 @@
           </w:tcPr>
           <w:p>
             <w:pPr>
-              <w:pStyle w:val="Normal"/>
               <w:jc w:val="center"/>
               <w:pBdr>
                 <w:bottom w:val="none" w:sz="0" w:space="0" w:color="000000"/>
@@ -3143,7 +3050,6 @@
           </w:tcPr>
           <w:p>
             <w:pPr>
-              <w:pStyle w:val="Normal"/>
               <w:jc w:val="center"/>
               <w:pBdr>
                 <w:bottom w:val="none" w:sz="0" w:space="0" w:color="000000"/>
@@ -3198,7 +3104,6 @@
           </w:tcPr>
           <w:p>
             <w:pPr>
-              <w:pStyle w:val="Normal"/>
               <w:jc w:val="center"/>
               <w:pBdr>
                 <w:bottom w:val="none" w:sz="0" w:space="0" w:color="000000"/>
@@ -3253,7 +3158,6 @@
           </w:tcPr>
           <w:p>
             <w:pPr>
-              <w:pStyle w:val="Normal"/>
               <w:jc w:val="center"/>
               <w:pBdr>
                 <w:bottom w:val="none" w:sz="0" w:space="0" w:color="000000"/>
@@ -3308,7 +3212,6 @@
           </w:tcPr>
           <w:p>
             <w:pPr>
-              <w:pStyle w:val="Normal"/>
               <w:jc w:val="center"/>
               <w:pBdr>
                 <w:bottom w:val="none" w:sz="0" w:space="0" w:color="000000"/>
@@ -3349,26 +3252,26 @@
         <w:trPr>
           <w:trHeight w:val="270" w:hRule="exact"/>
         </w:trPr>
-        <w:tc>
-          <w:tcPr>
-            <w:tcBorders>
-              <w:bottom w:val="none" w:sz="0" w:space="0" w:color="000000"/>
-              <w:top w:val="none" w:sz="0" w:space="0" w:color="000000"/>
-              <w:left w:val="none" w:sz="0" w:space="0" w:color="000000"/>
-              <w:right w:val="none" w:sz="0" w:space="0" w:color="000000"/>
-            </w:tcBorders>
-            <w:shd w:val="clear" w:color="auto" w:fill="FFFFFF"/>
-            <w:tcMar>
-              <w:top w:w="0" w:type="dxa"/>
-              <w:bottom w:w="0" w:type="dxa"/>
-              <w:left w:w="0" w:type="dxa"/>
-              <w:right w:w="0" w:type="dxa"/>
-            </w:tcMar>
-            <w:vAlign w:val="center"/>
-          </w:tcPr>
-          <w:p>
-            <w:pPr>
-              <w:pStyle w:val="Normal"/>
+        body12
+        <w:tc>
+          <w:tcPr>
+            <w:tcBorders>
+              <w:bottom w:val="none" w:sz="0" w:space="0" w:color="000000"/>
+              <w:top w:val="none" w:sz="0" w:space="0" w:color="000000"/>
+              <w:left w:val="none" w:sz="0" w:space="0" w:color="000000"/>
+              <w:right w:val="none" w:sz="0" w:space="0" w:color="000000"/>
+            </w:tcBorders>
+            <w:shd w:val="clear" w:color="auto" w:fill="FFFFFF"/>
+            <w:tcMar>
+              <w:top w:w="0" w:type="dxa"/>
+              <w:bottom w:w="0" w:type="dxa"/>
+              <w:left w:w="0" w:type="dxa"/>
+              <w:right w:w="0" w:type="dxa"/>
+            </w:tcMar>
+            <w:vAlign w:val="center"/>
+          </w:tcPr>
+          <w:p>
+            <w:pPr>
               <w:jc w:val="left"/>
               <w:pBdr>
                 <w:bottom w:val="none" w:sz="0" w:space="0" w:color="000000"/>
@@ -3423,7 +3326,6 @@
           </w:tcPr>
           <w:p>
             <w:pPr>
-              <w:pStyle w:val="Normal"/>
               <w:jc w:val="center"/>
               <w:pBdr>
                 <w:bottom w:val="none" w:sz="0" w:space="0" w:color="000000"/>
@@ -3478,7 +3380,6 @@
           </w:tcPr>
           <w:p>
             <w:pPr>
-              <w:pStyle w:val="Normal"/>
               <w:jc w:val="center"/>
               <w:pBdr>
                 <w:bottom w:val="none" w:sz="0" w:space="0" w:color="000000"/>
@@ -3533,7 +3434,6 @@
           </w:tcPr>
           <w:p>
             <w:pPr>
-              <w:pStyle w:val="Normal"/>
               <w:jc w:val="center"/>
               <w:pBdr>
                 <w:bottom w:val="none" w:sz="0" w:space="0" w:color="000000"/>
@@ -3588,7 +3488,6 @@
           </w:tcPr>
           <w:p>
             <w:pPr>
-              <w:pStyle w:val="Normal"/>
               <w:jc w:val="center"/>
               <w:pBdr>
                 <w:bottom w:val="none" w:sz="0" w:space="0" w:color="000000"/>
@@ -3643,7 +3542,6 @@
           </w:tcPr>
           <w:p>
             <w:pPr>
-              <w:pStyle w:val="Normal"/>
               <w:jc w:val="center"/>
               <w:pBdr>
                 <w:bottom w:val="none" w:sz="0" w:space="0" w:color="000000"/>
@@ -3684,26 +3582,26 @@
         <w:trPr>
           <w:trHeight w:val="270" w:hRule="exact"/>
         </w:trPr>
-        <w:tc>
-          <w:tcPr>
-            <w:tcBorders>
-              <w:bottom w:val="none" w:sz="0" w:space="0" w:color="000000"/>
-              <w:top w:val="none" w:sz="0" w:space="0" w:color="000000"/>
-              <w:left w:val="none" w:sz="0" w:space="0" w:color="000000"/>
-              <w:right w:val="none" w:sz="0" w:space="0" w:color="000000"/>
-            </w:tcBorders>
-            <w:shd w:val="clear" w:color="auto" w:fill="FFFFFF"/>
-            <w:tcMar>
-              <w:top w:w="0" w:type="dxa"/>
-              <w:bottom w:w="0" w:type="dxa"/>
-              <w:left w:w="0" w:type="dxa"/>
-              <w:right w:w="0" w:type="dxa"/>
-            </w:tcMar>
-            <w:vAlign w:val="center"/>
-          </w:tcPr>
-          <w:p>
-            <w:pPr>
-              <w:pStyle w:val="Normal"/>
+        body13
+        <w:tc>
+          <w:tcPr>
+            <w:tcBorders>
+              <w:bottom w:val="none" w:sz="0" w:space="0" w:color="000000"/>
+              <w:top w:val="none" w:sz="0" w:space="0" w:color="000000"/>
+              <w:left w:val="none" w:sz="0" w:space="0" w:color="000000"/>
+              <w:right w:val="none" w:sz="0" w:space="0" w:color="000000"/>
+            </w:tcBorders>
+            <w:shd w:val="clear" w:color="auto" w:fill="FFFFFF"/>
+            <w:tcMar>
+              <w:top w:w="0" w:type="dxa"/>
+              <w:bottom w:w="0" w:type="dxa"/>
+              <w:left w:w="0" w:type="dxa"/>
+              <w:right w:w="0" w:type="dxa"/>
+            </w:tcMar>
+            <w:vAlign w:val="center"/>
+          </w:tcPr>
+          <w:p>
+            <w:pPr>
               <w:jc w:val="left"/>
               <w:pBdr>
                 <w:bottom w:val="none" w:sz="0" w:space="0" w:color="000000"/>
@@ -3758,7 +3656,6 @@
           </w:tcPr>
           <w:p>
             <w:pPr>
-              <w:pStyle w:val="Normal"/>
               <w:jc w:val="center"/>
               <w:pBdr>
                 <w:bottom w:val="none" w:sz="0" w:space="0" w:color="000000"/>
@@ -3813,7 +3710,6 @@
           </w:tcPr>
           <w:p>
             <w:pPr>
-              <w:pStyle w:val="Normal"/>
               <w:jc w:val="center"/>
               <w:pBdr>
                 <w:bottom w:val="none" w:sz="0" w:space="0" w:color="000000"/>
@@ -3868,7 +3764,6 @@
           </w:tcPr>
           <w:p>
             <w:pPr>
-              <w:pStyle w:val="Normal"/>
               <w:jc w:val="center"/>
               <w:pBdr>
                 <w:bottom w:val="none" w:sz="0" w:space="0" w:color="000000"/>
@@ -3923,7 +3818,6 @@
           </w:tcPr>
           <w:p>
             <w:pPr>
-              <w:pStyle w:val="Normal"/>
               <w:jc w:val="center"/>
               <w:pBdr>
                 <w:bottom w:val="none" w:sz="0" w:space="0" w:color="000000"/>
@@ -3978,7 +3872,6 @@
           </w:tcPr>
           <w:p>
             <w:pPr>
-              <w:pStyle w:val="Normal"/>
               <w:jc w:val="center"/>
               <w:pBdr>
                 <w:bottom w:val="none" w:sz="0" w:space="0" w:color="000000"/>
@@ -4019,26 +3912,26 @@
         <w:trPr>
           <w:trHeight w:val="270" w:hRule="exact"/>
         </w:trPr>
-        <w:tc>
-          <w:tcPr>
-            <w:tcBorders>
-              <w:bottom w:val="none" w:sz="0" w:space="0" w:color="000000"/>
-              <w:top w:val="none" w:sz="0" w:space="0" w:color="000000"/>
-              <w:left w:val="none" w:sz="0" w:space="0" w:color="000000"/>
-              <w:right w:val="none" w:sz="0" w:space="0" w:color="000000"/>
-            </w:tcBorders>
-            <w:shd w:val="clear" w:color="auto" w:fill="FFFFFF"/>
-            <w:tcMar>
-              <w:top w:w="0" w:type="dxa"/>
-              <w:bottom w:w="0" w:type="dxa"/>
-              <w:left w:w="0" w:type="dxa"/>
-              <w:right w:w="0" w:type="dxa"/>
-            </w:tcMar>
-            <w:vAlign w:val="center"/>
-          </w:tcPr>
-          <w:p>
-            <w:pPr>
-              <w:pStyle w:val="Normal"/>
+        body14
+        <w:tc>
+          <w:tcPr>
+            <w:tcBorders>
+              <w:bottom w:val="none" w:sz="0" w:space="0" w:color="000000"/>
+              <w:top w:val="none" w:sz="0" w:space="0" w:color="000000"/>
+              <w:left w:val="none" w:sz="0" w:space="0" w:color="000000"/>
+              <w:right w:val="none" w:sz="0" w:space="0" w:color="000000"/>
+            </w:tcBorders>
+            <w:shd w:val="clear" w:color="auto" w:fill="FFFFFF"/>
+            <w:tcMar>
+              <w:top w:w="0" w:type="dxa"/>
+              <w:bottom w:w="0" w:type="dxa"/>
+              <w:left w:w="0" w:type="dxa"/>
+              <w:right w:w="0" w:type="dxa"/>
+            </w:tcMar>
+            <w:vAlign w:val="center"/>
+          </w:tcPr>
+          <w:p>
+            <w:pPr>
               <w:jc w:val="left"/>
               <w:pBdr>
                 <w:bottom w:val="none" w:sz="0" w:space="0" w:color="000000"/>
@@ -4093,7 +3986,6 @@
           </w:tcPr>
           <w:p>
             <w:pPr>
-              <w:pStyle w:val="Normal"/>
               <w:jc w:val="center"/>
               <w:pBdr>
                 <w:bottom w:val="none" w:sz="0" w:space="0" w:color="000000"/>
@@ -4148,7 +4040,6 @@
           </w:tcPr>
           <w:p>
             <w:pPr>
-              <w:pStyle w:val="Normal"/>
               <w:jc w:val="center"/>
               <w:pBdr>
                 <w:bottom w:val="none" w:sz="0" w:space="0" w:color="000000"/>
@@ -4203,7 +4094,6 @@
           </w:tcPr>
           <w:p>
             <w:pPr>
-              <w:pStyle w:val="Normal"/>
               <w:jc w:val="center"/>
               <w:pBdr>
                 <w:bottom w:val="none" w:sz="0" w:space="0" w:color="000000"/>
@@ -4258,7 +4148,6 @@
           </w:tcPr>
           <w:p>
             <w:pPr>
-              <w:pStyle w:val="Normal"/>
               <w:jc w:val="center"/>
               <w:pBdr>
                 <w:bottom w:val="none" w:sz="0" w:space="0" w:color="000000"/>
@@ -4313,7 +4202,6 @@
           </w:tcPr>
           <w:p>
             <w:pPr>
-              <w:pStyle w:val="Normal"/>
               <w:jc w:val="center"/>
               <w:pBdr>
                 <w:bottom w:val="none" w:sz="0" w:space="0" w:color="000000"/>
@@ -4354,26 +4242,26 @@
         <w:trPr>
           <w:trHeight w:val="270" w:hRule="exact"/>
         </w:trPr>
-        <w:tc>
-          <w:tcPr>
-            <w:tcBorders>
-              <w:bottom w:val="none" w:sz="0" w:space="0" w:color="000000"/>
-              <w:top w:val="none" w:sz="0" w:space="0" w:color="000000"/>
-              <w:left w:val="none" w:sz="0" w:space="0" w:color="000000"/>
-              <w:right w:val="none" w:sz="0" w:space="0" w:color="000000"/>
-            </w:tcBorders>
-            <w:shd w:val="clear" w:color="auto" w:fill="FFFFFF"/>
-            <w:tcMar>
-              <w:top w:w="0" w:type="dxa"/>
-              <w:bottom w:w="0" w:type="dxa"/>
-              <w:left w:w="0" w:type="dxa"/>
-              <w:right w:w="0" w:type="dxa"/>
-            </w:tcMar>
-            <w:vAlign w:val="center"/>
-          </w:tcPr>
-          <w:p>
-            <w:pPr>
-              <w:pStyle w:val="Normal"/>
+        body15
+        <w:tc>
+          <w:tcPr>
+            <w:tcBorders>
+              <w:bottom w:val="none" w:sz="0" w:space="0" w:color="000000"/>
+              <w:top w:val="none" w:sz="0" w:space="0" w:color="000000"/>
+              <w:left w:val="none" w:sz="0" w:space="0" w:color="000000"/>
+              <w:right w:val="none" w:sz="0" w:space="0" w:color="000000"/>
+            </w:tcBorders>
+            <w:shd w:val="clear" w:color="auto" w:fill="FFFFFF"/>
+            <w:tcMar>
+              <w:top w:w="0" w:type="dxa"/>
+              <w:bottom w:w="0" w:type="dxa"/>
+              <w:left w:w="0" w:type="dxa"/>
+              <w:right w:w="0" w:type="dxa"/>
+            </w:tcMar>
+            <w:vAlign w:val="center"/>
+          </w:tcPr>
+          <w:p>
+            <w:pPr>
               <w:jc w:val="left"/>
               <w:pBdr>
                 <w:bottom w:val="none" w:sz="0" w:space="0" w:color="000000"/>
@@ -4428,7 +4316,6 @@
           </w:tcPr>
           <w:p>
             <w:pPr>
-              <w:pStyle w:val="Normal"/>
               <w:jc w:val="center"/>
               <w:pBdr>
                 <w:bottom w:val="none" w:sz="0" w:space="0" w:color="000000"/>
@@ -4483,7 +4370,6 @@
           </w:tcPr>
           <w:p>
             <w:pPr>
-              <w:pStyle w:val="Normal"/>
               <w:jc w:val="center"/>
               <w:pBdr>
                 <w:bottom w:val="none" w:sz="0" w:space="0" w:color="000000"/>
@@ -4538,7 +4424,6 @@
           </w:tcPr>
           <w:p>
             <w:pPr>
-              <w:pStyle w:val="Normal"/>
               <w:jc w:val="center"/>
               <w:pBdr>
                 <w:bottom w:val="none" w:sz="0" w:space="0" w:color="000000"/>
@@ -4593,7 +4478,6 @@
           </w:tcPr>
           <w:p>
             <w:pPr>
-              <w:pStyle w:val="Normal"/>
               <w:jc w:val="center"/>
               <w:pBdr>
                 <w:bottom w:val="none" w:sz="0" w:space="0" w:color="000000"/>
@@ -4648,7 +4532,6 @@
           </w:tcPr>
           <w:p>
             <w:pPr>
-              <w:pStyle w:val="Normal"/>
               <w:jc w:val="center"/>
               <w:pBdr>
                 <w:bottom w:val="none" w:sz="0" w:space="0" w:color="000000"/>
@@ -4689,26 +4572,26 @@
         <w:trPr>
           <w:trHeight w:val="270" w:hRule="exact"/>
         </w:trPr>
-        <w:tc>
-          <w:tcPr>
-            <w:tcBorders>
-              <w:bottom w:val="none" w:sz="0" w:space="0" w:color="000000"/>
-              <w:top w:val="none" w:sz="0" w:space="0" w:color="000000"/>
-              <w:left w:val="none" w:sz="0" w:space="0" w:color="000000"/>
-              <w:right w:val="none" w:sz="0" w:space="0" w:color="000000"/>
-            </w:tcBorders>
-            <w:shd w:val="clear" w:color="auto" w:fill="FFFFFF"/>
-            <w:tcMar>
-              <w:top w:w="0" w:type="dxa"/>
-              <w:bottom w:w="0" w:type="dxa"/>
-              <w:left w:w="0" w:type="dxa"/>
-              <w:right w:w="0" w:type="dxa"/>
-            </w:tcMar>
-            <w:vAlign w:val="center"/>
-          </w:tcPr>
-          <w:p>
-            <w:pPr>
-              <w:pStyle w:val="Normal"/>
+        body16
+        <w:tc>
+          <w:tcPr>
+            <w:tcBorders>
+              <w:bottom w:val="none" w:sz="0" w:space="0" w:color="000000"/>
+              <w:top w:val="none" w:sz="0" w:space="0" w:color="000000"/>
+              <w:left w:val="none" w:sz="0" w:space="0" w:color="000000"/>
+              <w:right w:val="none" w:sz="0" w:space="0" w:color="000000"/>
+            </w:tcBorders>
+            <w:shd w:val="clear" w:color="auto" w:fill="FFFFFF"/>
+            <w:tcMar>
+              <w:top w:w="0" w:type="dxa"/>
+              <w:bottom w:w="0" w:type="dxa"/>
+              <w:left w:w="0" w:type="dxa"/>
+              <w:right w:w="0" w:type="dxa"/>
+            </w:tcMar>
+            <w:vAlign w:val="center"/>
+          </w:tcPr>
+          <w:p>
+            <w:pPr>
               <w:jc w:val="left"/>
               <w:pBdr>
                 <w:bottom w:val="none" w:sz="0" w:space="0" w:color="000000"/>
@@ -4763,7 +4646,6 @@
           </w:tcPr>
           <w:p>
             <w:pPr>
-              <w:pStyle w:val="Normal"/>
               <w:jc w:val="center"/>
               <w:pBdr>
                 <w:bottom w:val="none" w:sz="0" w:space="0" w:color="000000"/>
@@ -4818,7 +4700,6 @@
           </w:tcPr>
           <w:p>
             <w:pPr>
-              <w:pStyle w:val="Normal"/>
               <w:jc w:val="center"/>
               <w:pBdr>
                 <w:bottom w:val="none" w:sz="0" w:space="0" w:color="000000"/>
@@ -4873,7 +4754,6 @@
           </w:tcPr>
           <w:p>
             <w:pPr>
-              <w:pStyle w:val="Normal"/>
               <w:jc w:val="center"/>
               <w:pBdr>
                 <w:bottom w:val="none" w:sz="0" w:space="0" w:color="000000"/>
@@ -4928,7 +4808,6 @@
           </w:tcPr>
           <w:p>
             <w:pPr>
-              <w:pStyle w:val="Normal"/>
               <w:jc w:val="center"/>
               <w:pBdr>
                 <w:bottom w:val="none" w:sz="0" w:space="0" w:color="000000"/>
@@ -4983,7 +4862,6 @@
           </w:tcPr>
           <w:p>
             <w:pPr>
-              <w:pStyle w:val="Normal"/>
               <w:jc w:val="center"/>
               <w:pBdr>
                 <w:bottom w:val="none" w:sz="0" w:space="0" w:color="000000"/>
@@ -5024,26 +4902,26 @@
         <w:trPr>
           <w:trHeight w:val="270" w:hRule="exact"/>
         </w:trPr>
-        <w:tc>
-          <w:tcPr>
-            <w:tcBorders>
-              <w:bottom w:val="none" w:sz="0" w:space="0" w:color="000000"/>
-              <w:top w:val="none" w:sz="0" w:space="0" w:color="000000"/>
-              <w:left w:val="none" w:sz="0" w:space="0" w:color="000000"/>
-              <w:right w:val="none" w:sz="0" w:space="0" w:color="000000"/>
-            </w:tcBorders>
-            <w:shd w:val="clear" w:color="auto" w:fill="FFFFFF"/>
-            <w:tcMar>
-              <w:top w:w="0" w:type="dxa"/>
-              <w:bottom w:w="0" w:type="dxa"/>
-              <w:left w:w="0" w:type="dxa"/>
-              <w:right w:w="0" w:type="dxa"/>
-            </w:tcMar>
-            <w:vAlign w:val="center"/>
-          </w:tcPr>
-          <w:p>
-            <w:pPr>
-              <w:pStyle w:val="Normal"/>
+        body17
+        <w:tc>
+          <w:tcPr>
+            <w:tcBorders>
+              <w:bottom w:val="none" w:sz="0" w:space="0" w:color="000000"/>
+              <w:top w:val="none" w:sz="0" w:space="0" w:color="000000"/>
+              <w:left w:val="none" w:sz="0" w:space="0" w:color="000000"/>
+              <w:right w:val="none" w:sz="0" w:space="0" w:color="000000"/>
+            </w:tcBorders>
+            <w:shd w:val="clear" w:color="auto" w:fill="FFFFFF"/>
+            <w:tcMar>
+              <w:top w:w="0" w:type="dxa"/>
+              <w:bottom w:w="0" w:type="dxa"/>
+              <w:left w:w="0" w:type="dxa"/>
+              <w:right w:w="0" w:type="dxa"/>
+            </w:tcMar>
+            <w:vAlign w:val="center"/>
+          </w:tcPr>
+          <w:p>
+            <w:pPr>
               <w:jc w:val="left"/>
               <w:pBdr>
                 <w:bottom w:val="none" w:sz="0" w:space="0" w:color="000000"/>
@@ -5098,7 +4976,6 @@
           </w:tcPr>
           <w:p>
             <w:pPr>
-              <w:pStyle w:val="Normal"/>
               <w:jc w:val="center"/>
               <w:pBdr>
                 <w:bottom w:val="none" w:sz="0" w:space="0" w:color="000000"/>
@@ -5153,7 +5030,6 @@
           </w:tcPr>
           <w:p>
             <w:pPr>
-              <w:pStyle w:val="Normal"/>
               <w:jc w:val="center"/>
               <w:pBdr>
                 <w:bottom w:val="none" w:sz="0" w:space="0" w:color="000000"/>
@@ -5208,7 +5084,6 @@
           </w:tcPr>
           <w:p>
             <w:pPr>
-              <w:pStyle w:val="Normal"/>
               <w:jc w:val="center"/>
               <w:pBdr>
                 <w:bottom w:val="none" w:sz="0" w:space="0" w:color="000000"/>
@@ -5263,7 +5138,6 @@
           </w:tcPr>
           <w:p>
             <w:pPr>
-              <w:pStyle w:val="Normal"/>
               <w:jc w:val="center"/>
               <w:pBdr>
                 <w:bottom w:val="none" w:sz="0" w:space="0" w:color="000000"/>
@@ -5318,7 +5192,6 @@
           </w:tcPr>
           <w:p>
             <w:pPr>
-              <w:pStyle w:val="Normal"/>
               <w:jc w:val="center"/>
               <w:pBdr>
                 <w:bottom w:val="none" w:sz="0" w:space="0" w:color="000000"/>
@@ -5359,26 +5232,26 @@
         <w:trPr>
           <w:trHeight w:val="270" w:hRule="exact"/>
         </w:trPr>
-        <w:tc>
-          <w:tcPr>
-            <w:tcBorders>
-              <w:bottom w:val="none" w:sz="0" w:space="0" w:color="000000"/>
-              <w:top w:val="none" w:sz="0" w:space="0" w:color="000000"/>
-              <w:left w:val="none" w:sz="0" w:space="0" w:color="000000"/>
-              <w:right w:val="none" w:sz="0" w:space="0" w:color="000000"/>
-            </w:tcBorders>
-            <w:shd w:val="clear" w:color="auto" w:fill="FFFFFF"/>
-            <w:tcMar>
-              <w:top w:w="0" w:type="dxa"/>
-              <w:bottom w:w="0" w:type="dxa"/>
-              <w:left w:w="0" w:type="dxa"/>
-              <w:right w:w="0" w:type="dxa"/>
-            </w:tcMar>
-            <w:vAlign w:val="center"/>
-          </w:tcPr>
-          <w:p>
-            <w:pPr>
-              <w:pStyle w:val="Normal"/>
+        body18
+        <w:tc>
+          <w:tcPr>
+            <w:tcBorders>
+              <w:bottom w:val="none" w:sz="0" w:space="0" w:color="000000"/>
+              <w:top w:val="none" w:sz="0" w:space="0" w:color="000000"/>
+              <w:left w:val="none" w:sz="0" w:space="0" w:color="000000"/>
+              <w:right w:val="none" w:sz="0" w:space="0" w:color="000000"/>
+            </w:tcBorders>
+            <w:shd w:val="clear" w:color="auto" w:fill="FFFFFF"/>
+            <w:tcMar>
+              <w:top w:w="0" w:type="dxa"/>
+              <w:bottom w:w="0" w:type="dxa"/>
+              <w:left w:w="0" w:type="dxa"/>
+              <w:right w:w="0" w:type="dxa"/>
+            </w:tcMar>
+            <w:vAlign w:val="center"/>
+          </w:tcPr>
+          <w:p>
+            <w:pPr>
               <w:jc w:val="left"/>
               <w:pBdr>
                 <w:bottom w:val="none" w:sz="0" w:space="0" w:color="000000"/>
@@ -5433,7 +5306,6 @@
           </w:tcPr>
           <w:p>
             <w:pPr>
-              <w:pStyle w:val="Normal"/>
               <w:jc w:val="center"/>
               <w:pBdr>
                 <w:bottom w:val="none" w:sz="0" w:space="0" w:color="000000"/>
@@ -5488,7 +5360,6 @@
           </w:tcPr>
           <w:p>
             <w:pPr>
-              <w:pStyle w:val="Normal"/>
               <w:jc w:val="center"/>
               <w:pBdr>
                 <w:bottom w:val="none" w:sz="0" w:space="0" w:color="000000"/>
@@ -5543,7 +5414,6 @@
           </w:tcPr>
           <w:p>
             <w:pPr>
-              <w:pStyle w:val="Normal"/>
               <w:jc w:val="center"/>
               <w:pBdr>
                 <w:bottom w:val="none" w:sz="0" w:space="0" w:color="000000"/>
@@ -5598,7 +5468,6 @@
           </w:tcPr>
           <w:p>
             <w:pPr>
-              <w:pStyle w:val="Normal"/>
               <w:jc w:val="center"/>
               <w:pBdr>
                 <w:bottom w:val="none" w:sz="0" w:space="0" w:color="000000"/>
@@ -5653,7 +5522,6 @@
           </w:tcPr>
           <w:p>
             <w:pPr>
-              <w:pStyle w:val="Normal"/>
               <w:jc w:val="center"/>
               <w:pBdr>
                 <w:bottom w:val="none" w:sz="0" w:space="0" w:color="000000"/>
@@ -5694,26 +5562,26 @@
         <w:trPr>
           <w:trHeight w:val="270" w:hRule="exact"/>
         </w:trPr>
-        <w:tc>
-          <w:tcPr>
-            <w:tcBorders>
-              <w:bottom w:val="none" w:sz="0" w:space="0" w:color="000000"/>
-              <w:top w:val="none" w:sz="0" w:space="0" w:color="000000"/>
-              <w:left w:val="none" w:sz="0" w:space="0" w:color="000000"/>
-              <w:right w:val="none" w:sz="0" w:space="0" w:color="000000"/>
-            </w:tcBorders>
-            <w:shd w:val="clear" w:color="auto" w:fill="FFFFFF"/>
-            <w:tcMar>
-              <w:top w:w="0" w:type="dxa"/>
-              <w:bottom w:w="0" w:type="dxa"/>
-              <w:left w:w="0" w:type="dxa"/>
-              <w:right w:w="0" w:type="dxa"/>
-            </w:tcMar>
-            <w:vAlign w:val="center"/>
-          </w:tcPr>
-          <w:p>
-            <w:pPr>
-              <w:pStyle w:val="Normal"/>
+        body19
+        <w:tc>
+          <w:tcPr>
+            <w:tcBorders>
+              <w:bottom w:val="none" w:sz="0" w:space="0" w:color="000000"/>
+              <w:top w:val="none" w:sz="0" w:space="0" w:color="000000"/>
+              <w:left w:val="none" w:sz="0" w:space="0" w:color="000000"/>
+              <w:right w:val="none" w:sz="0" w:space="0" w:color="000000"/>
+            </w:tcBorders>
+            <w:shd w:val="clear" w:color="auto" w:fill="FFFFFF"/>
+            <w:tcMar>
+              <w:top w:w="0" w:type="dxa"/>
+              <w:bottom w:w="0" w:type="dxa"/>
+              <w:left w:w="0" w:type="dxa"/>
+              <w:right w:w="0" w:type="dxa"/>
+            </w:tcMar>
+            <w:vAlign w:val="center"/>
+          </w:tcPr>
+          <w:p>
+            <w:pPr>
               <w:jc w:val="left"/>
               <w:pBdr>
                 <w:bottom w:val="none" w:sz="0" w:space="0" w:color="000000"/>
@@ -5768,7 +5636,6 @@
           </w:tcPr>
           <w:p>
             <w:pPr>
-              <w:pStyle w:val="Normal"/>
               <w:jc w:val="center"/>
               <w:pBdr>
                 <w:bottom w:val="none" w:sz="0" w:space="0" w:color="000000"/>
@@ -5823,7 +5690,6 @@
           </w:tcPr>
           <w:p>
             <w:pPr>
-              <w:pStyle w:val="Normal"/>
               <w:jc w:val="center"/>
               <w:pBdr>
                 <w:bottom w:val="none" w:sz="0" w:space="0" w:color="000000"/>
@@ -5878,7 +5744,6 @@
           </w:tcPr>
           <w:p>
             <w:pPr>
-              <w:pStyle w:val="Normal"/>
               <w:jc w:val="center"/>
               <w:pBdr>
                 <w:bottom w:val="none" w:sz="0" w:space="0" w:color="000000"/>
@@ -5933,7 +5798,6 @@
           </w:tcPr>
           <w:p>
             <w:pPr>
-              <w:pStyle w:val="Normal"/>
               <w:jc w:val="center"/>
               <w:pBdr>
                 <w:bottom w:val="none" w:sz="0" w:space="0" w:color="000000"/>
@@ -5988,7 +5852,6 @@
           </w:tcPr>
           <w:p>
             <w:pPr>
-              <w:pStyle w:val="Normal"/>
               <w:jc w:val="center"/>
               <w:pBdr>
                 <w:bottom w:val="none" w:sz="0" w:space="0" w:color="000000"/>
@@ -6029,26 +5892,26 @@
         <w:trPr>
           <w:trHeight w:val="270" w:hRule="exact"/>
         </w:trPr>
-        <w:tc>
-          <w:tcPr>
-            <w:tcBorders>
-              <w:bottom w:val="none" w:sz="0" w:space="0" w:color="000000"/>
-              <w:top w:val="none" w:sz="0" w:space="0" w:color="000000"/>
-              <w:left w:val="none" w:sz="0" w:space="0" w:color="000000"/>
-              <w:right w:val="none" w:sz="0" w:space="0" w:color="000000"/>
-            </w:tcBorders>
-            <w:shd w:val="clear" w:color="auto" w:fill="FFFFFF"/>
-            <w:tcMar>
-              <w:top w:w="0" w:type="dxa"/>
-              <w:bottom w:w="0" w:type="dxa"/>
-              <w:left w:w="0" w:type="dxa"/>
-              <w:right w:w="0" w:type="dxa"/>
-            </w:tcMar>
-            <w:vAlign w:val="center"/>
-          </w:tcPr>
-          <w:p>
-            <w:pPr>
-              <w:pStyle w:val="Normal"/>
+        body20
+        <w:tc>
+          <w:tcPr>
+            <w:tcBorders>
+              <w:bottom w:val="none" w:sz="0" w:space="0" w:color="000000"/>
+              <w:top w:val="none" w:sz="0" w:space="0" w:color="000000"/>
+              <w:left w:val="none" w:sz="0" w:space="0" w:color="000000"/>
+              <w:right w:val="none" w:sz="0" w:space="0" w:color="000000"/>
+            </w:tcBorders>
+            <w:shd w:val="clear" w:color="auto" w:fill="FFFFFF"/>
+            <w:tcMar>
+              <w:top w:w="0" w:type="dxa"/>
+              <w:bottom w:w="0" w:type="dxa"/>
+              <w:left w:w="0" w:type="dxa"/>
+              <w:right w:w="0" w:type="dxa"/>
+            </w:tcMar>
+            <w:vAlign w:val="center"/>
+          </w:tcPr>
+          <w:p>
+            <w:pPr>
               <w:jc w:val="left"/>
               <w:pBdr>
                 <w:bottom w:val="none" w:sz="0" w:space="0" w:color="000000"/>
@@ -6103,7 +5966,6 @@
           </w:tcPr>
           <w:p>
             <w:pPr>
-              <w:pStyle w:val="Normal"/>
               <w:jc w:val="center"/>
               <w:pBdr>
                 <w:bottom w:val="none" w:sz="0" w:space="0" w:color="000000"/>
@@ -6158,7 +6020,6 @@
           </w:tcPr>
           <w:p>
             <w:pPr>
-              <w:pStyle w:val="Normal"/>
               <w:jc w:val="center"/>
               <w:pBdr>
                 <w:bottom w:val="none" w:sz="0" w:space="0" w:color="000000"/>
@@ -6213,7 +6074,6 @@
           </w:tcPr>
           <w:p>
             <w:pPr>
-              <w:pStyle w:val="Normal"/>
               <w:jc w:val="center"/>
               <w:pBdr>
                 <w:bottom w:val="none" w:sz="0" w:space="0" w:color="000000"/>
@@ -6268,7 +6128,6 @@
           </w:tcPr>
           <w:p>
             <w:pPr>
-              <w:pStyle w:val="Normal"/>
               <w:jc w:val="center"/>
               <w:pBdr>
                 <w:bottom w:val="none" w:sz="0" w:space="0" w:color="000000"/>
@@ -6323,7 +6182,6 @@
           </w:tcPr>
           <w:p>
             <w:pPr>
-              <w:pStyle w:val="Normal"/>
               <w:jc w:val="center"/>
               <w:pBdr>
                 <w:bottom w:val="none" w:sz="0" w:space="0" w:color="000000"/>
@@ -6364,26 +6222,26 @@
         <w:trPr>
           <w:trHeight w:val="270" w:hRule="exact"/>
         </w:trPr>
-        <w:tc>
-          <w:tcPr>
-            <w:tcBorders>
-              <w:bottom w:val="none" w:sz="0" w:space="0" w:color="000000"/>
-              <w:top w:val="none" w:sz="0" w:space="0" w:color="000000"/>
-              <w:left w:val="none" w:sz="0" w:space="0" w:color="000000"/>
-              <w:right w:val="none" w:sz="0" w:space="0" w:color="000000"/>
-            </w:tcBorders>
-            <w:shd w:val="clear" w:color="auto" w:fill="FFFFFF"/>
-            <w:tcMar>
-              <w:top w:w="0" w:type="dxa"/>
-              <w:bottom w:w="0" w:type="dxa"/>
-              <w:left w:w="0" w:type="dxa"/>
-              <w:right w:w="0" w:type="dxa"/>
-            </w:tcMar>
-            <w:vAlign w:val="center"/>
-          </w:tcPr>
-          <w:p>
-            <w:pPr>
-              <w:pStyle w:val="Normal"/>
+        body21
+        <w:tc>
+          <w:tcPr>
+            <w:tcBorders>
+              <w:bottom w:val="none" w:sz="0" w:space="0" w:color="000000"/>
+              <w:top w:val="none" w:sz="0" w:space="0" w:color="000000"/>
+              <w:left w:val="none" w:sz="0" w:space="0" w:color="000000"/>
+              <w:right w:val="none" w:sz="0" w:space="0" w:color="000000"/>
+            </w:tcBorders>
+            <w:shd w:val="clear" w:color="auto" w:fill="FFFFFF"/>
+            <w:tcMar>
+              <w:top w:w="0" w:type="dxa"/>
+              <w:bottom w:w="0" w:type="dxa"/>
+              <w:left w:w="0" w:type="dxa"/>
+              <w:right w:w="0" w:type="dxa"/>
+            </w:tcMar>
+            <w:vAlign w:val="center"/>
+          </w:tcPr>
+          <w:p>
+            <w:pPr>
               <w:jc w:val="left"/>
               <w:pBdr>
                 <w:bottom w:val="none" w:sz="0" w:space="0" w:color="000000"/>
@@ -6438,7 +6296,6 @@
           </w:tcPr>
           <w:p>
             <w:pPr>
-              <w:pStyle w:val="Normal"/>
               <w:jc w:val="center"/>
               <w:pBdr>
                 <w:bottom w:val="none" w:sz="0" w:space="0" w:color="000000"/>
@@ -6493,7 +6350,6 @@
           </w:tcPr>
           <w:p>
             <w:pPr>
-              <w:pStyle w:val="Normal"/>
               <w:jc w:val="center"/>
               <w:pBdr>
                 <w:bottom w:val="none" w:sz="0" w:space="0" w:color="000000"/>
@@ -6548,7 +6404,6 @@
           </w:tcPr>
           <w:p>
             <w:pPr>
-              <w:pStyle w:val="Normal"/>
               <w:jc w:val="center"/>
               <w:pBdr>
                 <w:bottom w:val="none" w:sz="0" w:space="0" w:color="000000"/>
@@ -6603,7 +6458,6 @@
           </w:tcPr>
           <w:p>
             <w:pPr>
-              <w:pStyle w:val="Normal"/>
               <w:jc w:val="center"/>
               <w:pBdr>
                 <w:bottom w:val="none" w:sz="0" w:space="0" w:color="000000"/>
@@ -6658,7 +6512,6 @@
           </w:tcPr>
           <w:p>
             <w:pPr>
-              <w:pStyle w:val="Normal"/>
               <w:jc w:val="center"/>
               <w:pBdr>
                 <w:bottom w:val="none" w:sz="0" w:space="0" w:color="000000"/>
@@ -6699,6 +6552,7 @@
         <w:trPr>
           <w:trHeight w:val="369" w:hRule="exact"/>
         </w:trPr>
+        body22
         <w:tc>
           <w:tcPr>
             <w:gridSpan w:val="6"/>
@@ -6719,7 +6573,6 @@
           </w:tcPr>
           <w:p>
             <w:pPr>
-              <w:pStyle w:val="Normal"/>
               <w:jc w:val="left"/>
               <w:pBdr>
                 <w:bottom w:val="none" w:sz="0" w:space="0" w:color="000000"/>
@@ -6760,6 +6613,7 @@
         <w:trPr>
           <w:trHeight w:val="270" w:hRule="exact"/>
         </w:trPr>
+        body23
         <w:tc>
           <w:tcPr>
             <w:tcBorders>
@@ -6779,7 +6633,6 @@
           </w:tcPr>
           <w:p>
             <w:pPr>
-              <w:pStyle w:val="Normal"/>
               <w:jc w:val="left"/>
               <w:pBdr>
                 <w:bottom w:val="none" w:sz="0" w:space="0" w:color="000000"/>
@@ -6834,7 +6687,6 @@
           </w:tcPr>
           <w:p>
             <w:pPr>
-              <w:pStyle w:val="Normal"/>
               <w:jc w:val="center"/>
               <w:pBdr>
                 <w:bottom w:val="none" w:sz="0" w:space="0" w:color="000000"/>
@@ -6889,7 +6741,6 @@
           </w:tcPr>
           <w:p>
             <w:pPr>
-              <w:pStyle w:val="Normal"/>
               <w:jc w:val="center"/>
               <w:pBdr>
                 <w:bottom w:val="none" w:sz="0" w:space="0" w:color="000000"/>
@@ -6944,7 +6795,6 @@
           </w:tcPr>
           <w:p>
             <w:pPr>
-              <w:pStyle w:val="Normal"/>
               <w:jc w:val="center"/>
               <w:pBdr>
                 <w:bottom w:val="none" w:sz="0" w:space="0" w:color="000000"/>
@@ -6999,7 +6849,6 @@
           </w:tcPr>
           <w:p>
             <w:pPr>
-              <w:pStyle w:val="Normal"/>
               <w:jc w:val="center"/>
               <w:pBdr>
                 <w:bottom w:val="none" w:sz="0" w:space="0" w:color="000000"/>
@@ -7054,7 +6903,6 @@
           </w:tcPr>
           <w:p>
             <w:pPr>
-              <w:pStyle w:val="Normal"/>
               <w:jc w:val="center"/>
               <w:pBdr>
                 <w:bottom w:val="none" w:sz="0" w:space="0" w:color="000000"/>
@@ -7095,26 +6943,26 @@
         <w:trPr>
           <w:trHeight w:val="270" w:hRule="exact"/>
         </w:trPr>
-        <w:tc>
-          <w:tcPr>
-            <w:tcBorders>
-              <w:bottom w:val="none" w:sz="0" w:space="0" w:color="000000"/>
-              <w:top w:val="none" w:sz="0" w:space="0" w:color="000000"/>
-              <w:left w:val="none" w:sz="0" w:space="0" w:color="000000"/>
-              <w:right w:val="none" w:sz="0" w:space="0" w:color="000000"/>
-            </w:tcBorders>
-            <w:shd w:val="clear" w:color="auto" w:fill="FFFFFF"/>
-            <w:tcMar>
-              <w:top w:w="0" w:type="dxa"/>
-              <w:bottom w:w="0" w:type="dxa"/>
-              <w:left w:w="0" w:type="dxa"/>
-              <w:right w:w="0" w:type="dxa"/>
-            </w:tcMar>
-            <w:vAlign w:val="center"/>
-          </w:tcPr>
-          <w:p>
-            <w:pPr>
-              <w:pStyle w:val="Normal"/>
+        body24
+        <w:tc>
+          <w:tcPr>
+            <w:tcBorders>
+              <w:bottom w:val="none" w:sz="0" w:space="0" w:color="000000"/>
+              <w:top w:val="none" w:sz="0" w:space="0" w:color="000000"/>
+              <w:left w:val="none" w:sz="0" w:space="0" w:color="000000"/>
+              <w:right w:val="none" w:sz="0" w:space="0" w:color="000000"/>
+            </w:tcBorders>
+            <w:shd w:val="clear" w:color="auto" w:fill="FFFFFF"/>
+            <w:tcMar>
+              <w:top w:w="0" w:type="dxa"/>
+              <w:bottom w:w="0" w:type="dxa"/>
+              <w:left w:w="0" w:type="dxa"/>
+              <w:right w:w="0" w:type="dxa"/>
+            </w:tcMar>
+            <w:vAlign w:val="center"/>
+          </w:tcPr>
+          <w:p>
+            <w:pPr>
               <w:jc w:val="left"/>
               <w:pBdr>
                 <w:bottom w:val="none" w:sz="0" w:space="0" w:color="000000"/>
@@ -7169,7 +7017,6 @@
           </w:tcPr>
           <w:p>
             <w:pPr>
-              <w:pStyle w:val="Normal"/>
               <w:jc w:val="center"/>
               <w:pBdr>
                 <w:bottom w:val="none" w:sz="0" w:space="0" w:color="000000"/>
@@ -7224,7 +7071,6 @@
           </w:tcPr>
           <w:p>
             <w:pPr>
-              <w:pStyle w:val="Normal"/>
               <w:jc w:val="center"/>
               <w:pBdr>
                 <w:bottom w:val="none" w:sz="0" w:space="0" w:color="000000"/>
@@ -7279,7 +7125,6 @@
           </w:tcPr>
           <w:p>
             <w:pPr>
-              <w:pStyle w:val="Normal"/>
               <w:jc w:val="center"/>
               <w:pBdr>
                 <w:bottom w:val="none" w:sz="0" w:space="0" w:color="000000"/>
@@ -7334,7 +7179,6 @@
           </w:tcPr>
           <w:p>
             <w:pPr>
-              <w:pStyle w:val="Normal"/>
               <w:jc w:val="center"/>
               <w:pBdr>
                 <w:bottom w:val="none" w:sz="0" w:space="0" w:color="000000"/>
@@ -7389,7 +7233,6 @@
           </w:tcPr>
           <w:p>
             <w:pPr>
-              <w:pStyle w:val="Normal"/>
               <w:jc w:val="center"/>
               <w:pBdr>
                 <w:bottom w:val="none" w:sz="0" w:space="0" w:color="000000"/>
@@ -7430,26 +7273,26 @@
         <w:trPr>
           <w:trHeight w:val="270" w:hRule="exact"/>
         </w:trPr>
-        <w:tc>
-          <w:tcPr>
-            <w:tcBorders>
-              <w:bottom w:val="none" w:sz="0" w:space="0" w:color="000000"/>
-              <w:top w:val="none" w:sz="0" w:space="0" w:color="000000"/>
-              <w:left w:val="none" w:sz="0" w:space="0" w:color="000000"/>
-              <w:right w:val="none" w:sz="0" w:space="0" w:color="000000"/>
-            </w:tcBorders>
-            <w:shd w:val="clear" w:color="auto" w:fill="FFFFFF"/>
-            <w:tcMar>
-              <w:top w:w="0" w:type="dxa"/>
-              <w:bottom w:w="0" w:type="dxa"/>
-              <w:left w:w="0" w:type="dxa"/>
-              <w:right w:w="0" w:type="dxa"/>
-            </w:tcMar>
-            <w:vAlign w:val="center"/>
-          </w:tcPr>
-          <w:p>
-            <w:pPr>
-              <w:pStyle w:val="Normal"/>
+        body25
+        <w:tc>
+          <w:tcPr>
+            <w:tcBorders>
+              <w:bottom w:val="none" w:sz="0" w:space="0" w:color="000000"/>
+              <w:top w:val="none" w:sz="0" w:space="0" w:color="000000"/>
+              <w:left w:val="none" w:sz="0" w:space="0" w:color="000000"/>
+              <w:right w:val="none" w:sz="0" w:space="0" w:color="000000"/>
+            </w:tcBorders>
+            <w:shd w:val="clear" w:color="auto" w:fill="FFFFFF"/>
+            <w:tcMar>
+              <w:top w:w="0" w:type="dxa"/>
+              <w:bottom w:w="0" w:type="dxa"/>
+              <w:left w:w="0" w:type="dxa"/>
+              <w:right w:w="0" w:type="dxa"/>
+            </w:tcMar>
+            <w:vAlign w:val="center"/>
+          </w:tcPr>
+          <w:p>
+            <w:pPr>
               <w:jc w:val="left"/>
               <w:pBdr>
                 <w:bottom w:val="none" w:sz="0" w:space="0" w:color="000000"/>
@@ -7504,7 +7347,6 @@
           </w:tcPr>
           <w:p>
             <w:pPr>
-              <w:pStyle w:val="Normal"/>
               <w:jc w:val="center"/>
               <w:pBdr>
                 <w:bottom w:val="none" w:sz="0" w:space="0" w:color="000000"/>
@@ -7559,7 +7401,6 @@
           </w:tcPr>
           <w:p>
             <w:pPr>
-              <w:pStyle w:val="Normal"/>
               <w:jc w:val="center"/>
               <w:pBdr>
                 <w:bottom w:val="none" w:sz="0" w:space="0" w:color="000000"/>
@@ -7614,7 +7455,6 @@
           </w:tcPr>
           <w:p>
             <w:pPr>
-              <w:pStyle w:val="Normal"/>
               <w:jc w:val="center"/>
               <w:pBdr>
                 <w:bottom w:val="none" w:sz="0" w:space="0" w:color="000000"/>
@@ -7669,7 +7509,6 @@
           </w:tcPr>
           <w:p>
             <w:pPr>
-              <w:pStyle w:val="Normal"/>
               <w:jc w:val="center"/>
               <w:pBdr>
                 <w:bottom w:val="none" w:sz="0" w:space="0" w:color="000000"/>
@@ -7724,7 +7563,6 @@
           </w:tcPr>
           <w:p>
             <w:pPr>
-              <w:pStyle w:val="Normal"/>
               <w:jc w:val="center"/>
               <w:pBdr>
                 <w:bottom w:val="none" w:sz="0" w:space="0" w:color="000000"/>
@@ -7765,26 +7603,26 @@
         <w:trPr>
           <w:trHeight w:val="270" w:hRule="exact"/>
         </w:trPr>
-        <w:tc>
-          <w:tcPr>
-            <w:tcBorders>
-              <w:bottom w:val="none" w:sz="0" w:space="0" w:color="000000"/>
-              <w:top w:val="none" w:sz="0" w:space="0" w:color="000000"/>
-              <w:left w:val="none" w:sz="0" w:space="0" w:color="000000"/>
-              <w:right w:val="none" w:sz="0" w:space="0" w:color="000000"/>
-            </w:tcBorders>
-            <w:shd w:val="clear" w:color="auto" w:fill="FFFFFF"/>
-            <w:tcMar>
-              <w:top w:w="0" w:type="dxa"/>
-              <w:bottom w:w="0" w:type="dxa"/>
-              <w:left w:w="0" w:type="dxa"/>
-              <w:right w:w="0" w:type="dxa"/>
-            </w:tcMar>
-            <w:vAlign w:val="center"/>
-          </w:tcPr>
-          <w:p>
-            <w:pPr>
-              <w:pStyle w:val="Normal"/>
+        body26
+        <w:tc>
+          <w:tcPr>
+            <w:tcBorders>
+              <w:bottom w:val="none" w:sz="0" w:space="0" w:color="000000"/>
+              <w:top w:val="none" w:sz="0" w:space="0" w:color="000000"/>
+              <w:left w:val="none" w:sz="0" w:space="0" w:color="000000"/>
+              <w:right w:val="none" w:sz="0" w:space="0" w:color="000000"/>
+            </w:tcBorders>
+            <w:shd w:val="clear" w:color="auto" w:fill="FFFFFF"/>
+            <w:tcMar>
+              <w:top w:w="0" w:type="dxa"/>
+              <w:bottom w:w="0" w:type="dxa"/>
+              <w:left w:w="0" w:type="dxa"/>
+              <w:right w:w="0" w:type="dxa"/>
+            </w:tcMar>
+            <w:vAlign w:val="center"/>
+          </w:tcPr>
+          <w:p>
+            <w:pPr>
               <w:jc w:val="left"/>
               <w:pBdr>
                 <w:bottom w:val="none" w:sz="0" w:space="0" w:color="000000"/>
@@ -7839,7 +7677,6 @@
           </w:tcPr>
           <w:p>
             <w:pPr>
-              <w:pStyle w:val="Normal"/>
               <w:jc w:val="center"/>
               <w:pBdr>
                 <w:bottom w:val="none" w:sz="0" w:space="0" w:color="000000"/>
@@ -7894,7 +7731,6 @@
           </w:tcPr>
           <w:p>
             <w:pPr>
-              <w:pStyle w:val="Normal"/>
               <w:jc w:val="center"/>
               <w:pBdr>
                 <w:bottom w:val="none" w:sz="0" w:space="0" w:color="000000"/>
@@ -7949,7 +7785,6 @@
           </w:tcPr>
           <w:p>
             <w:pPr>
-              <w:pStyle w:val="Normal"/>
               <w:jc w:val="center"/>
               <w:pBdr>
                 <w:bottom w:val="none" w:sz="0" w:space="0" w:color="000000"/>
@@ -8004,7 +7839,6 @@
           </w:tcPr>
           <w:p>
             <w:pPr>
-              <w:pStyle w:val="Normal"/>
               <w:jc w:val="center"/>
               <w:pBdr>
                 <w:bottom w:val="none" w:sz="0" w:space="0" w:color="000000"/>
@@ -8059,7 +7893,6 @@
           </w:tcPr>
           <w:p>
             <w:pPr>
-              <w:pStyle w:val="Normal"/>
               <w:jc w:val="center"/>
               <w:pBdr>
                 <w:bottom w:val="none" w:sz="0" w:space="0" w:color="000000"/>

</xml_diff>

<commit_message>
v1.6.0.9002: Update to screenshot formatting and some documentation
</commit_message>
<xml_diff>
--- a/development/run-vignette/tables/Tern_2_group.docx
+++ b/development/run-vignette/tables/Tern_2_group.docx
@@ -21,7 +21,6 @@
           <w:trHeight w:val="711" w:hRule="auto"/>
           <w:tblHeader/>
         </w:trPr>
-        header 1
         <w:tc>
           <w:tcPr>
             <w:tcBorders>
@@ -41,6 +40,7 @@
           </w:tcPr>
           <w:p>
             <w:pPr>
+              <w:pStyle w:val="Normal"/>
               <w:jc w:val="left"/>
               <w:pBdr>
                 <w:bottom w:val="none" w:sz="0" w:space="0" w:color="000000"/>
@@ -95,6 +95,7 @@
           </w:tcPr>
           <w:p>
             <w:pPr>
+              <w:pStyle w:val="Normal"/>
               <w:jc w:val="center"/>
               <w:pBdr>
                 <w:bottom w:val="none" w:sz="0" w:space="0" w:color="000000"/>
@@ -175,6 +176,7 @@
           </w:tcPr>
           <w:p>
             <w:pPr>
+              <w:pStyle w:val="Normal"/>
               <w:jc w:val="center"/>
               <w:pBdr>
                 <w:bottom w:val="none" w:sz="0" w:space="0" w:color="000000"/>
@@ -255,6 +257,7 @@
           </w:tcPr>
           <w:p>
             <w:pPr>
+              <w:pStyle w:val="Normal"/>
               <w:jc w:val="center"/>
               <w:pBdr>
                 <w:bottom w:val="none" w:sz="0" w:space="0" w:color="000000"/>
@@ -335,6 +338,7 @@
           </w:tcPr>
           <w:p>
             <w:pPr>
+              <w:pStyle w:val="Normal"/>
               <w:jc w:val="center"/>
               <w:pBdr>
                 <w:bottom w:val="none" w:sz="0" w:space="0" w:color="000000"/>
@@ -389,6 +393,7 @@
           </w:tcPr>
           <w:p>
             <w:pPr>
+              <w:pStyle w:val="Normal"/>
               <w:jc w:val="center"/>
               <w:pBdr>
                 <w:bottom w:val="none" w:sz="0" w:space="0" w:color="000000"/>
@@ -429,7 +434,6 @@
         <w:trPr>
           <w:trHeight w:val="369" w:hRule="exact"/>
         </w:trPr>
-        body 1
         <w:tc>
           <w:tcPr>
             <w:gridSpan w:val="6"/>
@@ -450,6 +454,7 @@
           </w:tcPr>
           <w:p>
             <w:pPr>
+              <w:pStyle w:val="Normal"/>
               <w:jc w:val="left"/>
               <w:pBdr>
                 <w:bottom w:val="none" w:sz="0" w:space="0" w:color="000000"/>
@@ -490,7 +495,6 @@
         <w:trPr>
           <w:trHeight w:val="270" w:hRule="exact"/>
         </w:trPr>
-        body 2
         <w:tc>
           <w:tcPr>
             <w:tcBorders>
@@ -510,6 +514,7 @@
           </w:tcPr>
           <w:p>
             <w:pPr>
+              <w:pStyle w:val="Normal"/>
               <w:jc w:val="left"/>
               <w:pBdr>
                 <w:bottom w:val="none" w:sz="0" w:space="0" w:color="000000"/>
@@ -564,6 +569,7 @@
           </w:tcPr>
           <w:p>
             <w:pPr>
+              <w:pStyle w:val="Normal"/>
               <w:jc w:val="center"/>
               <w:pBdr>
                 <w:bottom w:val="none" w:sz="0" w:space="0" w:color="000000"/>
@@ -618,6 +624,7 @@
           </w:tcPr>
           <w:p>
             <w:pPr>
+              <w:pStyle w:val="Normal"/>
               <w:jc w:val="center"/>
               <w:pBdr>
                 <w:bottom w:val="none" w:sz="0" w:space="0" w:color="000000"/>
@@ -672,6 +679,7 @@
           </w:tcPr>
           <w:p>
             <w:pPr>
+              <w:pStyle w:val="Normal"/>
               <w:jc w:val="center"/>
               <w:pBdr>
                 <w:bottom w:val="none" w:sz="0" w:space="0" w:color="000000"/>
@@ -726,6 +734,7 @@
           </w:tcPr>
           <w:p>
             <w:pPr>
+              <w:pStyle w:val="Normal"/>
               <w:jc w:val="center"/>
               <w:pBdr>
                 <w:bottom w:val="none" w:sz="0" w:space="0" w:color="000000"/>
@@ -780,6 +789,7 @@
           </w:tcPr>
           <w:p>
             <w:pPr>
+              <w:pStyle w:val="Normal"/>
               <w:jc w:val="center"/>
               <w:pBdr>
                 <w:bottom w:val="none" w:sz="0" w:space="0" w:color="000000"/>
@@ -820,26 +830,26 @@
         <w:trPr>
           <w:trHeight w:val="270" w:hRule="exact"/>
         </w:trPr>
-        body 3
-        <w:tc>
-          <w:tcPr>
-            <w:tcBorders>
-              <w:bottom w:val="none" w:sz="0" w:space="0" w:color="000000"/>
-              <w:top w:val="none" w:sz="0" w:space="0" w:color="000000"/>
-              <w:left w:val="none" w:sz="0" w:space="0" w:color="000000"/>
-              <w:right w:val="none" w:sz="0" w:space="0" w:color="000000"/>
-            </w:tcBorders>
-            <w:shd w:val="clear" w:color="auto" w:fill="FFFFFF"/>
-            <w:tcMar>
-              <w:top w:w="0" w:type="dxa"/>
-              <w:bottom w:w="0" w:type="dxa"/>
-              <w:left w:w="0" w:type="dxa"/>
-              <w:right w:w="0" w:type="dxa"/>
-            </w:tcMar>
-            <w:vAlign w:val="center"/>
-          </w:tcPr>
-          <w:p>
-            <w:pPr>
+        <w:tc>
+          <w:tcPr>
+            <w:tcBorders>
+              <w:bottom w:val="none" w:sz="0" w:space="0" w:color="000000"/>
+              <w:top w:val="none" w:sz="0" w:space="0" w:color="000000"/>
+              <w:left w:val="none" w:sz="0" w:space="0" w:color="000000"/>
+              <w:right w:val="none" w:sz="0" w:space="0" w:color="000000"/>
+            </w:tcBorders>
+            <w:shd w:val="clear" w:color="auto" w:fill="FFFFFF"/>
+            <w:tcMar>
+              <w:top w:w="0" w:type="dxa"/>
+              <w:bottom w:w="0" w:type="dxa"/>
+              <w:left w:w="0" w:type="dxa"/>
+              <w:right w:w="0" w:type="dxa"/>
+            </w:tcMar>
+            <w:vAlign w:val="center"/>
+          </w:tcPr>
+          <w:p>
+            <w:pPr>
+              <w:pStyle w:val="Normal"/>
               <w:jc w:val="left"/>
               <w:pBdr>
                 <w:bottom w:val="none" w:sz="0" w:space="0" w:color="000000"/>
@@ -894,6 +904,7 @@
           </w:tcPr>
           <w:p>
             <w:pPr>
+              <w:pStyle w:val="Normal"/>
               <w:jc w:val="center"/>
               <w:pBdr>
                 <w:bottom w:val="none" w:sz="0" w:space="0" w:color="000000"/>
@@ -948,6 +959,7 @@
           </w:tcPr>
           <w:p>
             <w:pPr>
+              <w:pStyle w:val="Normal"/>
               <w:jc w:val="center"/>
               <w:pBdr>
                 <w:bottom w:val="none" w:sz="0" w:space="0" w:color="000000"/>
@@ -1002,6 +1014,7 @@
           </w:tcPr>
           <w:p>
             <w:pPr>
+              <w:pStyle w:val="Normal"/>
               <w:jc w:val="center"/>
               <w:pBdr>
                 <w:bottom w:val="none" w:sz="0" w:space="0" w:color="000000"/>
@@ -1056,6 +1069,7 @@
           </w:tcPr>
           <w:p>
             <w:pPr>
+              <w:pStyle w:val="Normal"/>
               <w:jc w:val="center"/>
               <w:pBdr>
                 <w:bottom w:val="none" w:sz="0" w:space="0" w:color="000000"/>
@@ -1110,6 +1124,7 @@
           </w:tcPr>
           <w:p>
             <w:pPr>
+              <w:pStyle w:val="Normal"/>
               <w:jc w:val="center"/>
               <w:pBdr>
                 <w:bottom w:val="none" w:sz="0" w:space="0" w:color="000000"/>
@@ -1150,26 +1165,26 @@
         <w:trPr>
           <w:trHeight w:val="270" w:hRule="exact"/>
         </w:trPr>
-        body 4
-        <w:tc>
-          <w:tcPr>
-            <w:tcBorders>
-              <w:bottom w:val="none" w:sz="0" w:space="0" w:color="000000"/>
-              <w:top w:val="none" w:sz="0" w:space="0" w:color="000000"/>
-              <w:left w:val="none" w:sz="0" w:space="0" w:color="000000"/>
-              <w:right w:val="none" w:sz="0" w:space="0" w:color="000000"/>
-            </w:tcBorders>
-            <w:shd w:val="clear" w:color="auto" w:fill="FFFFFF"/>
-            <w:tcMar>
-              <w:top w:w="0" w:type="dxa"/>
-              <w:bottom w:w="0" w:type="dxa"/>
-              <w:left w:w="0" w:type="dxa"/>
-              <w:right w:w="0" w:type="dxa"/>
-            </w:tcMar>
-            <w:vAlign w:val="center"/>
-          </w:tcPr>
-          <w:p>
-            <w:pPr>
+        <w:tc>
+          <w:tcPr>
+            <w:tcBorders>
+              <w:bottom w:val="none" w:sz="0" w:space="0" w:color="000000"/>
+              <w:top w:val="none" w:sz="0" w:space="0" w:color="000000"/>
+              <w:left w:val="none" w:sz="0" w:space="0" w:color="000000"/>
+              <w:right w:val="none" w:sz="0" w:space="0" w:color="000000"/>
+            </w:tcBorders>
+            <w:shd w:val="clear" w:color="auto" w:fill="FFFFFF"/>
+            <w:tcMar>
+              <w:top w:w="0" w:type="dxa"/>
+              <w:bottom w:w="0" w:type="dxa"/>
+              <w:left w:w="0" w:type="dxa"/>
+              <w:right w:w="0" w:type="dxa"/>
+            </w:tcMar>
+            <w:vAlign w:val="center"/>
+          </w:tcPr>
+          <w:p>
+            <w:pPr>
+              <w:pStyle w:val="Normal"/>
               <w:jc w:val="left"/>
               <w:pBdr>
                 <w:bottom w:val="none" w:sz="0" w:space="0" w:color="000000"/>
@@ -1224,6 +1239,7 @@
           </w:tcPr>
           <w:p>
             <w:pPr>
+              <w:pStyle w:val="Normal"/>
               <w:jc w:val="center"/>
               <w:pBdr>
                 <w:bottom w:val="none" w:sz="0" w:space="0" w:color="000000"/>
@@ -1278,6 +1294,7 @@
           </w:tcPr>
           <w:p>
             <w:pPr>
+              <w:pStyle w:val="Normal"/>
               <w:jc w:val="center"/>
               <w:pBdr>
                 <w:bottom w:val="none" w:sz="0" w:space="0" w:color="000000"/>
@@ -1332,6 +1349,7 @@
           </w:tcPr>
           <w:p>
             <w:pPr>
+              <w:pStyle w:val="Normal"/>
               <w:jc w:val="center"/>
               <w:pBdr>
                 <w:bottom w:val="none" w:sz="0" w:space="0" w:color="000000"/>
@@ -1386,6 +1404,7 @@
           </w:tcPr>
           <w:p>
             <w:pPr>
+              <w:pStyle w:val="Normal"/>
               <w:jc w:val="center"/>
               <w:pBdr>
                 <w:bottom w:val="none" w:sz="0" w:space="0" w:color="000000"/>
@@ -1440,6 +1459,7 @@
           </w:tcPr>
           <w:p>
             <w:pPr>
+              <w:pStyle w:val="Normal"/>
               <w:jc w:val="center"/>
               <w:pBdr>
                 <w:bottom w:val="none" w:sz="0" w:space="0" w:color="000000"/>
@@ -1480,26 +1500,26 @@
         <w:trPr>
           <w:trHeight w:val="270" w:hRule="exact"/>
         </w:trPr>
-        body 5
-        <w:tc>
-          <w:tcPr>
-            <w:tcBorders>
-              <w:bottom w:val="none" w:sz="0" w:space="0" w:color="000000"/>
-              <w:top w:val="none" w:sz="0" w:space="0" w:color="000000"/>
-              <w:left w:val="none" w:sz="0" w:space="0" w:color="000000"/>
-              <w:right w:val="none" w:sz="0" w:space="0" w:color="000000"/>
-            </w:tcBorders>
-            <w:shd w:val="clear" w:color="auto" w:fill="FFFFFF"/>
-            <w:tcMar>
-              <w:top w:w="0" w:type="dxa"/>
-              <w:bottom w:w="0" w:type="dxa"/>
-              <w:left w:w="0" w:type="dxa"/>
-              <w:right w:w="0" w:type="dxa"/>
-            </w:tcMar>
-            <w:vAlign w:val="center"/>
-          </w:tcPr>
-          <w:p>
-            <w:pPr>
+        <w:tc>
+          <w:tcPr>
+            <w:tcBorders>
+              <w:bottom w:val="none" w:sz="0" w:space="0" w:color="000000"/>
+              <w:top w:val="none" w:sz="0" w:space="0" w:color="000000"/>
+              <w:left w:val="none" w:sz="0" w:space="0" w:color="000000"/>
+              <w:right w:val="none" w:sz="0" w:space="0" w:color="000000"/>
+            </w:tcBorders>
+            <w:shd w:val="clear" w:color="auto" w:fill="FFFFFF"/>
+            <w:tcMar>
+              <w:top w:w="0" w:type="dxa"/>
+              <w:bottom w:w="0" w:type="dxa"/>
+              <w:left w:w="0" w:type="dxa"/>
+              <w:right w:w="0" w:type="dxa"/>
+            </w:tcMar>
+            <w:vAlign w:val="center"/>
+          </w:tcPr>
+          <w:p>
+            <w:pPr>
+              <w:pStyle w:val="Normal"/>
               <w:jc w:val="left"/>
               <w:pBdr>
                 <w:bottom w:val="none" w:sz="0" w:space="0" w:color="000000"/>
@@ -1554,6 +1574,7 @@
           </w:tcPr>
           <w:p>
             <w:pPr>
+              <w:pStyle w:val="Normal"/>
               <w:jc w:val="center"/>
               <w:pBdr>
                 <w:bottom w:val="none" w:sz="0" w:space="0" w:color="000000"/>
@@ -1608,6 +1629,7 @@
           </w:tcPr>
           <w:p>
             <w:pPr>
+              <w:pStyle w:val="Normal"/>
               <w:jc w:val="center"/>
               <w:pBdr>
                 <w:bottom w:val="none" w:sz="0" w:space="0" w:color="000000"/>
@@ -1662,6 +1684,7 @@
           </w:tcPr>
           <w:p>
             <w:pPr>
+              <w:pStyle w:val="Normal"/>
               <w:jc w:val="center"/>
               <w:pBdr>
                 <w:bottom w:val="none" w:sz="0" w:space="0" w:color="000000"/>
@@ -1716,6 +1739,7 @@
           </w:tcPr>
           <w:p>
             <w:pPr>
+              <w:pStyle w:val="Normal"/>
               <w:jc w:val="center"/>
               <w:pBdr>
                 <w:bottom w:val="none" w:sz="0" w:space="0" w:color="000000"/>
@@ -1770,6 +1794,7 @@
           </w:tcPr>
           <w:p>
             <w:pPr>
+              <w:pStyle w:val="Normal"/>
               <w:jc w:val="center"/>
               <w:pBdr>
                 <w:bottom w:val="none" w:sz="0" w:space="0" w:color="000000"/>
@@ -1810,7 +1835,6 @@
         <w:trPr>
           <w:trHeight w:val="369" w:hRule="exact"/>
         </w:trPr>
-        body 6
         <w:tc>
           <w:tcPr>
             <w:gridSpan w:val="6"/>
@@ -1831,6 +1855,7 @@
           </w:tcPr>
           <w:p>
             <w:pPr>
+              <w:pStyle w:val="Normal"/>
               <w:jc w:val="left"/>
               <w:pBdr>
                 <w:bottom w:val="none" w:sz="0" w:space="0" w:color="000000"/>
@@ -1871,7 +1896,6 @@
         <w:trPr>
           <w:trHeight w:val="270" w:hRule="exact"/>
         </w:trPr>
-        body 7
         <w:tc>
           <w:tcPr>
             <w:tcBorders>
@@ -1891,6 +1915,7 @@
           </w:tcPr>
           <w:p>
             <w:pPr>
+              <w:pStyle w:val="Normal"/>
               <w:jc w:val="left"/>
               <w:pBdr>
                 <w:bottom w:val="none" w:sz="0" w:space="0" w:color="000000"/>
@@ -1945,6 +1970,7 @@
           </w:tcPr>
           <w:p>
             <w:pPr>
+              <w:pStyle w:val="Normal"/>
               <w:jc w:val="center"/>
               <w:pBdr>
                 <w:bottom w:val="none" w:sz="0" w:space="0" w:color="000000"/>
@@ -1999,6 +2025,7 @@
           </w:tcPr>
           <w:p>
             <w:pPr>
+              <w:pStyle w:val="Normal"/>
               <w:jc w:val="center"/>
               <w:pBdr>
                 <w:bottom w:val="none" w:sz="0" w:space="0" w:color="000000"/>
@@ -2053,6 +2080,7 @@
           </w:tcPr>
           <w:p>
             <w:pPr>
+              <w:pStyle w:val="Normal"/>
               <w:jc w:val="center"/>
               <w:pBdr>
                 <w:bottom w:val="none" w:sz="0" w:space="0" w:color="000000"/>
@@ -2107,6 +2135,7 @@
           </w:tcPr>
           <w:p>
             <w:pPr>
+              <w:pStyle w:val="Normal"/>
               <w:jc w:val="center"/>
               <w:pBdr>
                 <w:bottom w:val="none" w:sz="0" w:space="0" w:color="000000"/>
@@ -2161,6 +2190,7 @@
           </w:tcPr>
           <w:p>
             <w:pPr>
+              <w:pStyle w:val="Normal"/>
               <w:jc w:val="center"/>
               <w:pBdr>
                 <w:bottom w:val="none" w:sz="0" w:space="0" w:color="000000"/>
@@ -2201,26 +2231,26 @@
         <w:trPr>
           <w:trHeight w:val="270" w:hRule="exact"/>
         </w:trPr>
-        body 8
-        <w:tc>
-          <w:tcPr>
-            <w:tcBorders>
-              <w:bottom w:val="none" w:sz="0" w:space="0" w:color="000000"/>
-              <w:top w:val="none" w:sz="0" w:space="0" w:color="000000"/>
-              <w:left w:val="none" w:sz="0" w:space="0" w:color="000000"/>
-              <w:right w:val="none" w:sz="0" w:space="0" w:color="000000"/>
-            </w:tcBorders>
-            <w:shd w:val="clear" w:color="auto" w:fill="FFFFFF"/>
-            <w:tcMar>
-              <w:top w:w="0" w:type="dxa"/>
-              <w:bottom w:w="0" w:type="dxa"/>
-              <w:left w:w="0" w:type="dxa"/>
-              <w:right w:w="0" w:type="dxa"/>
-            </w:tcMar>
-            <w:vAlign w:val="center"/>
-          </w:tcPr>
-          <w:p>
-            <w:pPr>
+        <w:tc>
+          <w:tcPr>
+            <w:tcBorders>
+              <w:bottom w:val="none" w:sz="0" w:space="0" w:color="000000"/>
+              <w:top w:val="none" w:sz="0" w:space="0" w:color="000000"/>
+              <w:left w:val="none" w:sz="0" w:space="0" w:color="000000"/>
+              <w:right w:val="none" w:sz="0" w:space="0" w:color="000000"/>
+            </w:tcBorders>
+            <w:shd w:val="clear" w:color="auto" w:fill="FFFFFF"/>
+            <w:tcMar>
+              <w:top w:w="0" w:type="dxa"/>
+              <w:bottom w:w="0" w:type="dxa"/>
+              <w:left w:w="0" w:type="dxa"/>
+              <w:right w:w="0" w:type="dxa"/>
+            </w:tcMar>
+            <w:vAlign w:val="center"/>
+          </w:tcPr>
+          <w:p>
+            <w:pPr>
+              <w:pStyle w:val="Normal"/>
               <w:jc w:val="left"/>
               <w:pBdr>
                 <w:bottom w:val="none" w:sz="0" w:space="0" w:color="000000"/>
@@ -2275,6 +2305,7 @@
           </w:tcPr>
           <w:p>
             <w:pPr>
+              <w:pStyle w:val="Normal"/>
               <w:jc w:val="center"/>
               <w:pBdr>
                 <w:bottom w:val="none" w:sz="0" w:space="0" w:color="000000"/>
@@ -2329,6 +2360,7 @@
           </w:tcPr>
           <w:p>
             <w:pPr>
+              <w:pStyle w:val="Normal"/>
               <w:jc w:val="center"/>
               <w:pBdr>
                 <w:bottom w:val="none" w:sz="0" w:space="0" w:color="000000"/>
@@ -2383,6 +2415,7 @@
           </w:tcPr>
           <w:p>
             <w:pPr>
+              <w:pStyle w:val="Normal"/>
               <w:jc w:val="center"/>
               <w:pBdr>
                 <w:bottom w:val="none" w:sz="0" w:space="0" w:color="000000"/>
@@ -2437,6 +2470,7 @@
           </w:tcPr>
           <w:p>
             <w:pPr>
+              <w:pStyle w:val="Normal"/>
               <w:jc w:val="center"/>
               <w:pBdr>
                 <w:bottom w:val="none" w:sz="0" w:space="0" w:color="000000"/>
@@ -2491,6 +2525,7 @@
           </w:tcPr>
           <w:p>
             <w:pPr>
+              <w:pStyle w:val="Normal"/>
               <w:jc w:val="center"/>
               <w:pBdr>
                 <w:bottom w:val="none" w:sz="0" w:space="0" w:color="000000"/>
@@ -2531,7 +2566,6 @@
         <w:trPr>
           <w:trHeight w:val="369" w:hRule="exact"/>
         </w:trPr>
-        body 9
         <w:tc>
           <w:tcPr>
             <w:gridSpan w:val="6"/>
@@ -2552,6 +2586,7 @@
           </w:tcPr>
           <w:p>
             <w:pPr>
+              <w:pStyle w:val="Normal"/>
               <w:jc w:val="left"/>
               <w:pBdr>
                 <w:bottom w:val="none" w:sz="0" w:space="0" w:color="000000"/>
@@ -2592,7 +2627,6 @@
         <w:trPr>
           <w:trHeight w:val="270" w:hRule="exact"/>
         </w:trPr>
-        body10
         <w:tc>
           <w:tcPr>
             <w:tcBorders>
@@ -2612,6 +2646,7 @@
           </w:tcPr>
           <w:p>
             <w:pPr>
+              <w:pStyle w:val="Normal"/>
               <w:jc w:val="left"/>
               <w:pBdr>
                 <w:bottom w:val="none" w:sz="0" w:space="0" w:color="000000"/>
@@ -2666,6 +2701,7 @@
           </w:tcPr>
           <w:p>
             <w:pPr>
+              <w:pStyle w:val="Normal"/>
               <w:jc w:val="center"/>
               <w:pBdr>
                 <w:bottom w:val="none" w:sz="0" w:space="0" w:color="000000"/>
@@ -2720,6 +2756,7 @@
           </w:tcPr>
           <w:p>
             <w:pPr>
+              <w:pStyle w:val="Normal"/>
               <w:jc w:val="center"/>
               <w:pBdr>
                 <w:bottom w:val="none" w:sz="0" w:space="0" w:color="000000"/>
@@ -2774,6 +2811,7 @@
           </w:tcPr>
           <w:p>
             <w:pPr>
+              <w:pStyle w:val="Normal"/>
               <w:jc w:val="center"/>
               <w:pBdr>
                 <w:bottom w:val="none" w:sz="0" w:space="0" w:color="000000"/>
@@ -2828,6 +2866,7 @@
           </w:tcPr>
           <w:p>
             <w:pPr>
+              <w:pStyle w:val="Normal"/>
               <w:jc w:val="center"/>
               <w:pBdr>
                 <w:bottom w:val="none" w:sz="0" w:space="0" w:color="000000"/>
@@ -2882,6 +2921,7 @@
           </w:tcPr>
           <w:p>
             <w:pPr>
+              <w:pStyle w:val="Normal"/>
               <w:jc w:val="center"/>
               <w:pBdr>
                 <w:bottom w:val="none" w:sz="0" w:space="0" w:color="000000"/>
@@ -2922,26 +2962,26 @@
         <w:trPr>
           <w:trHeight w:val="270" w:hRule="exact"/>
         </w:trPr>
-        body11
-        <w:tc>
-          <w:tcPr>
-            <w:tcBorders>
-              <w:bottom w:val="none" w:sz="0" w:space="0" w:color="000000"/>
-              <w:top w:val="none" w:sz="0" w:space="0" w:color="000000"/>
-              <w:left w:val="none" w:sz="0" w:space="0" w:color="000000"/>
-              <w:right w:val="none" w:sz="0" w:space="0" w:color="000000"/>
-            </w:tcBorders>
-            <w:shd w:val="clear" w:color="auto" w:fill="FFFFFF"/>
-            <w:tcMar>
-              <w:top w:w="0" w:type="dxa"/>
-              <w:bottom w:w="0" w:type="dxa"/>
-              <w:left w:w="0" w:type="dxa"/>
-              <w:right w:w="0" w:type="dxa"/>
-            </w:tcMar>
-            <w:vAlign w:val="center"/>
-          </w:tcPr>
-          <w:p>
-            <w:pPr>
+        <w:tc>
+          <w:tcPr>
+            <w:tcBorders>
+              <w:bottom w:val="none" w:sz="0" w:space="0" w:color="000000"/>
+              <w:top w:val="none" w:sz="0" w:space="0" w:color="000000"/>
+              <w:left w:val="none" w:sz="0" w:space="0" w:color="000000"/>
+              <w:right w:val="none" w:sz="0" w:space="0" w:color="000000"/>
+            </w:tcBorders>
+            <w:shd w:val="clear" w:color="auto" w:fill="FFFFFF"/>
+            <w:tcMar>
+              <w:top w:w="0" w:type="dxa"/>
+              <w:bottom w:w="0" w:type="dxa"/>
+              <w:left w:w="0" w:type="dxa"/>
+              <w:right w:w="0" w:type="dxa"/>
+            </w:tcMar>
+            <w:vAlign w:val="center"/>
+          </w:tcPr>
+          <w:p>
+            <w:pPr>
+              <w:pStyle w:val="Normal"/>
               <w:jc w:val="left"/>
               <w:pBdr>
                 <w:bottom w:val="none" w:sz="0" w:space="0" w:color="000000"/>
@@ -2996,6 +3036,7 @@
           </w:tcPr>
           <w:p>
             <w:pPr>
+              <w:pStyle w:val="Normal"/>
               <w:jc w:val="center"/>
               <w:pBdr>
                 <w:bottom w:val="none" w:sz="0" w:space="0" w:color="000000"/>
@@ -3050,6 +3091,7 @@
           </w:tcPr>
           <w:p>
             <w:pPr>
+              <w:pStyle w:val="Normal"/>
               <w:jc w:val="center"/>
               <w:pBdr>
                 <w:bottom w:val="none" w:sz="0" w:space="0" w:color="000000"/>
@@ -3104,6 +3146,7 @@
           </w:tcPr>
           <w:p>
             <w:pPr>
+              <w:pStyle w:val="Normal"/>
               <w:jc w:val="center"/>
               <w:pBdr>
                 <w:bottom w:val="none" w:sz="0" w:space="0" w:color="000000"/>
@@ -3158,6 +3201,7 @@
           </w:tcPr>
           <w:p>
             <w:pPr>
+              <w:pStyle w:val="Normal"/>
               <w:jc w:val="center"/>
               <w:pBdr>
                 <w:bottom w:val="none" w:sz="0" w:space="0" w:color="000000"/>
@@ -3212,6 +3256,7 @@
           </w:tcPr>
           <w:p>
             <w:pPr>
+              <w:pStyle w:val="Normal"/>
               <w:jc w:val="center"/>
               <w:pBdr>
                 <w:bottom w:val="none" w:sz="0" w:space="0" w:color="000000"/>
@@ -3252,26 +3297,26 @@
         <w:trPr>
           <w:trHeight w:val="270" w:hRule="exact"/>
         </w:trPr>
-        body12
-        <w:tc>
-          <w:tcPr>
-            <w:tcBorders>
-              <w:bottom w:val="none" w:sz="0" w:space="0" w:color="000000"/>
-              <w:top w:val="none" w:sz="0" w:space="0" w:color="000000"/>
-              <w:left w:val="none" w:sz="0" w:space="0" w:color="000000"/>
-              <w:right w:val="none" w:sz="0" w:space="0" w:color="000000"/>
-            </w:tcBorders>
-            <w:shd w:val="clear" w:color="auto" w:fill="FFFFFF"/>
-            <w:tcMar>
-              <w:top w:w="0" w:type="dxa"/>
-              <w:bottom w:w="0" w:type="dxa"/>
-              <w:left w:w="0" w:type="dxa"/>
-              <w:right w:w="0" w:type="dxa"/>
-            </w:tcMar>
-            <w:vAlign w:val="center"/>
-          </w:tcPr>
-          <w:p>
-            <w:pPr>
+        <w:tc>
+          <w:tcPr>
+            <w:tcBorders>
+              <w:bottom w:val="none" w:sz="0" w:space="0" w:color="000000"/>
+              <w:top w:val="none" w:sz="0" w:space="0" w:color="000000"/>
+              <w:left w:val="none" w:sz="0" w:space="0" w:color="000000"/>
+              <w:right w:val="none" w:sz="0" w:space="0" w:color="000000"/>
+            </w:tcBorders>
+            <w:shd w:val="clear" w:color="auto" w:fill="FFFFFF"/>
+            <w:tcMar>
+              <w:top w:w="0" w:type="dxa"/>
+              <w:bottom w:w="0" w:type="dxa"/>
+              <w:left w:w="0" w:type="dxa"/>
+              <w:right w:w="0" w:type="dxa"/>
+            </w:tcMar>
+            <w:vAlign w:val="center"/>
+          </w:tcPr>
+          <w:p>
+            <w:pPr>
+              <w:pStyle w:val="Normal"/>
               <w:jc w:val="left"/>
               <w:pBdr>
                 <w:bottom w:val="none" w:sz="0" w:space="0" w:color="000000"/>
@@ -3326,6 +3371,7 @@
           </w:tcPr>
           <w:p>
             <w:pPr>
+              <w:pStyle w:val="Normal"/>
               <w:jc w:val="center"/>
               <w:pBdr>
                 <w:bottom w:val="none" w:sz="0" w:space="0" w:color="000000"/>
@@ -3380,6 +3426,7 @@
           </w:tcPr>
           <w:p>
             <w:pPr>
+              <w:pStyle w:val="Normal"/>
               <w:jc w:val="center"/>
               <w:pBdr>
                 <w:bottom w:val="none" w:sz="0" w:space="0" w:color="000000"/>
@@ -3434,6 +3481,7 @@
           </w:tcPr>
           <w:p>
             <w:pPr>
+              <w:pStyle w:val="Normal"/>
               <w:jc w:val="center"/>
               <w:pBdr>
                 <w:bottom w:val="none" w:sz="0" w:space="0" w:color="000000"/>
@@ -3488,6 +3536,7 @@
           </w:tcPr>
           <w:p>
             <w:pPr>
+              <w:pStyle w:val="Normal"/>
               <w:jc w:val="center"/>
               <w:pBdr>
                 <w:bottom w:val="none" w:sz="0" w:space="0" w:color="000000"/>
@@ -3542,6 +3591,7 @@
           </w:tcPr>
           <w:p>
             <w:pPr>
+              <w:pStyle w:val="Normal"/>
               <w:jc w:val="center"/>
               <w:pBdr>
                 <w:bottom w:val="none" w:sz="0" w:space="0" w:color="000000"/>
@@ -3582,26 +3632,26 @@
         <w:trPr>
           <w:trHeight w:val="270" w:hRule="exact"/>
         </w:trPr>
-        body13
-        <w:tc>
-          <w:tcPr>
-            <w:tcBorders>
-              <w:bottom w:val="none" w:sz="0" w:space="0" w:color="000000"/>
-              <w:top w:val="none" w:sz="0" w:space="0" w:color="000000"/>
-              <w:left w:val="none" w:sz="0" w:space="0" w:color="000000"/>
-              <w:right w:val="none" w:sz="0" w:space="0" w:color="000000"/>
-            </w:tcBorders>
-            <w:shd w:val="clear" w:color="auto" w:fill="FFFFFF"/>
-            <w:tcMar>
-              <w:top w:w="0" w:type="dxa"/>
-              <w:bottom w:w="0" w:type="dxa"/>
-              <w:left w:w="0" w:type="dxa"/>
-              <w:right w:w="0" w:type="dxa"/>
-            </w:tcMar>
-            <w:vAlign w:val="center"/>
-          </w:tcPr>
-          <w:p>
-            <w:pPr>
+        <w:tc>
+          <w:tcPr>
+            <w:tcBorders>
+              <w:bottom w:val="none" w:sz="0" w:space="0" w:color="000000"/>
+              <w:top w:val="none" w:sz="0" w:space="0" w:color="000000"/>
+              <w:left w:val="none" w:sz="0" w:space="0" w:color="000000"/>
+              <w:right w:val="none" w:sz="0" w:space="0" w:color="000000"/>
+            </w:tcBorders>
+            <w:shd w:val="clear" w:color="auto" w:fill="FFFFFF"/>
+            <w:tcMar>
+              <w:top w:w="0" w:type="dxa"/>
+              <w:bottom w:w="0" w:type="dxa"/>
+              <w:left w:w="0" w:type="dxa"/>
+              <w:right w:w="0" w:type="dxa"/>
+            </w:tcMar>
+            <w:vAlign w:val="center"/>
+          </w:tcPr>
+          <w:p>
+            <w:pPr>
+              <w:pStyle w:val="Normal"/>
               <w:jc w:val="left"/>
               <w:pBdr>
                 <w:bottom w:val="none" w:sz="0" w:space="0" w:color="000000"/>
@@ -3656,6 +3706,7 @@
           </w:tcPr>
           <w:p>
             <w:pPr>
+              <w:pStyle w:val="Normal"/>
               <w:jc w:val="center"/>
               <w:pBdr>
                 <w:bottom w:val="none" w:sz="0" w:space="0" w:color="000000"/>
@@ -3710,6 +3761,7 @@
           </w:tcPr>
           <w:p>
             <w:pPr>
+              <w:pStyle w:val="Normal"/>
               <w:jc w:val="center"/>
               <w:pBdr>
                 <w:bottom w:val="none" w:sz="0" w:space="0" w:color="000000"/>
@@ -3764,6 +3816,7 @@
           </w:tcPr>
           <w:p>
             <w:pPr>
+              <w:pStyle w:val="Normal"/>
               <w:jc w:val="center"/>
               <w:pBdr>
                 <w:bottom w:val="none" w:sz="0" w:space="0" w:color="000000"/>
@@ -3818,6 +3871,7 @@
           </w:tcPr>
           <w:p>
             <w:pPr>
+              <w:pStyle w:val="Normal"/>
               <w:jc w:val="center"/>
               <w:pBdr>
                 <w:bottom w:val="none" w:sz="0" w:space="0" w:color="000000"/>
@@ -3872,6 +3926,7 @@
           </w:tcPr>
           <w:p>
             <w:pPr>
+              <w:pStyle w:val="Normal"/>
               <w:jc w:val="center"/>
               <w:pBdr>
                 <w:bottom w:val="none" w:sz="0" w:space="0" w:color="000000"/>
@@ -3912,26 +3967,26 @@
         <w:trPr>
           <w:trHeight w:val="270" w:hRule="exact"/>
         </w:trPr>
-        body14
-        <w:tc>
-          <w:tcPr>
-            <w:tcBorders>
-              <w:bottom w:val="none" w:sz="0" w:space="0" w:color="000000"/>
-              <w:top w:val="none" w:sz="0" w:space="0" w:color="000000"/>
-              <w:left w:val="none" w:sz="0" w:space="0" w:color="000000"/>
-              <w:right w:val="none" w:sz="0" w:space="0" w:color="000000"/>
-            </w:tcBorders>
-            <w:shd w:val="clear" w:color="auto" w:fill="FFFFFF"/>
-            <w:tcMar>
-              <w:top w:w="0" w:type="dxa"/>
-              <w:bottom w:w="0" w:type="dxa"/>
-              <w:left w:w="0" w:type="dxa"/>
-              <w:right w:w="0" w:type="dxa"/>
-            </w:tcMar>
-            <w:vAlign w:val="center"/>
-          </w:tcPr>
-          <w:p>
-            <w:pPr>
+        <w:tc>
+          <w:tcPr>
+            <w:tcBorders>
+              <w:bottom w:val="none" w:sz="0" w:space="0" w:color="000000"/>
+              <w:top w:val="none" w:sz="0" w:space="0" w:color="000000"/>
+              <w:left w:val="none" w:sz="0" w:space="0" w:color="000000"/>
+              <w:right w:val="none" w:sz="0" w:space="0" w:color="000000"/>
+            </w:tcBorders>
+            <w:shd w:val="clear" w:color="auto" w:fill="FFFFFF"/>
+            <w:tcMar>
+              <w:top w:w="0" w:type="dxa"/>
+              <w:bottom w:w="0" w:type="dxa"/>
+              <w:left w:w="0" w:type="dxa"/>
+              <w:right w:w="0" w:type="dxa"/>
+            </w:tcMar>
+            <w:vAlign w:val="center"/>
+          </w:tcPr>
+          <w:p>
+            <w:pPr>
+              <w:pStyle w:val="Normal"/>
               <w:jc w:val="left"/>
               <w:pBdr>
                 <w:bottom w:val="none" w:sz="0" w:space="0" w:color="000000"/>
@@ -3986,6 +4041,7 @@
           </w:tcPr>
           <w:p>
             <w:pPr>
+              <w:pStyle w:val="Normal"/>
               <w:jc w:val="center"/>
               <w:pBdr>
                 <w:bottom w:val="none" w:sz="0" w:space="0" w:color="000000"/>
@@ -4040,6 +4096,7 @@
           </w:tcPr>
           <w:p>
             <w:pPr>
+              <w:pStyle w:val="Normal"/>
               <w:jc w:val="center"/>
               <w:pBdr>
                 <w:bottom w:val="none" w:sz="0" w:space="0" w:color="000000"/>
@@ -4094,6 +4151,7 @@
           </w:tcPr>
           <w:p>
             <w:pPr>
+              <w:pStyle w:val="Normal"/>
               <w:jc w:val="center"/>
               <w:pBdr>
                 <w:bottom w:val="none" w:sz="0" w:space="0" w:color="000000"/>
@@ -4148,6 +4206,7 @@
           </w:tcPr>
           <w:p>
             <w:pPr>
+              <w:pStyle w:val="Normal"/>
               <w:jc w:val="center"/>
               <w:pBdr>
                 <w:bottom w:val="none" w:sz="0" w:space="0" w:color="000000"/>
@@ -4202,6 +4261,7 @@
           </w:tcPr>
           <w:p>
             <w:pPr>
+              <w:pStyle w:val="Normal"/>
               <w:jc w:val="center"/>
               <w:pBdr>
                 <w:bottom w:val="none" w:sz="0" w:space="0" w:color="000000"/>
@@ -4242,26 +4302,26 @@
         <w:trPr>
           <w:trHeight w:val="270" w:hRule="exact"/>
         </w:trPr>
-        body15
-        <w:tc>
-          <w:tcPr>
-            <w:tcBorders>
-              <w:bottom w:val="none" w:sz="0" w:space="0" w:color="000000"/>
-              <w:top w:val="none" w:sz="0" w:space="0" w:color="000000"/>
-              <w:left w:val="none" w:sz="0" w:space="0" w:color="000000"/>
-              <w:right w:val="none" w:sz="0" w:space="0" w:color="000000"/>
-            </w:tcBorders>
-            <w:shd w:val="clear" w:color="auto" w:fill="FFFFFF"/>
-            <w:tcMar>
-              <w:top w:w="0" w:type="dxa"/>
-              <w:bottom w:w="0" w:type="dxa"/>
-              <w:left w:w="0" w:type="dxa"/>
-              <w:right w:w="0" w:type="dxa"/>
-            </w:tcMar>
-            <w:vAlign w:val="center"/>
-          </w:tcPr>
-          <w:p>
-            <w:pPr>
+        <w:tc>
+          <w:tcPr>
+            <w:tcBorders>
+              <w:bottom w:val="none" w:sz="0" w:space="0" w:color="000000"/>
+              <w:top w:val="none" w:sz="0" w:space="0" w:color="000000"/>
+              <w:left w:val="none" w:sz="0" w:space="0" w:color="000000"/>
+              <w:right w:val="none" w:sz="0" w:space="0" w:color="000000"/>
+            </w:tcBorders>
+            <w:shd w:val="clear" w:color="auto" w:fill="FFFFFF"/>
+            <w:tcMar>
+              <w:top w:w="0" w:type="dxa"/>
+              <w:bottom w:w="0" w:type="dxa"/>
+              <w:left w:w="0" w:type="dxa"/>
+              <w:right w:w="0" w:type="dxa"/>
+            </w:tcMar>
+            <w:vAlign w:val="center"/>
+          </w:tcPr>
+          <w:p>
+            <w:pPr>
+              <w:pStyle w:val="Normal"/>
               <w:jc w:val="left"/>
               <w:pBdr>
                 <w:bottom w:val="none" w:sz="0" w:space="0" w:color="000000"/>
@@ -4316,6 +4376,7 @@
           </w:tcPr>
           <w:p>
             <w:pPr>
+              <w:pStyle w:val="Normal"/>
               <w:jc w:val="center"/>
               <w:pBdr>
                 <w:bottom w:val="none" w:sz="0" w:space="0" w:color="000000"/>
@@ -4370,6 +4431,7 @@
           </w:tcPr>
           <w:p>
             <w:pPr>
+              <w:pStyle w:val="Normal"/>
               <w:jc w:val="center"/>
               <w:pBdr>
                 <w:bottom w:val="none" w:sz="0" w:space="0" w:color="000000"/>
@@ -4424,6 +4486,7 @@
           </w:tcPr>
           <w:p>
             <w:pPr>
+              <w:pStyle w:val="Normal"/>
               <w:jc w:val="center"/>
               <w:pBdr>
                 <w:bottom w:val="none" w:sz="0" w:space="0" w:color="000000"/>
@@ -4478,6 +4541,7 @@
           </w:tcPr>
           <w:p>
             <w:pPr>
+              <w:pStyle w:val="Normal"/>
               <w:jc w:val="center"/>
               <w:pBdr>
                 <w:bottom w:val="none" w:sz="0" w:space="0" w:color="000000"/>
@@ -4532,6 +4596,7 @@
           </w:tcPr>
           <w:p>
             <w:pPr>
+              <w:pStyle w:val="Normal"/>
               <w:jc w:val="center"/>
               <w:pBdr>
                 <w:bottom w:val="none" w:sz="0" w:space="0" w:color="000000"/>
@@ -4572,26 +4637,26 @@
         <w:trPr>
           <w:trHeight w:val="270" w:hRule="exact"/>
         </w:trPr>
-        body16
-        <w:tc>
-          <w:tcPr>
-            <w:tcBorders>
-              <w:bottom w:val="none" w:sz="0" w:space="0" w:color="000000"/>
-              <w:top w:val="none" w:sz="0" w:space="0" w:color="000000"/>
-              <w:left w:val="none" w:sz="0" w:space="0" w:color="000000"/>
-              <w:right w:val="none" w:sz="0" w:space="0" w:color="000000"/>
-            </w:tcBorders>
-            <w:shd w:val="clear" w:color="auto" w:fill="FFFFFF"/>
-            <w:tcMar>
-              <w:top w:w="0" w:type="dxa"/>
-              <w:bottom w:w="0" w:type="dxa"/>
-              <w:left w:w="0" w:type="dxa"/>
-              <w:right w:w="0" w:type="dxa"/>
-            </w:tcMar>
-            <w:vAlign w:val="center"/>
-          </w:tcPr>
-          <w:p>
-            <w:pPr>
+        <w:tc>
+          <w:tcPr>
+            <w:tcBorders>
+              <w:bottom w:val="none" w:sz="0" w:space="0" w:color="000000"/>
+              <w:top w:val="none" w:sz="0" w:space="0" w:color="000000"/>
+              <w:left w:val="none" w:sz="0" w:space="0" w:color="000000"/>
+              <w:right w:val="none" w:sz="0" w:space="0" w:color="000000"/>
+            </w:tcBorders>
+            <w:shd w:val="clear" w:color="auto" w:fill="FFFFFF"/>
+            <w:tcMar>
+              <w:top w:w="0" w:type="dxa"/>
+              <w:bottom w:w="0" w:type="dxa"/>
+              <w:left w:w="0" w:type="dxa"/>
+              <w:right w:w="0" w:type="dxa"/>
+            </w:tcMar>
+            <w:vAlign w:val="center"/>
+          </w:tcPr>
+          <w:p>
+            <w:pPr>
+              <w:pStyle w:val="Normal"/>
               <w:jc w:val="left"/>
               <w:pBdr>
                 <w:bottom w:val="none" w:sz="0" w:space="0" w:color="000000"/>
@@ -4646,6 +4711,7 @@
           </w:tcPr>
           <w:p>
             <w:pPr>
+              <w:pStyle w:val="Normal"/>
               <w:jc w:val="center"/>
               <w:pBdr>
                 <w:bottom w:val="none" w:sz="0" w:space="0" w:color="000000"/>
@@ -4700,6 +4766,7 @@
           </w:tcPr>
           <w:p>
             <w:pPr>
+              <w:pStyle w:val="Normal"/>
               <w:jc w:val="center"/>
               <w:pBdr>
                 <w:bottom w:val="none" w:sz="0" w:space="0" w:color="000000"/>
@@ -4754,6 +4821,7 @@
           </w:tcPr>
           <w:p>
             <w:pPr>
+              <w:pStyle w:val="Normal"/>
               <w:jc w:val="center"/>
               <w:pBdr>
                 <w:bottom w:val="none" w:sz="0" w:space="0" w:color="000000"/>
@@ -4808,6 +4876,7 @@
           </w:tcPr>
           <w:p>
             <w:pPr>
+              <w:pStyle w:val="Normal"/>
               <w:jc w:val="center"/>
               <w:pBdr>
                 <w:bottom w:val="none" w:sz="0" w:space="0" w:color="000000"/>
@@ -4862,6 +4931,7 @@
           </w:tcPr>
           <w:p>
             <w:pPr>
+              <w:pStyle w:val="Normal"/>
               <w:jc w:val="center"/>
               <w:pBdr>
                 <w:bottom w:val="none" w:sz="0" w:space="0" w:color="000000"/>
@@ -4902,26 +4972,26 @@
         <w:trPr>
           <w:trHeight w:val="270" w:hRule="exact"/>
         </w:trPr>
-        body17
-        <w:tc>
-          <w:tcPr>
-            <w:tcBorders>
-              <w:bottom w:val="none" w:sz="0" w:space="0" w:color="000000"/>
-              <w:top w:val="none" w:sz="0" w:space="0" w:color="000000"/>
-              <w:left w:val="none" w:sz="0" w:space="0" w:color="000000"/>
-              <w:right w:val="none" w:sz="0" w:space="0" w:color="000000"/>
-            </w:tcBorders>
-            <w:shd w:val="clear" w:color="auto" w:fill="FFFFFF"/>
-            <w:tcMar>
-              <w:top w:w="0" w:type="dxa"/>
-              <w:bottom w:w="0" w:type="dxa"/>
-              <w:left w:w="0" w:type="dxa"/>
-              <w:right w:w="0" w:type="dxa"/>
-            </w:tcMar>
-            <w:vAlign w:val="center"/>
-          </w:tcPr>
-          <w:p>
-            <w:pPr>
+        <w:tc>
+          <w:tcPr>
+            <w:tcBorders>
+              <w:bottom w:val="none" w:sz="0" w:space="0" w:color="000000"/>
+              <w:top w:val="none" w:sz="0" w:space="0" w:color="000000"/>
+              <w:left w:val="none" w:sz="0" w:space="0" w:color="000000"/>
+              <w:right w:val="none" w:sz="0" w:space="0" w:color="000000"/>
+            </w:tcBorders>
+            <w:shd w:val="clear" w:color="auto" w:fill="FFFFFF"/>
+            <w:tcMar>
+              <w:top w:w="0" w:type="dxa"/>
+              <w:bottom w:w="0" w:type="dxa"/>
+              <w:left w:w="0" w:type="dxa"/>
+              <w:right w:w="0" w:type="dxa"/>
+            </w:tcMar>
+            <w:vAlign w:val="center"/>
+          </w:tcPr>
+          <w:p>
+            <w:pPr>
+              <w:pStyle w:val="Normal"/>
               <w:jc w:val="left"/>
               <w:pBdr>
                 <w:bottom w:val="none" w:sz="0" w:space="0" w:color="000000"/>
@@ -4976,6 +5046,7 @@
           </w:tcPr>
           <w:p>
             <w:pPr>
+              <w:pStyle w:val="Normal"/>
               <w:jc w:val="center"/>
               <w:pBdr>
                 <w:bottom w:val="none" w:sz="0" w:space="0" w:color="000000"/>
@@ -5030,6 +5101,7 @@
           </w:tcPr>
           <w:p>
             <w:pPr>
+              <w:pStyle w:val="Normal"/>
               <w:jc w:val="center"/>
               <w:pBdr>
                 <w:bottom w:val="none" w:sz="0" w:space="0" w:color="000000"/>
@@ -5084,6 +5156,7 @@
           </w:tcPr>
           <w:p>
             <w:pPr>
+              <w:pStyle w:val="Normal"/>
               <w:jc w:val="center"/>
               <w:pBdr>
                 <w:bottom w:val="none" w:sz="0" w:space="0" w:color="000000"/>
@@ -5138,6 +5211,7 @@
           </w:tcPr>
           <w:p>
             <w:pPr>
+              <w:pStyle w:val="Normal"/>
               <w:jc w:val="center"/>
               <w:pBdr>
                 <w:bottom w:val="none" w:sz="0" w:space="0" w:color="000000"/>
@@ -5192,6 +5266,7 @@
           </w:tcPr>
           <w:p>
             <w:pPr>
+              <w:pStyle w:val="Normal"/>
               <w:jc w:val="center"/>
               <w:pBdr>
                 <w:bottom w:val="none" w:sz="0" w:space="0" w:color="000000"/>
@@ -5232,26 +5307,26 @@
         <w:trPr>
           <w:trHeight w:val="270" w:hRule="exact"/>
         </w:trPr>
-        body18
-        <w:tc>
-          <w:tcPr>
-            <w:tcBorders>
-              <w:bottom w:val="none" w:sz="0" w:space="0" w:color="000000"/>
-              <w:top w:val="none" w:sz="0" w:space="0" w:color="000000"/>
-              <w:left w:val="none" w:sz="0" w:space="0" w:color="000000"/>
-              <w:right w:val="none" w:sz="0" w:space="0" w:color="000000"/>
-            </w:tcBorders>
-            <w:shd w:val="clear" w:color="auto" w:fill="FFFFFF"/>
-            <w:tcMar>
-              <w:top w:w="0" w:type="dxa"/>
-              <w:bottom w:w="0" w:type="dxa"/>
-              <w:left w:w="0" w:type="dxa"/>
-              <w:right w:w="0" w:type="dxa"/>
-            </w:tcMar>
-            <w:vAlign w:val="center"/>
-          </w:tcPr>
-          <w:p>
-            <w:pPr>
+        <w:tc>
+          <w:tcPr>
+            <w:tcBorders>
+              <w:bottom w:val="none" w:sz="0" w:space="0" w:color="000000"/>
+              <w:top w:val="none" w:sz="0" w:space="0" w:color="000000"/>
+              <w:left w:val="none" w:sz="0" w:space="0" w:color="000000"/>
+              <w:right w:val="none" w:sz="0" w:space="0" w:color="000000"/>
+            </w:tcBorders>
+            <w:shd w:val="clear" w:color="auto" w:fill="FFFFFF"/>
+            <w:tcMar>
+              <w:top w:w="0" w:type="dxa"/>
+              <w:bottom w:w="0" w:type="dxa"/>
+              <w:left w:w="0" w:type="dxa"/>
+              <w:right w:w="0" w:type="dxa"/>
+            </w:tcMar>
+            <w:vAlign w:val="center"/>
+          </w:tcPr>
+          <w:p>
+            <w:pPr>
+              <w:pStyle w:val="Normal"/>
               <w:jc w:val="left"/>
               <w:pBdr>
                 <w:bottom w:val="none" w:sz="0" w:space="0" w:color="000000"/>
@@ -5306,6 +5381,7 @@
           </w:tcPr>
           <w:p>
             <w:pPr>
+              <w:pStyle w:val="Normal"/>
               <w:jc w:val="center"/>
               <w:pBdr>
                 <w:bottom w:val="none" w:sz="0" w:space="0" w:color="000000"/>
@@ -5360,6 +5436,7 @@
           </w:tcPr>
           <w:p>
             <w:pPr>
+              <w:pStyle w:val="Normal"/>
               <w:jc w:val="center"/>
               <w:pBdr>
                 <w:bottom w:val="none" w:sz="0" w:space="0" w:color="000000"/>
@@ -5414,6 +5491,7 @@
           </w:tcPr>
           <w:p>
             <w:pPr>
+              <w:pStyle w:val="Normal"/>
               <w:jc w:val="center"/>
               <w:pBdr>
                 <w:bottom w:val="none" w:sz="0" w:space="0" w:color="000000"/>
@@ -5468,6 +5546,7 @@
           </w:tcPr>
           <w:p>
             <w:pPr>
+              <w:pStyle w:val="Normal"/>
               <w:jc w:val="center"/>
               <w:pBdr>
                 <w:bottom w:val="none" w:sz="0" w:space="0" w:color="000000"/>
@@ -5522,6 +5601,7 @@
           </w:tcPr>
           <w:p>
             <w:pPr>
+              <w:pStyle w:val="Normal"/>
               <w:jc w:val="center"/>
               <w:pBdr>
                 <w:bottom w:val="none" w:sz="0" w:space="0" w:color="000000"/>
@@ -5562,26 +5642,26 @@
         <w:trPr>
           <w:trHeight w:val="270" w:hRule="exact"/>
         </w:trPr>
-        body19
-        <w:tc>
-          <w:tcPr>
-            <w:tcBorders>
-              <w:bottom w:val="none" w:sz="0" w:space="0" w:color="000000"/>
-              <w:top w:val="none" w:sz="0" w:space="0" w:color="000000"/>
-              <w:left w:val="none" w:sz="0" w:space="0" w:color="000000"/>
-              <w:right w:val="none" w:sz="0" w:space="0" w:color="000000"/>
-            </w:tcBorders>
-            <w:shd w:val="clear" w:color="auto" w:fill="FFFFFF"/>
-            <w:tcMar>
-              <w:top w:w="0" w:type="dxa"/>
-              <w:bottom w:w="0" w:type="dxa"/>
-              <w:left w:w="0" w:type="dxa"/>
-              <w:right w:w="0" w:type="dxa"/>
-            </w:tcMar>
-            <w:vAlign w:val="center"/>
-          </w:tcPr>
-          <w:p>
-            <w:pPr>
+        <w:tc>
+          <w:tcPr>
+            <w:tcBorders>
+              <w:bottom w:val="none" w:sz="0" w:space="0" w:color="000000"/>
+              <w:top w:val="none" w:sz="0" w:space="0" w:color="000000"/>
+              <w:left w:val="none" w:sz="0" w:space="0" w:color="000000"/>
+              <w:right w:val="none" w:sz="0" w:space="0" w:color="000000"/>
+            </w:tcBorders>
+            <w:shd w:val="clear" w:color="auto" w:fill="FFFFFF"/>
+            <w:tcMar>
+              <w:top w:w="0" w:type="dxa"/>
+              <w:bottom w:w="0" w:type="dxa"/>
+              <w:left w:w="0" w:type="dxa"/>
+              <w:right w:w="0" w:type="dxa"/>
+            </w:tcMar>
+            <w:vAlign w:val="center"/>
+          </w:tcPr>
+          <w:p>
+            <w:pPr>
+              <w:pStyle w:val="Normal"/>
               <w:jc w:val="left"/>
               <w:pBdr>
                 <w:bottom w:val="none" w:sz="0" w:space="0" w:color="000000"/>
@@ -5636,6 +5716,7 @@
           </w:tcPr>
           <w:p>
             <w:pPr>
+              <w:pStyle w:val="Normal"/>
               <w:jc w:val="center"/>
               <w:pBdr>
                 <w:bottom w:val="none" w:sz="0" w:space="0" w:color="000000"/>
@@ -5690,6 +5771,7 @@
           </w:tcPr>
           <w:p>
             <w:pPr>
+              <w:pStyle w:val="Normal"/>
               <w:jc w:val="center"/>
               <w:pBdr>
                 <w:bottom w:val="none" w:sz="0" w:space="0" w:color="000000"/>
@@ -5744,6 +5826,7 @@
           </w:tcPr>
           <w:p>
             <w:pPr>
+              <w:pStyle w:val="Normal"/>
               <w:jc w:val="center"/>
               <w:pBdr>
                 <w:bottom w:val="none" w:sz="0" w:space="0" w:color="000000"/>
@@ -5798,6 +5881,7 @@
           </w:tcPr>
           <w:p>
             <w:pPr>
+              <w:pStyle w:val="Normal"/>
               <w:jc w:val="center"/>
               <w:pBdr>
                 <w:bottom w:val="none" w:sz="0" w:space="0" w:color="000000"/>
@@ -5852,6 +5936,7 @@
           </w:tcPr>
           <w:p>
             <w:pPr>
+              <w:pStyle w:val="Normal"/>
               <w:jc w:val="center"/>
               <w:pBdr>
                 <w:bottom w:val="none" w:sz="0" w:space="0" w:color="000000"/>
@@ -5892,26 +5977,26 @@
         <w:trPr>
           <w:trHeight w:val="270" w:hRule="exact"/>
         </w:trPr>
-        body20
-        <w:tc>
-          <w:tcPr>
-            <w:tcBorders>
-              <w:bottom w:val="none" w:sz="0" w:space="0" w:color="000000"/>
-              <w:top w:val="none" w:sz="0" w:space="0" w:color="000000"/>
-              <w:left w:val="none" w:sz="0" w:space="0" w:color="000000"/>
-              <w:right w:val="none" w:sz="0" w:space="0" w:color="000000"/>
-            </w:tcBorders>
-            <w:shd w:val="clear" w:color="auto" w:fill="FFFFFF"/>
-            <w:tcMar>
-              <w:top w:w="0" w:type="dxa"/>
-              <w:bottom w:w="0" w:type="dxa"/>
-              <w:left w:w="0" w:type="dxa"/>
-              <w:right w:w="0" w:type="dxa"/>
-            </w:tcMar>
-            <w:vAlign w:val="center"/>
-          </w:tcPr>
-          <w:p>
-            <w:pPr>
+        <w:tc>
+          <w:tcPr>
+            <w:tcBorders>
+              <w:bottom w:val="none" w:sz="0" w:space="0" w:color="000000"/>
+              <w:top w:val="none" w:sz="0" w:space="0" w:color="000000"/>
+              <w:left w:val="none" w:sz="0" w:space="0" w:color="000000"/>
+              <w:right w:val="none" w:sz="0" w:space="0" w:color="000000"/>
+            </w:tcBorders>
+            <w:shd w:val="clear" w:color="auto" w:fill="FFFFFF"/>
+            <w:tcMar>
+              <w:top w:w="0" w:type="dxa"/>
+              <w:bottom w:w="0" w:type="dxa"/>
+              <w:left w:w="0" w:type="dxa"/>
+              <w:right w:w="0" w:type="dxa"/>
+            </w:tcMar>
+            <w:vAlign w:val="center"/>
+          </w:tcPr>
+          <w:p>
+            <w:pPr>
+              <w:pStyle w:val="Normal"/>
               <w:jc w:val="left"/>
               <w:pBdr>
                 <w:bottom w:val="none" w:sz="0" w:space="0" w:color="000000"/>
@@ -5966,6 +6051,7 @@
           </w:tcPr>
           <w:p>
             <w:pPr>
+              <w:pStyle w:val="Normal"/>
               <w:jc w:val="center"/>
               <w:pBdr>
                 <w:bottom w:val="none" w:sz="0" w:space="0" w:color="000000"/>
@@ -6020,6 +6106,7 @@
           </w:tcPr>
           <w:p>
             <w:pPr>
+              <w:pStyle w:val="Normal"/>
               <w:jc w:val="center"/>
               <w:pBdr>
                 <w:bottom w:val="none" w:sz="0" w:space="0" w:color="000000"/>
@@ -6074,6 +6161,7 @@
           </w:tcPr>
           <w:p>
             <w:pPr>
+              <w:pStyle w:val="Normal"/>
               <w:jc w:val="center"/>
               <w:pBdr>
                 <w:bottom w:val="none" w:sz="0" w:space="0" w:color="000000"/>
@@ -6128,6 +6216,7 @@
           </w:tcPr>
           <w:p>
             <w:pPr>
+              <w:pStyle w:val="Normal"/>
               <w:jc w:val="center"/>
               <w:pBdr>
                 <w:bottom w:val="none" w:sz="0" w:space="0" w:color="000000"/>
@@ -6182,6 +6271,7 @@
           </w:tcPr>
           <w:p>
             <w:pPr>
+              <w:pStyle w:val="Normal"/>
               <w:jc w:val="center"/>
               <w:pBdr>
                 <w:bottom w:val="none" w:sz="0" w:space="0" w:color="000000"/>
@@ -6222,26 +6312,26 @@
         <w:trPr>
           <w:trHeight w:val="270" w:hRule="exact"/>
         </w:trPr>
-        body21
-        <w:tc>
-          <w:tcPr>
-            <w:tcBorders>
-              <w:bottom w:val="none" w:sz="0" w:space="0" w:color="000000"/>
-              <w:top w:val="none" w:sz="0" w:space="0" w:color="000000"/>
-              <w:left w:val="none" w:sz="0" w:space="0" w:color="000000"/>
-              <w:right w:val="none" w:sz="0" w:space="0" w:color="000000"/>
-            </w:tcBorders>
-            <w:shd w:val="clear" w:color="auto" w:fill="FFFFFF"/>
-            <w:tcMar>
-              <w:top w:w="0" w:type="dxa"/>
-              <w:bottom w:w="0" w:type="dxa"/>
-              <w:left w:w="0" w:type="dxa"/>
-              <w:right w:w="0" w:type="dxa"/>
-            </w:tcMar>
-            <w:vAlign w:val="center"/>
-          </w:tcPr>
-          <w:p>
-            <w:pPr>
+        <w:tc>
+          <w:tcPr>
+            <w:tcBorders>
+              <w:bottom w:val="none" w:sz="0" w:space="0" w:color="000000"/>
+              <w:top w:val="none" w:sz="0" w:space="0" w:color="000000"/>
+              <w:left w:val="none" w:sz="0" w:space="0" w:color="000000"/>
+              <w:right w:val="none" w:sz="0" w:space="0" w:color="000000"/>
+            </w:tcBorders>
+            <w:shd w:val="clear" w:color="auto" w:fill="FFFFFF"/>
+            <w:tcMar>
+              <w:top w:w="0" w:type="dxa"/>
+              <w:bottom w:w="0" w:type="dxa"/>
+              <w:left w:w="0" w:type="dxa"/>
+              <w:right w:w="0" w:type="dxa"/>
+            </w:tcMar>
+            <w:vAlign w:val="center"/>
+          </w:tcPr>
+          <w:p>
+            <w:pPr>
+              <w:pStyle w:val="Normal"/>
               <w:jc w:val="left"/>
               <w:pBdr>
                 <w:bottom w:val="none" w:sz="0" w:space="0" w:color="000000"/>
@@ -6296,6 +6386,7 @@
           </w:tcPr>
           <w:p>
             <w:pPr>
+              <w:pStyle w:val="Normal"/>
               <w:jc w:val="center"/>
               <w:pBdr>
                 <w:bottom w:val="none" w:sz="0" w:space="0" w:color="000000"/>
@@ -6350,6 +6441,7 @@
           </w:tcPr>
           <w:p>
             <w:pPr>
+              <w:pStyle w:val="Normal"/>
               <w:jc w:val="center"/>
               <w:pBdr>
                 <w:bottom w:val="none" w:sz="0" w:space="0" w:color="000000"/>
@@ -6404,6 +6496,7 @@
           </w:tcPr>
           <w:p>
             <w:pPr>
+              <w:pStyle w:val="Normal"/>
               <w:jc w:val="center"/>
               <w:pBdr>
                 <w:bottom w:val="none" w:sz="0" w:space="0" w:color="000000"/>
@@ -6458,6 +6551,7 @@
           </w:tcPr>
           <w:p>
             <w:pPr>
+              <w:pStyle w:val="Normal"/>
               <w:jc w:val="center"/>
               <w:pBdr>
                 <w:bottom w:val="none" w:sz="0" w:space="0" w:color="000000"/>
@@ -6512,6 +6606,7 @@
           </w:tcPr>
           <w:p>
             <w:pPr>
+              <w:pStyle w:val="Normal"/>
               <w:jc w:val="center"/>
               <w:pBdr>
                 <w:bottom w:val="none" w:sz="0" w:space="0" w:color="000000"/>
@@ -6552,7 +6647,6 @@
         <w:trPr>
           <w:trHeight w:val="369" w:hRule="exact"/>
         </w:trPr>
-        body22
         <w:tc>
           <w:tcPr>
             <w:gridSpan w:val="6"/>
@@ -6573,6 +6667,7 @@
           </w:tcPr>
           <w:p>
             <w:pPr>
+              <w:pStyle w:val="Normal"/>
               <w:jc w:val="left"/>
               <w:pBdr>
                 <w:bottom w:val="none" w:sz="0" w:space="0" w:color="000000"/>
@@ -6613,7 +6708,6 @@
         <w:trPr>
           <w:trHeight w:val="270" w:hRule="exact"/>
         </w:trPr>
-        body23
         <w:tc>
           <w:tcPr>
             <w:tcBorders>
@@ -6633,6 +6727,7 @@
           </w:tcPr>
           <w:p>
             <w:pPr>
+              <w:pStyle w:val="Normal"/>
               <w:jc w:val="left"/>
               <w:pBdr>
                 <w:bottom w:val="none" w:sz="0" w:space="0" w:color="000000"/>
@@ -6687,6 +6782,7 @@
           </w:tcPr>
           <w:p>
             <w:pPr>
+              <w:pStyle w:val="Normal"/>
               <w:jc w:val="center"/>
               <w:pBdr>
                 <w:bottom w:val="none" w:sz="0" w:space="0" w:color="000000"/>
@@ -6741,6 +6837,7 @@
           </w:tcPr>
           <w:p>
             <w:pPr>
+              <w:pStyle w:val="Normal"/>
               <w:jc w:val="center"/>
               <w:pBdr>
                 <w:bottom w:val="none" w:sz="0" w:space="0" w:color="000000"/>
@@ -6795,6 +6892,7 @@
           </w:tcPr>
           <w:p>
             <w:pPr>
+              <w:pStyle w:val="Normal"/>
               <w:jc w:val="center"/>
               <w:pBdr>
                 <w:bottom w:val="none" w:sz="0" w:space="0" w:color="000000"/>
@@ -6849,6 +6947,7 @@
           </w:tcPr>
           <w:p>
             <w:pPr>
+              <w:pStyle w:val="Normal"/>
               <w:jc w:val="center"/>
               <w:pBdr>
                 <w:bottom w:val="none" w:sz="0" w:space="0" w:color="000000"/>
@@ -6903,6 +7002,7 @@
           </w:tcPr>
           <w:p>
             <w:pPr>
+              <w:pStyle w:val="Normal"/>
               <w:jc w:val="center"/>
               <w:pBdr>
                 <w:bottom w:val="none" w:sz="0" w:space="0" w:color="000000"/>
@@ -6943,26 +7043,26 @@
         <w:trPr>
           <w:trHeight w:val="270" w:hRule="exact"/>
         </w:trPr>
-        body24
-        <w:tc>
-          <w:tcPr>
-            <w:tcBorders>
-              <w:bottom w:val="none" w:sz="0" w:space="0" w:color="000000"/>
-              <w:top w:val="none" w:sz="0" w:space="0" w:color="000000"/>
-              <w:left w:val="none" w:sz="0" w:space="0" w:color="000000"/>
-              <w:right w:val="none" w:sz="0" w:space="0" w:color="000000"/>
-            </w:tcBorders>
-            <w:shd w:val="clear" w:color="auto" w:fill="FFFFFF"/>
-            <w:tcMar>
-              <w:top w:w="0" w:type="dxa"/>
-              <w:bottom w:w="0" w:type="dxa"/>
-              <w:left w:w="0" w:type="dxa"/>
-              <w:right w:w="0" w:type="dxa"/>
-            </w:tcMar>
-            <w:vAlign w:val="center"/>
-          </w:tcPr>
-          <w:p>
-            <w:pPr>
+        <w:tc>
+          <w:tcPr>
+            <w:tcBorders>
+              <w:bottom w:val="none" w:sz="0" w:space="0" w:color="000000"/>
+              <w:top w:val="none" w:sz="0" w:space="0" w:color="000000"/>
+              <w:left w:val="none" w:sz="0" w:space="0" w:color="000000"/>
+              <w:right w:val="none" w:sz="0" w:space="0" w:color="000000"/>
+            </w:tcBorders>
+            <w:shd w:val="clear" w:color="auto" w:fill="FFFFFF"/>
+            <w:tcMar>
+              <w:top w:w="0" w:type="dxa"/>
+              <w:bottom w:w="0" w:type="dxa"/>
+              <w:left w:w="0" w:type="dxa"/>
+              <w:right w:w="0" w:type="dxa"/>
+            </w:tcMar>
+            <w:vAlign w:val="center"/>
+          </w:tcPr>
+          <w:p>
+            <w:pPr>
+              <w:pStyle w:val="Normal"/>
               <w:jc w:val="left"/>
               <w:pBdr>
                 <w:bottom w:val="none" w:sz="0" w:space="0" w:color="000000"/>
@@ -7017,6 +7117,7 @@
           </w:tcPr>
           <w:p>
             <w:pPr>
+              <w:pStyle w:val="Normal"/>
               <w:jc w:val="center"/>
               <w:pBdr>
                 <w:bottom w:val="none" w:sz="0" w:space="0" w:color="000000"/>
@@ -7071,6 +7172,7 @@
           </w:tcPr>
           <w:p>
             <w:pPr>
+              <w:pStyle w:val="Normal"/>
               <w:jc w:val="center"/>
               <w:pBdr>
                 <w:bottom w:val="none" w:sz="0" w:space="0" w:color="000000"/>
@@ -7125,6 +7227,7 @@
           </w:tcPr>
           <w:p>
             <w:pPr>
+              <w:pStyle w:val="Normal"/>
               <w:jc w:val="center"/>
               <w:pBdr>
                 <w:bottom w:val="none" w:sz="0" w:space="0" w:color="000000"/>
@@ -7179,6 +7282,7 @@
           </w:tcPr>
           <w:p>
             <w:pPr>
+              <w:pStyle w:val="Normal"/>
               <w:jc w:val="center"/>
               <w:pBdr>
                 <w:bottom w:val="none" w:sz="0" w:space="0" w:color="000000"/>
@@ -7233,6 +7337,7 @@
           </w:tcPr>
           <w:p>
             <w:pPr>
+              <w:pStyle w:val="Normal"/>
               <w:jc w:val="center"/>
               <w:pBdr>
                 <w:bottom w:val="none" w:sz="0" w:space="0" w:color="000000"/>
@@ -7273,26 +7378,26 @@
         <w:trPr>
           <w:trHeight w:val="270" w:hRule="exact"/>
         </w:trPr>
-        body25
-        <w:tc>
-          <w:tcPr>
-            <w:tcBorders>
-              <w:bottom w:val="none" w:sz="0" w:space="0" w:color="000000"/>
-              <w:top w:val="none" w:sz="0" w:space="0" w:color="000000"/>
-              <w:left w:val="none" w:sz="0" w:space="0" w:color="000000"/>
-              <w:right w:val="none" w:sz="0" w:space="0" w:color="000000"/>
-            </w:tcBorders>
-            <w:shd w:val="clear" w:color="auto" w:fill="FFFFFF"/>
-            <w:tcMar>
-              <w:top w:w="0" w:type="dxa"/>
-              <w:bottom w:w="0" w:type="dxa"/>
-              <w:left w:w="0" w:type="dxa"/>
-              <w:right w:w="0" w:type="dxa"/>
-            </w:tcMar>
-            <w:vAlign w:val="center"/>
-          </w:tcPr>
-          <w:p>
-            <w:pPr>
+        <w:tc>
+          <w:tcPr>
+            <w:tcBorders>
+              <w:bottom w:val="none" w:sz="0" w:space="0" w:color="000000"/>
+              <w:top w:val="none" w:sz="0" w:space="0" w:color="000000"/>
+              <w:left w:val="none" w:sz="0" w:space="0" w:color="000000"/>
+              <w:right w:val="none" w:sz="0" w:space="0" w:color="000000"/>
+            </w:tcBorders>
+            <w:shd w:val="clear" w:color="auto" w:fill="FFFFFF"/>
+            <w:tcMar>
+              <w:top w:w="0" w:type="dxa"/>
+              <w:bottom w:w="0" w:type="dxa"/>
+              <w:left w:w="0" w:type="dxa"/>
+              <w:right w:w="0" w:type="dxa"/>
+            </w:tcMar>
+            <w:vAlign w:val="center"/>
+          </w:tcPr>
+          <w:p>
+            <w:pPr>
+              <w:pStyle w:val="Normal"/>
               <w:jc w:val="left"/>
               <w:pBdr>
                 <w:bottom w:val="none" w:sz="0" w:space="0" w:color="000000"/>
@@ -7347,6 +7452,7 @@
           </w:tcPr>
           <w:p>
             <w:pPr>
+              <w:pStyle w:val="Normal"/>
               <w:jc w:val="center"/>
               <w:pBdr>
                 <w:bottom w:val="none" w:sz="0" w:space="0" w:color="000000"/>
@@ -7401,6 +7507,7 @@
           </w:tcPr>
           <w:p>
             <w:pPr>
+              <w:pStyle w:val="Normal"/>
               <w:jc w:val="center"/>
               <w:pBdr>
                 <w:bottom w:val="none" w:sz="0" w:space="0" w:color="000000"/>
@@ -7455,6 +7562,7 @@
           </w:tcPr>
           <w:p>
             <w:pPr>
+              <w:pStyle w:val="Normal"/>
               <w:jc w:val="center"/>
               <w:pBdr>
                 <w:bottom w:val="none" w:sz="0" w:space="0" w:color="000000"/>
@@ -7509,6 +7617,7 @@
           </w:tcPr>
           <w:p>
             <w:pPr>
+              <w:pStyle w:val="Normal"/>
               <w:jc w:val="center"/>
               <w:pBdr>
                 <w:bottom w:val="none" w:sz="0" w:space="0" w:color="000000"/>
@@ -7563,6 +7672,7 @@
           </w:tcPr>
           <w:p>
             <w:pPr>
+              <w:pStyle w:val="Normal"/>
               <w:jc w:val="center"/>
               <w:pBdr>
                 <w:bottom w:val="none" w:sz="0" w:space="0" w:color="000000"/>
@@ -7603,26 +7713,26 @@
         <w:trPr>
           <w:trHeight w:val="270" w:hRule="exact"/>
         </w:trPr>
-        body26
-        <w:tc>
-          <w:tcPr>
-            <w:tcBorders>
-              <w:bottom w:val="none" w:sz="0" w:space="0" w:color="000000"/>
-              <w:top w:val="none" w:sz="0" w:space="0" w:color="000000"/>
-              <w:left w:val="none" w:sz="0" w:space="0" w:color="000000"/>
-              <w:right w:val="none" w:sz="0" w:space="0" w:color="000000"/>
-            </w:tcBorders>
-            <w:shd w:val="clear" w:color="auto" w:fill="FFFFFF"/>
-            <w:tcMar>
-              <w:top w:w="0" w:type="dxa"/>
-              <w:bottom w:w="0" w:type="dxa"/>
-              <w:left w:w="0" w:type="dxa"/>
-              <w:right w:w="0" w:type="dxa"/>
-            </w:tcMar>
-            <w:vAlign w:val="center"/>
-          </w:tcPr>
-          <w:p>
-            <w:pPr>
+        <w:tc>
+          <w:tcPr>
+            <w:tcBorders>
+              <w:bottom w:val="none" w:sz="0" w:space="0" w:color="000000"/>
+              <w:top w:val="none" w:sz="0" w:space="0" w:color="000000"/>
+              <w:left w:val="none" w:sz="0" w:space="0" w:color="000000"/>
+              <w:right w:val="none" w:sz="0" w:space="0" w:color="000000"/>
+            </w:tcBorders>
+            <w:shd w:val="clear" w:color="auto" w:fill="FFFFFF"/>
+            <w:tcMar>
+              <w:top w:w="0" w:type="dxa"/>
+              <w:bottom w:w="0" w:type="dxa"/>
+              <w:left w:w="0" w:type="dxa"/>
+              <w:right w:w="0" w:type="dxa"/>
+            </w:tcMar>
+            <w:vAlign w:val="center"/>
+          </w:tcPr>
+          <w:p>
+            <w:pPr>
+              <w:pStyle w:val="Normal"/>
               <w:jc w:val="left"/>
               <w:pBdr>
                 <w:bottom w:val="none" w:sz="0" w:space="0" w:color="000000"/>
@@ -7677,6 +7787,7 @@
           </w:tcPr>
           <w:p>
             <w:pPr>
+              <w:pStyle w:val="Normal"/>
               <w:jc w:val="center"/>
               <w:pBdr>
                 <w:bottom w:val="none" w:sz="0" w:space="0" w:color="000000"/>
@@ -7731,6 +7842,7 @@
           </w:tcPr>
           <w:p>
             <w:pPr>
+              <w:pStyle w:val="Normal"/>
               <w:jc w:val="center"/>
               <w:pBdr>
                 <w:bottom w:val="none" w:sz="0" w:space="0" w:color="000000"/>
@@ -7785,6 +7897,7 @@
           </w:tcPr>
           <w:p>
             <w:pPr>
+              <w:pStyle w:val="Normal"/>
               <w:jc w:val="center"/>
               <w:pBdr>
                 <w:bottom w:val="none" w:sz="0" w:space="0" w:color="000000"/>
@@ -7839,6 +7952,7 @@
           </w:tcPr>
           <w:p>
             <w:pPr>
+              <w:pStyle w:val="Normal"/>
               <w:jc w:val="center"/>
               <w:pBdr>
                 <w:bottom w:val="none" w:sz="0" w:space="0" w:color="000000"/>
@@ -7893,6 +8007,7 @@
           </w:tcPr>
           <w:p>
             <w:pPr>
+              <w:pStyle w:val="Normal"/>
               <w:jc w:val="center"/>
               <w:pBdr>
                 <w:bottom w:val="none" w:sz="0" w:space="0" w:color="000000"/>

</xml_diff>

<commit_message>
v1.6.4: CRAN resubmission 3/23/26
</commit_message>
<xml_diff>
--- a/development/run-vignette/tables/Tern_2_group.docx
+++ b/development/run-vignette/tables/Tern_2_group.docx
@@ -21,6 +21,7 @@
           <w:trHeight w:val="711" w:hRule="auto"/>
           <w:tblHeader/>
         </w:trPr>
+        header 1
         <w:tc>
           <w:tcPr>
             <w:tcBorders>
@@ -40,7 +41,6 @@
           </w:tcPr>
           <w:p>
             <w:pPr>
-              <w:pStyle w:val="Normal"/>
               <w:jc w:val="left"/>
               <w:pBdr>
                 <w:bottom w:val="none" w:sz="0" w:space="0" w:color="000000"/>
@@ -95,7 +95,6 @@
           </w:tcPr>
           <w:p>
             <w:pPr>
-              <w:pStyle w:val="Normal"/>
               <w:jc w:val="center"/>
               <w:pBdr>
                 <w:bottom w:val="none" w:sz="0" w:space="0" w:color="000000"/>
@@ -176,7 +175,6 @@
           </w:tcPr>
           <w:p>
             <w:pPr>
-              <w:pStyle w:val="Normal"/>
               <w:jc w:val="center"/>
               <w:pBdr>
                 <w:bottom w:val="none" w:sz="0" w:space="0" w:color="000000"/>
@@ -257,7 +255,6 @@
           </w:tcPr>
           <w:p>
             <w:pPr>
-              <w:pStyle w:val="Normal"/>
               <w:jc w:val="center"/>
               <w:pBdr>
                 <w:bottom w:val="none" w:sz="0" w:space="0" w:color="000000"/>
@@ -338,7 +335,6 @@
           </w:tcPr>
           <w:p>
             <w:pPr>
-              <w:pStyle w:val="Normal"/>
               <w:jc w:val="center"/>
               <w:pBdr>
                 <w:bottom w:val="none" w:sz="0" w:space="0" w:color="000000"/>
@@ -393,7 +389,6 @@
           </w:tcPr>
           <w:p>
             <w:pPr>
-              <w:pStyle w:val="Normal"/>
               <w:jc w:val="center"/>
               <w:pBdr>
                 <w:bottom w:val="none" w:sz="0" w:space="0" w:color="000000"/>
@@ -434,6 +429,7 @@
         <w:trPr>
           <w:trHeight w:val="369" w:hRule="exact"/>
         </w:trPr>
+        body 1
         <w:tc>
           <w:tcPr>
             <w:gridSpan w:val="6"/>
@@ -454,7 +450,6 @@
           </w:tcPr>
           <w:p>
             <w:pPr>
-              <w:pStyle w:val="Normal"/>
               <w:jc w:val="left"/>
               <w:pBdr>
                 <w:bottom w:val="none" w:sz="0" w:space="0" w:color="000000"/>
@@ -495,6 +490,7 @@
         <w:trPr>
           <w:trHeight w:val="270" w:hRule="exact"/>
         </w:trPr>
+        body 2
         <w:tc>
           <w:tcPr>
             <w:tcBorders>
@@ -514,7 +510,6 @@
           </w:tcPr>
           <w:p>
             <w:pPr>
-              <w:pStyle w:val="Normal"/>
               <w:jc w:val="left"/>
               <w:pBdr>
                 <w:bottom w:val="none" w:sz="0" w:space="0" w:color="000000"/>
@@ -569,7 +564,6 @@
           </w:tcPr>
           <w:p>
             <w:pPr>
-              <w:pStyle w:val="Normal"/>
               <w:jc w:val="center"/>
               <w:pBdr>
                 <w:bottom w:val="none" w:sz="0" w:space="0" w:color="000000"/>
@@ -624,7 +618,6 @@
           </w:tcPr>
           <w:p>
             <w:pPr>
-              <w:pStyle w:val="Normal"/>
               <w:jc w:val="center"/>
               <w:pBdr>
                 <w:bottom w:val="none" w:sz="0" w:space="0" w:color="000000"/>
@@ -679,7 +672,6 @@
           </w:tcPr>
           <w:p>
             <w:pPr>
-              <w:pStyle w:val="Normal"/>
               <w:jc w:val="center"/>
               <w:pBdr>
                 <w:bottom w:val="none" w:sz="0" w:space="0" w:color="000000"/>
@@ -734,7 +726,6 @@
           </w:tcPr>
           <w:p>
             <w:pPr>
-              <w:pStyle w:val="Normal"/>
               <w:jc w:val="center"/>
               <w:pBdr>
                 <w:bottom w:val="none" w:sz="0" w:space="0" w:color="000000"/>
@@ -789,7 +780,6 @@
           </w:tcPr>
           <w:p>
             <w:pPr>
-              <w:pStyle w:val="Normal"/>
               <w:jc w:val="center"/>
               <w:pBdr>
                 <w:bottom w:val="none" w:sz="0" w:space="0" w:color="000000"/>
@@ -830,26 +820,26 @@
         <w:trPr>
           <w:trHeight w:val="270" w:hRule="exact"/>
         </w:trPr>
-        <w:tc>
-          <w:tcPr>
-            <w:tcBorders>
-              <w:bottom w:val="none" w:sz="0" w:space="0" w:color="000000"/>
-              <w:top w:val="none" w:sz="0" w:space="0" w:color="000000"/>
-              <w:left w:val="none" w:sz="0" w:space="0" w:color="000000"/>
-              <w:right w:val="none" w:sz="0" w:space="0" w:color="000000"/>
-            </w:tcBorders>
-            <w:shd w:val="clear" w:color="auto" w:fill="FFFFFF"/>
-            <w:tcMar>
-              <w:top w:w="0" w:type="dxa"/>
-              <w:bottom w:w="0" w:type="dxa"/>
-              <w:left w:w="0" w:type="dxa"/>
-              <w:right w:w="0" w:type="dxa"/>
-            </w:tcMar>
-            <w:vAlign w:val="center"/>
-          </w:tcPr>
-          <w:p>
-            <w:pPr>
-              <w:pStyle w:val="Normal"/>
+        body 3
+        <w:tc>
+          <w:tcPr>
+            <w:tcBorders>
+              <w:bottom w:val="none" w:sz="0" w:space="0" w:color="000000"/>
+              <w:top w:val="none" w:sz="0" w:space="0" w:color="000000"/>
+              <w:left w:val="none" w:sz="0" w:space="0" w:color="000000"/>
+              <w:right w:val="none" w:sz="0" w:space="0" w:color="000000"/>
+            </w:tcBorders>
+            <w:shd w:val="clear" w:color="auto" w:fill="FFFFFF"/>
+            <w:tcMar>
+              <w:top w:w="0" w:type="dxa"/>
+              <w:bottom w:w="0" w:type="dxa"/>
+              <w:left w:w="0" w:type="dxa"/>
+              <w:right w:w="0" w:type="dxa"/>
+            </w:tcMar>
+            <w:vAlign w:val="center"/>
+          </w:tcPr>
+          <w:p>
+            <w:pPr>
               <w:jc w:val="left"/>
               <w:pBdr>
                 <w:bottom w:val="none" w:sz="0" w:space="0" w:color="000000"/>
@@ -904,7 +894,6 @@
           </w:tcPr>
           <w:p>
             <w:pPr>
-              <w:pStyle w:val="Normal"/>
               <w:jc w:val="center"/>
               <w:pBdr>
                 <w:bottom w:val="none" w:sz="0" w:space="0" w:color="000000"/>
@@ -959,7 +948,6 @@
           </w:tcPr>
           <w:p>
             <w:pPr>
-              <w:pStyle w:val="Normal"/>
               <w:jc w:val="center"/>
               <w:pBdr>
                 <w:bottom w:val="none" w:sz="0" w:space="0" w:color="000000"/>
@@ -1014,7 +1002,6 @@
           </w:tcPr>
           <w:p>
             <w:pPr>
-              <w:pStyle w:val="Normal"/>
               <w:jc w:val="center"/>
               <w:pBdr>
                 <w:bottom w:val="none" w:sz="0" w:space="0" w:color="000000"/>
@@ -1069,7 +1056,6 @@
           </w:tcPr>
           <w:p>
             <w:pPr>
-              <w:pStyle w:val="Normal"/>
               <w:jc w:val="center"/>
               <w:pBdr>
                 <w:bottom w:val="none" w:sz="0" w:space="0" w:color="000000"/>
@@ -1124,7 +1110,6 @@
           </w:tcPr>
           <w:p>
             <w:pPr>
-              <w:pStyle w:val="Normal"/>
               <w:jc w:val="center"/>
               <w:pBdr>
                 <w:bottom w:val="none" w:sz="0" w:space="0" w:color="000000"/>
@@ -1165,26 +1150,26 @@
         <w:trPr>
           <w:trHeight w:val="270" w:hRule="exact"/>
         </w:trPr>
-        <w:tc>
-          <w:tcPr>
-            <w:tcBorders>
-              <w:bottom w:val="none" w:sz="0" w:space="0" w:color="000000"/>
-              <w:top w:val="none" w:sz="0" w:space="0" w:color="000000"/>
-              <w:left w:val="none" w:sz="0" w:space="0" w:color="000000"/>
-              <w:right w:val="none" w:sz="0" w:space="0" w:color="000000"/>
-            </w:tcBorders>
-            <w:shd w:val="clear" w:color="auto" w:fill="FFFFFF"/>
-            <w:tcMar>
-              <w:top w:w="0" w:type="dxa"/>
-              <w:bottom w:w="0" w:type="dxa"/>
-              <w:left w:w="0" w:type="dxa"/>
-              <w:right w:w="0" w:type="dxa"/>
-            </w:tcMar>
-            <w:vAlign w:val="center"/>
-          </w:tcPr>
-          <w:p>
-            <w:pPr>
-              <w:pStyle w:val="Normal"/>
+        body 4
+        <w:tc>
+          <w:tcPr>
+            <w:tcBorders>
+              <w:bottom w:val="none" w:sz="0" w:space="0" w:color="000000"/>
+              <w:top w:val="none" w:sz="0" w:space="0" w:color="000000"/>
+              <w:left w:val="none" w:sz="0" w:space="0" w:color="000000"/>
+              <w:right w:val="none" w:sz="0" w:space="0" w:color="000000"/>
+            </w:tcBorders>
+            <w:shd w:val="clear" w:color="auto" w:fill="FFFFFF"/>
+            <w:tcMar>
+              <w:top w:w="0" w:type="dxa"/>
+              <w:bottom w:w="0" w:type="dxa"/>
+              <w:left w:w="0" w:type="dxa"/>
+              <w:right w:w="0" w:type="dxa"/>
+            </w:tcMar>
+            <w:vAlign w:val="center"/>
+          </w:tcPr>
+          <w:p>
+            <w:pPr>
               <w:jc w:val="left"/>
               <w:pBdr>
                 <w:bottom w:val="none" w:sz="0" w:space="0" w:color="000000"/>
@@ -1239,7 +1224,6 @@
           </w:tcPr>
           <w:p>
             <w:pPr>
-              <w:pStyle w:val="Normal"/>
               <w:jc w:val="center"/>
               <w:pBdr>
                 <w:bottom w:val="none" w:sz="0" w:space="0" w:color="000000"/>
@@ -1294,7 +1278,6 @@
           </w:tcPr>
           <w:p>
             <w:pPr>
-              <w:pStyle w:val="Normal"/>
               <w:jc w:val="center"/>
               <w:pBdr>
                 <w:bottom w:val="none" w:sz="0" w:space="0" w:color="000000"/>
@@ -1349,7 +1332,6 @@
           </w:tcPr>
           <w:p>
             <w:pPr>
-              <w:pStyle w:val="Normal"/>
               <w:jc w:val="center"/>
               <w:pBdr>
                 <w:bottom w:val="none" w:sz="0" w:space="0" w:color="000000"/>
@@ -1404,7 +1386,6 @@
           </w:tcPr>
           <w:p>
             <w:pPr>
-              <w:pStyle w:val="Normal"/>
               <w:jc w:val="center"/>
               <w:pBdr>
                 <w:bottom w:val="none" w:sz="0" w:space="0" w:color="000000"/>
@@ -1459,7 +1440,6 @@
           </w:tcPr>
           <w:p>
             <w:pPr>
-              <w:pStyle w:val="Normal"/>
               <w:jc w:val="center"/>
               <w:pBdr>
                 <w:bottom w:val="none" w:sz="0" w:space="0" w:color="000000"/>
@@ -1500,26 +1480,26 @@
         <w:trPr>
           <w:trHeight w:val="270" w:hRule="exact"/>
         </w:trPr>
-        <w:tc>
-          <w:tcPr>
-            <w:tcBorders>
-              <w:bottom w:val="none" w:sz="0" w:space="0" w:color="000000"/>
-              <w:top w:val="none" w:sz="0" w:space="0" w:color="000000"/>
-              <w:left w:val="none" w:sz="0" w:space="0" w:color="000000"/>
-              <w:right w:val="none" w:sz="0" w:space="0" w:color="000000"/>
-            </w:tcBorders>
-            <w:shd w:val="clear" w:color="auto" w:fill="FFFFFF"/>
-            <w:tcMar>
-              <w:top w:w="0" w:type="dxa"/>
-              <w:bottom w:w="0" w:type="dxa"/>
-              <w:left w:w="0" w:type="dxa"/>
-              <w:right w:w="0" w:type="dxa"/>
-            </w:tcMar>
-            <w:vAlign w:val="center"/>
-          </w:tcPr>
-          <w:p>
-            <w:pPr>
-              <w:pStyle w:val="Normal"/>
+        body 5
+        <w:tc>
+          <w:tcPr>
+            <w:tcBorders>
+              <w:bottom w:val="none" w:sz="0" w:space="0" w:color="000000"/>
+              <w:top w:val="none" w:sz="0" w:space="0" w:color="000000"/>
+              <w:left w:val="none" w:sz="0" w:space="0" w:color="000000"/>
+              <w:right w:val="none" w:sz="0" w:space="0" w:color="000000"/>
+            </w:tcBorders>
+            <w:shd w:val="clear" w:color="auto" w:fill="FFFFFF"/>
+            <w:tcMar>
+              <w:top w:w="0" w:type="dxa"/>
+              <w:bottom w:w="0" w:type="dxa"/>
+              <w:left w:w="0" w:type="dxa"/>
+              <w:right w:w="0" w:type="dxa"/>
+            </w:tcMar>
+            <w:vAlign w:val="center"/>
+          </w:tcPr>
+          <w:p>
+            <w:pPr>
               <w:jc w:val="left"/>
               <w:pBdr>
                 <w:bottom w:val="none" w:sz="0" w:space="0" w:color="000000"/>
@@ -1574,7 +1554,6 @@
           </w:tcPr>
           <w:p>
             <w:pPr>
-              <w:pStyle w:val="Normal"/>
               <w:jc w:val="center"/>
               <w:pBdr>
                 <w:bottom w:val="none" w:sz="0" w:space="0" w:color="000000"/>
@@ -1629,7 +1608,6 @@
           </w:tcPr>
           <w:p>
             <w:pPr>
-              <w:pStyle w:val="Normal"/>
               <w:jc w:val="center"/>
               <w:pBdr>
                 <w:bottom w:val="none" w:sz="0" w:space="0" w:color="000000"/>
@@ -1684,7 +1662,6 @@
           </w:tcPr>
           <w:p>
             <w:pPr>
-              <w:pStyle w:val="Normal"/>
               <w:jc w:val="center"/>
               <w:pBdr>
                 <w:bottom w:val="none" w:sz="0" w:space="0" w:color="000000"/>
@@ -1739,7 +1716,6 @@
           </w:tcPr>
           <w:p>
             <w:pPr>
-              <w:pStyle w:val="Normal"/>
               <w:jc w:val="center"/>
               <w:pBdr>
                 <w:bottom w:val="none" w:sz="0" w:space="0" w:color="000000"/>
@@ -1794,7 +1770,6 @@
           </w:tcPr>
           <w:p>
             <w:pPr>
-              <w:pStyle w:val="Normal"/>
               <w:jc w:val="center"/>
               <w:pBdr>
                 <w:bottom w:val="none" w:sz="0" w:space="0" w:color="000000"/>
@@ -1835,26 +1810,26 @@
         <w:trPr>
           <w:trHeight w:val="270" w:hRule="exact"/>
         </w:trPr>
-        <w:tc>
-          <w:tcPr>
-            <w:tcBorders>
-              <w:bottom w:val="none" w:sz="0" w:space="0" w:color="000000"/>
-              <w:top w:val="none" w:sz="0" w:space="0" w:color="000000"/>
-              <w:left w:val="none" w:sz="0" w:space="0" w:color="000000"/>
-              <w:right w:val="none" w:sz="0" w:space="0" w:color="000000"/>
-            </w:tcBorders>
-            <w:shd w:val="clear" w:color="auto" w:fill="FFFFFF"/>
-            <w:tcMar>
-              <w:top w:w="0" w:type="dxa"/>
-              <w:bottom w:w="0" w:type="dxa"/>
-              <w:left w:w="0" w:type="dxa"/>
-              <w:right w:w="0" w:type="dxa"/>
-            </w:tcMar>
-            <w:vAlign w:val="center"/>
-          </w:tcPr>
-          <w:p>
-            <w:pPr>
-              <w:pStyle w:val="Normal"/>
+        body 6
+        <w:tc>
+          <w:tcPr>
+            <w:tcBorders>
+              <w:bottom w:val="none" w:sz="0" w:space="0" w:color="000000"/>
+              <w:top w:val="none" w:sz="0" w:space="0" w:color="000000"/>
+              <w:left w:val="none" w:sz="0" w:space="0" w:color="000000"/>
+              <w:right w:val="none" w:sz="0" w:space="0" w:color="000000"/>
+            </w:tcBorders>
+            <w:shd w:val="clear" w:color="auto" w:fill="FFFFFF"/>
+            <w:tcMar>
+              <w:top w:w="0" w:type="dxa"/>
+              <w:bottom w:w="0" w:type="dxa"/>
+              <w:left w:w="0" w:type="dxa"/>
+              <w:right w:w="0" w:type="dxa"/>
+            </w:tcMar>
+            <w:vAlign w:val="center"/>
+          </w:tcPr>
+          <w:p>
+            <w:pPr>
               <w:jc w:val="left"/>
               <w:pBdr>
                 <w:bottom w:val="none" w:sz="0" w:space="0" w:color="000000"/>
@@ -1909,7 +1884,6 @@
           </w:tcPr>
           <w:p>
             <w:pPr>
-              <w:pStyle w:val="Normal"/>
               <w:jc w:val="center"/>
               <w:pBdr>
                 <w:bottom w:val="none" w:sz="0" w:space="0" w:color="000000"/>
@@ -1964,7 +1938,6 @@
           </w:tcPr>
           <w:p>
             <w:pPr>
-              <w:pStyle w:val="Normal"/>
               <w:jc w:val="center"/>
               <w:pBdr>
                 <w:bottom w:val="none" w:sz="0" w:space="0" w:color="000000"/>
@@ -2019,7 +1992,6 @@
           </w:tcPr>
           <w:p>
             <w:pPr>
-              <w:pStyle w:val="Normal"/>
               <w:jc w:val="center"/>
               <w:pBdr>
                 <w:bottom w:val="none" w:sz="0" w:space="0" w:color="000000"/>
@@ -2074,7 +2046,6 @@
           </w:tcPr>
           <w:p>
             <w:pPr>
-              <w:pStyle w:val="Normal"/>
               <w:jc w:val="center"/>
               <w:pBdr>
                 <w:bottom w:val="none" w:sz="0" w:space="0" w:color="000000"/>
@@ -2129,7 +2100,6 @@
           </w:tcPr>
           <w:p>
             <w:pPr>
-              <w:pStyle w:val="Normal"/>
               <w:jc w:val="center"/>
               <w:pBdr>
                 <w:bottom w:val="none" w:sz="0" w:space="0" w:color="000000"/>
@@ -2170,26 +2140,26 @@
         <w:trPr>
           <w:trHeight w:val="270" w:hRule="exact"/>
         </w:trPr>
-        <w:tc>
-          <w:tcPr>
-            <w:tcBorders>
-              <w:bottom w:val="none" w:sz="0" w:space="0" w:color="000000"/>
-              <w:top w:val="none" w:sz="0" w:space="0" w:color="000000"/>
-              <w:left w:val="none" w:sz="0" w:space="0" w:color="000000"/>
-              <w:right w:val="none" w:sz="0" w:space="0" w:color="000000"/>
-            </w:tcBorders>
-            <w:shd w:val="clear" w:color="auto" w:fill="FFFFFF"/>
-            <w:tcMar>
-              <w:top w:w="0" w:type="dxa"/>
-              <w:bottom w:w="0" w:type="dxa"/>
-              <w:left w:w="0" w:type="dxa"/>
-              <w:right w:w="0" w:type="dxa"/>
-            </w:tcMar>
-            <w:vAlign w:val="center"/>
-          </w:tcPr>
-          <w:p>
-            <w:pPr>
-              <w:pStyle w:val="Normal"/>
+        body 7
+        <w:tc>
+          <w:tcPr>
+            <w:tcBorders>
+              <w:bottom w:val="none" w:sz="0" w:space="0" w:color="000000"/>
+              <w:top w:val="none" w:sz="0" w:space="0" w:color="000000"/>
+              <w:left w:val="none" w:sz="0" w:space="0" w:color="000000"/>
+              <w:right w:val="none" w:sz="0" w:space="0" w:color="000000"/>
+            </w:tcBorders>
+            <w:shd w:val="clear" w:color="auto" w:fill="FFFFFF"/>
+            <w:tcMar>
+              <w:top w:w="0" w:type="dxa"/>
+              <w:bottom w:w="0" w:type="dxa"/>
+              <w:left w:w="0" w:type="dxa"/>
+              <w:right w:w="0" w:type="dxa"/>
+            </w:tcMar>
+            <w:vAlign w:val="center"/>
+          </w:tcPr>
+          <w:p>
+            <w:pPr>
               <w:jc w:val="left"/>
               <w:pBdr>
                 <w:bottom w:val="none" w:sz="0" w:space="0" w:color="000000"/>
@@ -2244,7 +2214,6 @@
           </w:tcPr>
           <w:p>
             <w:pPr>
-              <w:pStyle w:val="Normal"/>
               <w:jc w:val="center"/>
               <w:pBdr>
                 <w:bottom w:val="none" w:sz="0" w:space="0" w:color="000000"/>
@@ -2299,7 +2268,6 @@
           </w:tcPr>
           <w:p>
             <w:pPr>
-              <w:pStyle w:val="Normal"/>
               <w:jc w:val="center"/>
               <w:pBdr>
                 <w:bottom w:val="none" w:sz="0" w:space="0" w:color="000000"/>
@@ -2354,7 +2322,6 @@
           </w:tcPr>
           <w:p>
             <w:pPr>
-              <w:pStyle w:val="Normal"/>
               <w:jc w:val="center"/>
               <w:pBdr>
                 <w:bottom w:val="none" w:sz="0" w:space="0" w:color="000000"/>
@@ -2409,7 +2376,6 @@
           </w:tcPr>
           <w:p>
             <w:pPr>
-              <w:pStyle w:val="Normal"/>
               <w:jc w:val="center"/>
               <w:pBdr>
                 <w:bottom w:val="none" w:sz="0" w:space="0" w:color="000000"/>
@@ -2464,7 +2430,6 @@
           </w:tcPr>
           <w:p>
             <w:pPr>
-              <w:pStyle w:val="Normal"/>
               <w:jc w:val="center"/>
               <w:pBdr>
                 <w:bottom w:val="none" w:sz="0" w:space="0" w:color="000000"/>
@@ -2505,26 +2470,26 @@
         <w:trPr>
           <w:trHeight w:val="270" w:hRule="exact"/>
         </w:trPr>
-        <w:tc>
-          <w:tcPr>
-            <w:tcBorders>
-              <w:bottom w:val="none" w:sz="0" w:space="0" w:color="000000"/>
-              <w:top w:val="none" w:sz="0" w:space="0" w:color="000000"/>
-              <w:left w:val="none" w:sz="0" w:space="0" w:color="000000"/>
-              <w:right w:val="none" w:sz="0" w:space="0" w:color="000000"/>
-            </w:tcBorders>
-            <w:shd w:val="clear" w:color="auto" w:fill="FFFFFF"/>
-            <w:tcMar>
-              <w:top w:w="0" w:type="dxa"/>
-              <w:bottom w:w="0" w:type="dxa"/>
-              <w:left w:w="0" w:type="dxa"/>
-              <w:right w:w="0" w:type="dxa"/>
-            </w:tcMar>
-            <w:vAlign w:val="center"/>
-          </w:tcPr>
-          <w:p>
-            <w:pPr>
-              <w:pStyle w:val="Normal"/>
+        body 8
+        <w:tc>
+          <w:tcPr>
+            <w:tcBorders>
+              <w:bottom w:val="none" w:sz="0" w:space="0" w:color="000000"/>
+              <w:top w:val="none" w:sz="0" w:space="0" w:color="000000"/>
+              <w:left w:val="none" w:sz="0" w:space="0" w:color="000000"/>
+              <w:right w:val="none" w:sz="0" w:space="0" w:color="000000"/>
+            </w:tcBorders>
+            <w:shd w:val="clear" w:color="auto" w:fill="FFFFFF"/>
+            <w:tcMar>
+              <w:top w:w="0" w:type="dxa"/>
+              <w:bottom w:w="0" w:type="dxa"/>
+              <w:left w:w="0" w:type="dxa"/>
+              <w:right w:w="0" w:type="dxa"/>
+            </w:tcMar>
+            <w:vAlign w:val="center"/>
+          </w:tcPr>
+          <w:p>
+            <w:pPr>
               <w:jc w:val="left"/>
               <w:pBdr>
                 <w:bottom w:val="none" w:sz="0" w:space="0" w:color="000000"/>
@@ -2579,7 +2544,6 @@
           </w:tcPr>
           <w:p>
             <w:pPr>
-              <w:pStyle w:val="Normal"/>
               <w:jc w:val="center"/>
               <w:pBdr>
                 <w:bottom w:val="none" w:sz="0" w:space="0" w:color="000000"/>
@@ -2634,7 +2598,6 @@
           </w:tcPr>
           <w:p>
             <w:pPr>
-              <w:pStyle w:val="Normal"/>
               <w:jc w:val="center"/>
               <w:pBdr>
                 <w:bottom w:val="none" w:sz="0" w:space="0" w:color="000000"/>
@@ -2689,7 +2652,6 @@
           </w:tcPr>
           <w:p>
             <w:pPr>
-              <w:pStyle w:val="Normal"/>
               <w:jc w:val="center"/>
               <w:pBdr>
                 <w:bottom w:val="none" w:sz="0" w:space="0" w:color="000000"/>
@@ -2744,7 +2706,6 @@
           </w:tcPr>
           <w:p>
             <w:pPr>
-              <w:pStyle w:val="Normal"/>
               <w:jc w:val="center"/>
               <w:pBdr>
                 <w:bottom w:val="none" w:sz="0" w:space="0" w:color="000000"/>
@@ -2799,7 +2760,6 @@
           </w:tcPr>
           <w:p>
             <w:pPr>
-              <w:pStyle w:val="Normal"/>
               <w:jc w:val="center"/>
               <w:pBdr>
                 <w:bottom w:val="none" w:sz="0" w:space="0" w:color="000000"/>
@@ -2840,26 +2800,26 @@
         <w:trPr>
           <w:trHeight w:val="270" w:hRule="exact"/>
         </w:trPr>
-        <w:tc>
-          <w:tcPr>
-            <w:tcBorders>
-              <w:bottom w:val="none" w:sz="0" w:space="0" w:color="000000"/>
-              <w:top w:val="none" w:sz="0" w:space="0" w:color="000000"/>
-              <w:left w:val="none" w:sz="0" w:space="0" w:color="000000"/>
-              <w:right w:val="none" w:sz="0" w:space="0" w:color="000000"/>
-            </w:tcBorders>
-            <w:shd w:val="clear" w:color="auto" w:fill="FFFFFF"/>
-            <w:tcMar>
-              <w:top w:w="0" w:type="dxa"/>
-              <w:bottom w:w="0" w:type="dxa"/>
-              <w:left w:w="0" w:type="dxa"/>
-              <w:right w:w="0" w:type="dxa"/>
-            </w:tcMar>
-            <w:vAlign w:val="center"/>
-          </w:tcPr>
-          <w:p>
-            <w:pPr>
-              <w:pStyle w:val="Normal"/>
+        body 9
+        <w:tc>
+          <w:tcPr>
+            <w:tcBorders>
+              <w:bottom w:val="none" w:sz="0" w:space="0" w:color="000000"/>
+              <w:top w:val="none" w:sz="0" w:space="0" w:color="000000"/>
+              <w:left w:val="none" w:sz="0" w:space="0" w:color="000000"/>
+              <w:right w:val="none" w:sz="0" w:space="0" w:color="000000"/>
+            </w:tcBorders>
+            <w:shd w:val="clear" w:color="auto" w:fill="FFFFFF"/>
+            <w:tcMar>
+              <w:top w:w="0" w:type="dxa"/>
+              <w:bottom w:w="0" w:type="dxa"/>
+              <w:left w:w="0" w:type="dxa"/>
+              <w:right w:w="0" w:type="dxa"/>
+            </w:tcMar>
+            <w:vAlign w:val="center"/>
+          </w:tcPr>
+          <w:p>
+            <w:pPr>
               <w:jc w:val="left"/>
               <w:pBdr>
                 <w:bottom w:val="none" w:sz="0" w:space="0" w:color="000000"/>
@@ -2914,7 +2874,6 @@
           </w:tcPr>
           <w:p>
             <w:pPr>
-              <w:pStyle w:val="Normal"/>
               <w:jc w:val="center"/>
               <w:pBdr>
                 <w:bottom w:val="none" w:sz="0" w:space="0" w:color="000000"/>
@@ -2969,7 +2928,6 @@
           </w:tcPr>
           <w:p>
             <w:pPr>
-              <w:pStyle w:val="Normal"/>
               <w:jc w:val="center"/>
               <w:pBdr>
                 <w:bottom w:val="none" w:sz="0" w:space="0" w:color="000000"/>
@@ -3024,7 +2982,6 @@
           </w:tcPr>
           <w:p>
             <w:pPr>
-              <w:pStyle w:val="Normal"/>
               <w:jc w:val="center"/>
               <w:pBdr>
                 <w:bottom w:val="none" w:sz="0" w:space="0" w:color="000000"/>
@@ -3079,7 +3036,6 @@
           </w:tcPr>
           <w:p>
             <w:pPr>
-              <w:pStyle w:val="Normal"/>
               <w:jc w:val="center"/>
               <w:pBdr>
                 <w:bottom w:val="none" w:sz="0" w:space="0" w:color="000000"/>
@@ -3134,7 +3090,6 @@
           </w:tcPr>
           <w:p>
             <w:pPr>
-              <w:pStyle w:val="Normal"/>
               <w:jc w:val="center"/>
               <w:pBdr>
                 <w:bottom w:val="none" w:sz="0" w:space="0" w:color="000000"/>
@@ -3175,26 +3130,26 @@
         <w:trPr>
           <w:trHeight w:val="270" w:hRule="exact"/>
         </w:trPr>
-        <w:tc>
-          <w:tcPr>
-            <w:tcBorders>
-              <w:bottom w:val="none" w:sz="0" w:space="0" w:color="000000"/>
-              <w:top w:val="none" w:sz="0" w:space="0" w:color="000000"/>
-              <w:left w:val="none" w:sz="0" w:space="0" w:color="000000"/>
-              <w:right w:val="none" w:sz="0" w:space="0" w:color="000000"/>
-            </w:tcBorders>
-            <w:shd w:val="clear" w:color="auto" w:fill="FFFFFF"/>
-            <w:tcMar>
-              <w:top w:w="0" w:type="dxa"/>
-              <w:bottom w:w="0" w:type="dxa"/>
-              <w:left w:w="0" w:type="dxa"/>
-              <w:right w:w="0" w:type="dxa"/>
-            </w:tcMar>
-            <w:vAlign w:val="center"/>
-          </w:tcPr>
-          <w:p>
-            <w:pPr>
-              <w:pStyle w:val="Normal"/>
+        body10
+        <w:tc>
+          <w:tcPr>
+            <w:tcBorders>
+              <w:bottom w:val="none" w:sz="0" w:space="0" w:color="000000"/>
+              <w:top w:val="none" w:sz="0" w:space="0" w:color="000000"/>
+              <w:left w:val="none" w:sz="0" w:space="0" w:color="000000"/>
+              <w:right w:val="none" w:sz="0" w:space="0" w:color="000000"/>
+            </w:tcBorders>
+            <w:shd w:val="clear" w:color="auto" w:fill="FFFFFF"/>
+            <w:tcMar>
+              <w:top w:w="0" w:type="dxa"/>
+              <w:bottom w:w="0" w:type="dxa"/>
+              <w:left w:w="0" w:type="dxa"/>
+              <w:right w:w="0" w:type="dxa"/>
+            </w:tcMar>
+            <w:vAlign w:val="center"/>
+          </w:tcPr>
+          <w:p>
+            <w:pPr>
               <w:jc w:val="left"/>
               <w:pBdr>
                 <w:bottom w:val="none" w:sz="0" w:space="0" w:color="000000"/>
@@ -3249,7 +3204,6 @@
           </w:tcPr>
           <w:p>
             <w:pPr>
-              <w:pStyle w:val="Normal"/>
               <w:jc w:val="center"/>
               <w:pBdr>
                 <w:bottom w:val="none" w:sz="0" w:space="0" w:color="000000"/>
@@ -3304,7 +3258,6 @@
           </w:tcPr>
           <w:p>
             <w:pPr>
-              <w:pStyle w:val="Normal"/>
               <w:jc w:val="center"/>
               <w:pBdr>
                 <w:bottom w:val="none" w:sz="0" w:space="0" w:color="000000"/>
@@ -3359,7 +3312,6 @@
           </w:tcPr>
           <w:p>
             <w:pPr>
-              <w:pStyle w:val="Normal"/>
               <w:jc w:val="center"/>
               <w:pBdr>
                 <w:bottom w:val="none" w:sz="0" w:space="0" w:color="000000"/>
@@ -3414,7 +3366,6 @@
           </w:tcPr>
           <w:p>
             <w:pPr>
-              <w:pStyle w:val="Normal"/>
               <w:jc w:val="center"/>
               <w:pBdr>
                 <w:bottom w:val="none" w:sz="0" w:space="0" w:color="000000"/>
@@ -3469,7 +3420,6 @@
           </w:tcPr>
           <w:p>
             <w:pPr>
-              <w:pStyle w:val="Normal"/>
               <w:jc w:val="center"/>
               <w:pBdr>
                 <w:bottom w:val="none" w:sz="0" w:space="0" w:color="000000"/>
@@ -3510,26 +3460,26 @@
         <w:trPr>
           <w:trHeight w:val="270" w:hRule="exact"/>
         </w:trPr>
-        <w:tc>
-          <w:tcPr>
-            <w:tcBorders>
-              <w:bottom w:val="none" w:sz="0" w:space="0" w:color="000000"/>
-              <w:top w:val="none" w:sz="0" w:space="0" w:color="000000"/>
-              <w:left w:val="none" w:sz="0" w:space="0" w:color="000000"/>
-              <w:right w:val="none" w:sz="0" w:space="0" w:color="000000"/>
-            </w:tcBorders>
-            <w:shd w:val="clear" w:color="auto" w:fill="FFFFFF"/>
-            <w:tcMar>
-              <w:top w:w="0" w:type="dxa"/>
-              <w:bottom w:w="0" w:type="dxa"/>
-              <w:left w:w="0" w:type="dxa"/>
-              <w:right w:w="0" w:type="dxa"/>
-            </w:tcMar>
-            <w:vAlign w:val="center"/>
-          </w:tcPr>
-          <w:p>
-            <w:pPr>
-              <w:pStyle w:val="Normal"/>
+        body11
+        <w:tc>
+          <w:tcPr>
+            <w:tcBorders>
+              <w:bottom w:val="none" w:sz="0" w:space="0" w:color="000000"/>
+              <w:top w:val="none" w:sz="0" w:space="0" w:color="000000"/>
+              <w:left w:val="none" w:sz="0" w:space="0" w:color="000000"/>
+              <w:right w:val="none" w:sz="0" w:space="0" w:color="000000"/>
+            </w:tcBorders>
+            <w:shd w:val="clear" w:color="auto" w:fill="FFFFFF"/>
+            <w:tcMar>
+              <w:top w:w="0" w:type="dxa"/>
+              <w:bottom w:w="0" w:type="dxa"/>
+              <w:left w:w="0" w:type="dxa"/>
+              <w:right w:w="0" w:type="dxa"/>
+            </w:tcMar>
+            <w:vAlign w:val="center"/>
+          </w:tcPr>
+          <w:p>
+            <w:pPr>
               <w:jc w:val="left"/>
               <w:pBdr>
                 <w:bottom w:val="none" w:sz="0" w:space="0" w:color="000000"/>
@@ -3584,7 +3534,6 @@
           </w:tcPr>
           <w:p>
             <w:pPr>
-              <w:pStyle w:val="Normal"/>
               <w:jc w:val="center"/>
               <w:pBdr>
                 <w:bottom w:val="none" w:sz="0" w:space="0" w:color="000000"/>
@@ -3639,7 +3588,6 @@
           </w:tcPr>
           <w:p>
             <w:pPr>
-              <w:pStyle w:val="Normal"/>
               <w:jc w:val="center"/>
               <w:pBdr>
                 <w:bottom w:val="none" w:sz="0" w:space="0" w:color="000000"/>
@@ -3694,7 +3642,6 @@
           </w:tcPr>
           <w:p>
             <w:pPr>
-              <w:pStyle w:val="Normal"/>
               <w:jc w:val="center"/>
               <w:pBdr>
                 <w:bottom w:val="none" w:sz="0" w:space="0" w:color="000000"/>
@@ -3749,7 +3696,6 @@
           </w:tcPr>
           <w:p>
             <w:pPr>
-              <w:pStyle w:val="Normal"/>
               <w:jc w:val="center"/>
               <w:pBdr>
                 <w:bottom w:val="none" w:sz="0" w:space="0" w:color="000000"/>
@@ -3804,7 +3750,6 @@
           </w:tcPr>
           <w:p>
             <w:pPr>
-              <w:pStyle w:val="Normal"/>
               <w:jc w:val="center"/>
               <w:pBdr>
                 <w:bottom w:val="none" w:sz="0" w:space="0" w:color="000000"/>
@@ -3845,26 +3790,26 @@
         <w:trPr>
           <w:trHeight w:val="270" w:hRule="exact"/>
         </w:trPr>
-        <w:tc>
-          <w:tcPr>
-            <w:tcBorders>
-              <w:bottom w:val="none" w:sz="0" w:space="0" w:color="000000"/>
-              <w:top w:val="none" w:sz="0" w:space="0" w:color="000000"/>
-              <w:left w:val="none" w:sz="0" w:space="0" w:color="000000"/>
-              <w:right w:val="none" w:sz="0" w:space="0" w:color="000000"/>
-            </w:tcBorders>
-            <w:shd w:val="clear" w:color="auto" w:fill="FFFFFF"/>
-            <w:tcMar>
-              <w:top w:w="0" w:type="dxa"/>
-              <w:bottom w:w="0" w:type="dxa"/>
-              <w:left w:w="0" w:type="dxa"/>
-              <w:right w:w="0" w:type="dxa"/>
-            </w:tcMar>
-            <w:vAlign w:val="center"/>
-          </w:tcPr>
-          <w:p>
-            <w:pPr>
-              <w:pStyle w:val="Normal"/>
+        body12
+        <w:tc>
+          <w:tcPr>
+            <w:tcBorders>
+              <w:bottom w:val="none" w:sz="0" w:space="0" w:color="000000"/>
+              <w:top w:val="none" w:sz="0" w:space="0" w:color="000000"/>
+              <w:left w:val="none" w:sz="0" w:space="0" w:color="000000"/>
+              <w:right w:val="none" w:sz="0" w:space="0" w:color="000000"/>
+            </w:tcBorders>
+            <w:shd w:val="clear" w:color="auto" w:fill="FFFFFF"/>
+            <w:tcMar>
+              <w:top w:w="0" w:type="dxa"/>
+              <w:bottom w:w="0" w:type="dxa"/>
+              <w:left w:w="0" w:type="dxa"/>
+              <w:right w:w="0" w:type="dxa"/>
+            </w:tcMar>
+            <w:vAlign w:val="center"/>
+          </w:tcPr>
+          <w:p>
+            <w:pPr>
               <w:jc w:val="left"/>
               <w:pBdr>
                 <w:bottom w:val="none" w:sz="0" w:space="0" w:color="000000"/>
@@ -3919,7 +3864,6 @@
           </w:tcPr>
           <w:p>
             <w:pPr>
-              <w:pStyle w:val="Normal"/>
               <w:jc w:val="center"/>
               <w:pBdr>
                 <w:bottom w:val="none" w:sz="0" w:space="0" w:color="000000"/>
@@ -3974,7 +3918,6 @@
           </w:tcPr>
           <w:p>
             <w:pPr>
-              <w:pStyle w:val="Normal"/>
               <w:jc w:val="center"/>
               <w:pBdr>
                 <w:bottom w:val="none" w:sz="0" w:space="0" w:color="000000"/>
@@ -4029,7 +3972,6 @@
           </w:tcPr>
           <w:p>
             <w:pPr>
-              <w:pStyle w:val="Normal"/>
               <w:jc w:val="center"/>
               <w:pBdr>
                 <w:bottom w:val="none" w:sz="0" w:space="0" w:color="000000"/>
@@ -4084,7 +4026,6 @@
           </w:tcPr>
           <w:p>
             <w:pPr>
-              <w:pStyle w:val="Normal"/>
               <w:jc w:val="center"/>
               <w:pBdr>
                 <w:bottom w:val="none" w:sz="0" w:space="0" w:color="000000"/>
@@ -4139,7 +4080,6 @@
           </w:tcPr>
           <w:p>
             <w:pPr>
-              <w:pStyle w:val="Normal"/>
               <w:jc w:val="center"/>
               <w:pBdr>
                 <w:bottom w:val="none" w:sz="0" w:space="0" w:color="000000"/>
@@ -4180,26 +4120,26 @@
         <w:trPr>
           <w:trHeight w:val="270" w:hRule="exact"/>
         </w:trPr>
-        <w:tc>
-          <w:tcPr>
-            <w:tcBorders>
-              <w:bottom w:val="none" w:sz="0" w:space="0" w:color="000000"/>
-              <w:top w:val="none" w:sz="0" w:space="0" w:color="000000"/>
-              <w:left w:val="none" w:sz="0" w:space="0" w:color="000000"/>
-              <w:right w:val="none" w:sz="0" w:space="0" w:color="000000"/>
-            </w:tcBorders>
-            <w:shd w:val="clear" w:color="auto" w:fill="FFFFFF"/>
-            <w:tcMar>
-              <w:top w:w="0" w:type="dxa"/>
-              <w:bottom w:w="0" w:type="dxa"/>
-              <w:left w:w="0" w:type="dxa"/>
-              <w:right w:w="0" w:type="dxa"/>
-            </w:tcMar>
-            <w:vAlign w:val="center"/>
-          </w:tcPr>
-          <w:p>
-            <w:pPr>
-              <w:pStyle w:val="Normal"/>
+        body13
+        <w:tc>
+          <w:tcPr>
+            <w:tcBorders>
+              <w:bottom w:val="none" w:sz="0" w:space="0" w:color="000000"/>
+              <w:top w:val="none" w:sz="0" w:space="0" w:color="000000"/>
+              <w:left w:val="none" w:sz="0" w:space="0" w:color="000000"/>
+              <w:right w:val="none" w:sz="0" w:space="0" w:color="000000"/>
+            </w:tcBorders>
+            <w:shd w:val="clear" w:color="auto" w:fill="FFFFFF"/>
+            <w:tcMar>
+              <w:top w:w="0" w:type="dxa"/>
+              <w:bottom w:w="0" w:type="dxa"/>
+              <w:left w:w="0" w:type="dxa"/>
+              <w:right w:w="0" w:type="dxa"/>
+            </w:tcMar>
+            <w:vAlign w:val="center"/>
+          </w:tcPr>
+          <w:p>
+            <w:pPr>
               <w:jc w:val="left"/>
               <w:pBdr>
                 <w:bottom w:val="none" w:sz="0" w:space="0" w:color="000000"/>
@@ -4254,7 +4194,6 @@
           </w:tcPr>
           <w:p>
             <w:pPr>
-              <w:pStyle w:val="Normal"/>
               <w:jc w:val="center"/>
               <w:pBdr>
                 <w:bottom w:val="none" w:sz="0" w:space="0" w:color="000000"/>
@@ -4309,7 +4248,6 @@
           </w:tcPr>
           <w:p>
             <w:pPr>
-              <w:pStyle w:val="Normal"/>
               <w:jc w:val="center"/>
               <w:pBdr>
                 <w:bottom w:val="none" w:sz="0" w:space="0" w:color="000000"/>
@@ -4364,7 +4302,6 @@
           </w:tcPr>
           <w:p>
             <w:pPr>
-              <w:pStyle w:val="Normal"/>
               <w:jc w:val="center"/>
               <w:pBdr>
                 <w:bottom w:val="none" w:sz="0" w:space="0" w:color="000000"/>
@@ -4419,7 +4356,6 @@
           </w:tcPr>
           <w:p>
             <w:pPr>
-              <w:pStyle w:val="Normal"/>
               <w:jc w:val="center"/>
               <w:pBdr>
                 <w:bottom w:val="none" w:sz="0" w:space="0" w:color="000000"/>
@@ -4474,7 +4410,6 @@
           </w:tcPr>
           <w:p>
             <w:pPr>
-              <w:pStyle w:val="Normal"/>
               <w:jc w:val="center"/>
               <w:pBdr>
                 <w:bottom w:val="none" w:sz="0" w:space="0" w:color="000000"/>
@@ -4515,26 +4450,26 @@
         <w:trPr>
           <w:trHeight w:val="270" w:hRule="exact"/>
         </w:trPr>
-        <w:tc>
-          <w:tcPr>
-            <w:tcBorders>
-              <w:bottom w:val="none" w:sz="0" w:space="0" w:color="000000"/>
-              <w:top w:val="none" w:sz="0" w:space="0" w:color="000000"/>
-              <w:left w:val="none" w:sz="0" w:space="0" w:color="000000"/>
-              <w:right w:val="none" w:sz="0" w:space="0" w:color="000000"/>
-            </w:tcBorders>
-            <w:shd w:val="clear" w:color="auto" w:fill="FFFFFF"/>
-            <w:tcMar>
-              <w:top w:w="0" w:type="dxa"/>
-              <w:bottom w:w="0" w:type="dxa"/>
-              <w:left w:w="0" w:type="dxa"/>
-              <w:right w:w="0" w:type="dxa"/>
-            </w:tcMar>
-            <w:vAlign w:val="center"/>
-          </w:tcPr>
-          <w:p>
-            <w:pPr>
-              <w:pStyle w:val="Normal"/>
+        body14
+        <w:tc>
+          <w:tcPr>
+            <w:tcBorders>
+              <w:bottom w:val="none" w:sz="0" w:space="0" w:color="000000"/>
+              <w:top w:val="none" w:sz="0" w:space="0" w:color="000000"/>
+              <w:left w:val="none" w:sz="0" w:space="0" w:color="000000"/>
+              <w:right w:val="none" w:sz="0" w:space="0" w:color="000000"/>
+            </w:tcBorders>
+            <w:shd w:val="clear" w:color="auto" w:fill="FFFFFF"/>
+            <w:tcMar>
+              <w:top w:w="0" w:type="dxa"/>
+              <w:bottom w:w="0" w:type="dxa"/>
+              <w:left w:w="0" w:type="dxa"/>
+              <w:right w:w="0" w:type="dxa"/>
+            </w:tcMar>
+            <w:vAlign w:val="center"/>
+          </w:tcPr>
+          <w:p>
+            <w:pPr>
               <w:jc w:val="left"/>
               <w:pBdr>
                 <w:bottom w:val="none" w:sz="0" w:space="0" w:color="000000"/>
@@ -4589,7 +4524,6 @@
           </w:tcPr>
           <w:p>
             <w:pPr>
-              <w:pStyle w:val="Normal"/>
               <w:jc w:val="center"/>
               <w:pBdr>
                 <w:bottom w:val="none" w:sz="0" w:space="0" w:color="000000"/>
@@ -4644,7 +4578,6 @@
           </w:tcPr>
           <w:p>
             <w:pPr>
-              <w:pStyle w:val="Normal"/>
               <w:jc w:val="center"/>
               <w:pBdr>
                 <w:bottom w:val="none" w:sz="0" w:space="0" w:color="000000"/>
@@ -4699,7 +4632,6 @@
           </w:tcPr>
           <w:p>
             <w:pPr>
-              <w:pStyle w:val="Normal"/>
               <w:jc w:val="center"/>
               <w:pBdr>
                 <w:bottom w:val="none" w:sz="0" w:space="0" w:color="000000"/>
@@ -4754,7 +4686,6 @@
           </w:tcPr>
           <w:p>
             <w:pPr>
-              <w:pStyle w:val="Normal"/>
               <w:jc w:val="center"/>
               <w:pBdr>
                 <w:bottom w:val="none" w:sz="0" w:space="0" w:color="000000"/>
@@ -4809,7 +4740,6 @@
           </w:tcPr>
           <w:p>
             <w:pPr>
-              <w:pStyle w:val="Normal"/>
               <w:jc w:val="center"/>
               <w:pBdr>
                 <w:bottom w:val="none" w:sz="0" w:space="0" w:color="000000"/>
@@ -4850,26 +4780,26 @@
         <w:trPr>
           <w:trHeight w:val="270" w:hRule="exact"/>
         </w:trPr>
-        <w:tc>
-          <w:tcPr>
-            <w:tcBorders>
-              <w:bottom w:val="none" w:sz="0" w:space="0" w:color="000000"/>
-              <w:top w:val="none" w:sz="0" w:space="0" w:color="000000"/>
-              <w:left w:val="none" w:sz="0" w:space="0" w:color="000000"/>
-              <w:right w:val="none" w:sz="0" w:space="0" w:color="000000"/>
-            </w:tcBorders>
-            <w:shd w:val="clear" w:color="auto" w:fill="FFFFFF"/>
-            <w:tcMar>
-              <w:top w:w="0" w:type="dxa"/>
-              <w:bottom w:w="0" w:type="dxa"/>
-              <w:left w:w="0" w:type="dxa"/>
-              <w:right w:w="0" w:type="dxa"/>
-            </w:tcMar>
-            <w:vAlign w:val="center"/>
-          </w:tcPr>
-          <w:p>
-            <w:pPr>
-              <w:pStyle w:val="Normal"/>
+        body15
+        <w:tc>
+          <w:tcPr>
+            <w:tcBorders>
+              <w:bottom w:val="none" w:sz="0" w:space="0" w:color="000000"/>
+              <w:top w:val="none" w:sz="0" w:space="0" w:color="000000"/>
+              <w:left w:val="none" w:sz="0" w:space="0" w:color="000000"/>
+              <w:right w:val="none" w:sz="0" w:space="0" w:color="000000"/>
+            </w:tcBorders>
+            <w:shd w:val="clear" w:color="auto" w:fill="FFFFFF"/>
+            <w:tcMar>
+              <w:top w:w="0" w:type="dxa"/>
+              <w:bottom w:w="0" w:type="dxa"/>
+              <w:left w:w="0" w:type="dxa"/>
+              <w:right w:w="0" w:type="dxa"/>
+            </w:tcMar>
+            <w:vAlign w:val="center"/>
+          </w:tcPr>
+          <w:p>
+            <w:pPr>
               <w:jc w:val="left"/>
               <w:pBdr>
                 <w:bottom w:val="none" w:sz="0" w:space="0" w:color="000000"/>
@@ -4924,7 +4854,6 @@
           </w:tcPr>
           <w:p>
             <w:pPr>
-              <w:pStyle w:val="Normal"/>
               <w:jc w:val="center"/>
               <w:pBdr>
                 <w:bottom w:val="none" w:sz="0" w:space="0" w:color="000000"/>
@@ -4979,7 +4908,6 @@
           </w:tcPr>
           <w:p>
             <w:pPr>
-              <w:pStyle w:val="Normal"/>
               <w:jc w:val="center"/>
               <w:pBdr>
                 <w:bottom w:val="none" w:sz="0" w:space="0" w:color="000000"/>
@@ -5034,7 +4962,6 @@
           </w:tcPr>
           <w:p>
             <w:pPr>
-              <w:pStyle w:val="Normal"/>
               <w:jc w:val="center"/>
               <w:pBdr>
                 <w:bottom w:val="none" w:sz="0" w:space="0" w:color="000000"/>
@@ -5089,7 +5016,6 @@
           </w:tcPr>
           <w:p>
             <w:pPr>
-              <w:pStyle w:val="Normal"/>
               <w:jc w:val="center"/>
               <w:pBdr>
                 <w:bottom w:val="none" w:sz="0" w:space="0" w:color="000000"/>
@@ -5144,7 +5070,6 @@
           </w:tcPr>
           <w:p>
             <w:pPr>
-              <w:pStyle w:val="Normal"/>
               <w:jc w:val="center"/>
               <w:pBdr>
                 <w:bottom w:val="none" w:sz="0" w:space="0" w:color="000000"/>
@@ -5185,26 +5110,26 @@
         <w:trPr>
           <w:trHeight w:val="270" w:hRule="exact"/>
         </w:trPr>
-        <w:tc>
-          <w:tcPr>
-            <w:tcBorders>
-              <w:bottom w:val="none" w:sz="0" w:space="0" w:color="000000"/>
-              <w:top w:val="none" w:sz="0" w:space="0" w:color="000000"/>
-              <w:left w:val="none" w:sz="0" w:space="0" w:color="000000"/>
-              <w:right w:val="none" w:sz="0" w:space="0" w:color="000000"/>
-            </w:tcBorders>
-            <w:shd w:val="clear" w:color="auto" w:fill="FFFFFF"/>
-            <w:tcMar>
-              <w:top w:w="0" w:type="dxa"/>
-              <w:bottom w:w="0" w:type="dxa"/>
-              <w:left w:w="0" w:type="dxa"/>
-              <w:right w:w="0" w:type="dxa"/>
-            </w:tcMar>
-            <w:vAlign w:val="center"/>
-          </w:tcPr>
-          <w:p>
-            <w:pPr>
-              <w:pStyle w:val="Normal"/>
+        body16
+        <w:tc>
+          <w:tcPr>
+            <w:tcBorders>
+              <w:bottom w:val="none" w:sz="0" w:space="0" w:color="000000"/>
+              <w:top w:val="none" w:sz="0" w:space="0" w:color="000000"/>
+              <w:left w:val="none" w:sz="0" w:space="0" w:color="000000"/>
+              <w:right w:val="none" w:sz="0" w:space="0" w:color="000000"/>
+            </w:tcBorders>
+            <w:shd w:val="clear" w:color="auto" w:fill="FFFFFF"/>
+            <w:tcMar>
+              <w:top w:w="0" w:type="dxa"/>
+              <w:bottom w:w="0" w:type="dxa"/>
+              <w:left w:w="0" w:type="dxa"/>
+              <w:right w:w="0" w:type="dxa"/>
+            </w:tcMar>
+            <w:vAlign w:val="center"/>
+          </w:tcPr>
+          <w:p>
+            <w:pPr>
               <w:jc w:val="left"/>
               <w:pBdr>
                 <w:bottom w:val="none" w:sz="0" w:space="0" w:color="000000"/>
@@ -5259,7 +5184,6 @@
           </w:tcPr>
           <w:p>
             <w:pPr>
-              <w:pStyle w:val="Normal"/>
               <w:jc w:val="center"/>
               <w:pBdr>
                 <w:bottom w:val="none" w:sz="0" w:space="0" w:color="000000"/>
@@ -5314,7 +5238,6 @@
           </w:tcPr>
           <w:p>
             <w:pPr>
-              <w:pStyle w:val="Normal"/>
               <w:jc w:val="center"/>
               <w:pBdr>
                 <w:bottom w:val="none" w:sz="0" w:space="0" w:color="000000"/>
@@ -5369,7 +5292,6 @@
           </w:tcPr>
           <w:p>
             <w:pPr>
-              <w:pStyle w:val="Normal"/>
               <w:jc w:val="center"/>
               <w:pBdr>
                 <w:bottom w:val="none" w:sz="0" w:space="0" w:color="000000"/>
@@ -5424,7 +5346,6 @@
           </w:tcPr>
           <w:p>
             <w:pPr>
-              <w:pStyle w:val="Normal"/>
               <w:jc w:val="center"/>
               <w:pBdr>
                 <w:bottom w:val="none" w:sz="0" w:space="0" w:color="000000"/>
@@ -5479,7 +5400,6 @@
           </w:tcPr>
           <w:p>
             <w:pPr>
-              <w:pStyle w:val="Normal"/>
               <w:jc w:val="center"/>
               <w:pBdr>
                 <w:bottom w:val="none" w:sz="0" w:space="0" w:color="000000"/>
@@ -5520,26 +5440,26 @@
         <w:trPr>
           <w:trHeight w:val="270" w:hRule="exact"/>
         </w:trPr>
-        <w:tc>
-          <w:tcPr>
-            <w:tcBorders>
-              <w:bottom w:val="none" w:sz="0" w:space="0" w:color="000000"/>
-              <w:top w:val="none" w:sz="0" w:space="0" w:color="000000"/>
-              <w:left w:val="none" w:sz="0" w:space="0" w:color="000000"/>
-              <w:right w:val="none" w:sz="0" w:space="0" w:color="000000"/>
-            </w:tcBorders>
-            <w:shd w:val="clear" w:color="auto" w:fill="FFFFFF"/>
-            <w:tcMar>
-              <w:top w:w="0" w:type="dxa"/>
-              <w:bottom w:w="0" w:type="dxa"/>
-              <w:left w:w="0" w:type="dxa"/>
-              <w:right w:w="0" w:type="dxa"/>
-            </w:tcMar>
-            <w:vAlign w:val="center"/>
-          </w:tcPr>
-          <w:p>
-            <w:pPr>
-              <w:pStyle w:val="Normal"/>
+        body17
+        <w:tc>
+          <w:tcPr>
+            <w:tcBorders>
+              <w:bottom w:val="none" w:sz="0" w:space="0" w:color="000000"/>
+              <w:top w:val="none" w:sz="0" w:space="0" w:color="000000"/>
+              <w:left w:val="none" w:sz="0" w:space="0" w:color="000000"/>
+              <w:right w:val="none" w:sz="0" w:space="0" w:color="000000"/>
+            </w:tcBorders>
+            <w:shd w:val="clear" w:color="auto" w:fill="FFFFFF"/>
+            <w:tcMar>
+              <w:top w:w="0" w:type="dxa"/>
+              <w:bottom w:w="0" w:type="dxa"/>
+              <w:left w:w="0" w:type="dxa"/>
+              <w:right w:w="0" w:type="dxa"/>
+            </w:tcMar>
+            <w:vAlign w:val="center"/>
+          </w:tcPr>
+          <w:p>
+            <w:pPr>
               <w:jc w:val="left"/>
               <w:pBdr>
                 <w:bottom w:val="none" w:sz="0" w:space="0" w:color="000000"/>
@@ -5594,7 +5514,6 @@
           </w:tcPr>
           <w:p>
             <w:pPr>
-              <w:pStyle w:val="Normal"/>
               <w:jc w:val="center"/>
               <w:pBdr>
                 <w:bottom w:val="none" w:sz="0" w:space="0" w:color="000000"/>
@@ -5649,7 +5568,6 @@
           </w:tcPr>
           <w:p>
             <w:pPr>
-              <w:pStyle w:val="Normal"/>
               <w:jc w:val="center"/>
               <w:pBdr>
                 <w:bottom w:val="none" w:sz="0" w:space="0" w:color="000000"/>
@@ -5704,7 +5622,6 @@
           </w:tcPr>
           <w:p>
             <w:pPr>
-              <w:pStyle w:val="Normal"/>
               <w:jc w:val="center"/>
               <w:pBdr>
                 <w:bottom w:val="none" w:sz="0" w:space="0" w:color="000000"/>
@@ -5759,7 +5676,6 @@
           </w:tcPr>
           <w:p>
             <w:pPr>
-              <w:pStyle w:val="Normal"/>
               <w:jc w:val="center"/>
               <w:pBdr>
                 <w:bottom w:val="none" w:sz="0" w:space="0" w:color="000000"/>
@@ -5814,7 +5730,6 @@
           </w:tcPr>
           <w:p>
             <w:pPr>
-              <w:pStyle w:val="Normal"/>
               <w:jc w:val="center"/>
               <w:pBdr>
                 <w:bottom w:val="none" w:sz="0" w:space="0" w:color="000000"/>
@@ -5855,26 +5770,26 @@
         <w:trPr>
           <w:trHeight w:val="270" w:hRule="exact"/>
         </w:trPr>
-        <w:tc>
-          <w:tcPr>
-            <w:tcBorders>
-              <w:bottom w:val="none" w:sz="0" w:space="0" w:color="000000"/>
-              <w:top w:val="none" w:sz="0" w:space="0" w:color="000000"/>
-              <w:left w:val="none" w:sz="0" w:space="0" w:color="000000"/>
-              <w:right w:val="none" w:sz="0" w:space="0" w:color="000000"/>
-            </w:tcBorders>
-            <w:shd w:val="clear" w:color="auto" w:fill="FFFFFF"/>
-            <w:tcMar>
-              <w:top w:w="0" w:type="dxa"/>
-              <w:bottom w:w="0" w:type="dxa"/>
-              <w:left w:w="0" w:type="dxa"/>
-              <w:right w:w="0" w:type="dxa"/>
-            </w:tcMar>
-            <w:vAlign w:val="center"/>
-          </w:tcPr>
-          <w:p>
-            <w:pPr>
-              <w:pStyle w:val="Normal"/>
+        body18
+        <w:tc>
+          <w:tcPr>
+            <w:tcBorders>
+              <w:bottom w:val="none" w:sz="0" w:space="0" w:color="000000"/>
+              <w:top w:val="none" w:sz="0" w:space="0" w:color="000000"/>
+              <w:left w:val="none" w:sz="0" w:space="0" w:color="000000"/>
+              <w:right w:val="none" w:sz="0" w:space="0" w:color="000000"/>
+            </w:tcBorders>
+            <w:shd w:val="clear" w:color="auto" w:fill="FFFFFF"/>
+            <w:tcMar>
+              <w:top w:w="0" w:type="dxa"/>
+              <w:bottom w:w="0" w:type="dxa"/>
+              <w:left w:w="0" w:type="dxa"/>
+              <w:right w:w="0" w:type="dxa"/>
+            </w:tcMar>
+            <w:vAlign w:val="center"/>
+          </w:tcPr>
+          <w:p>
+            <w:pPr>
               <w:jc w:val="left"/>
               <w:pBdr>
                 <w:bottom w:val="none" w:sz="0" w:space="0" w:color="000000"/>
@@ -5929,7 +5844,6 @@
           </w:tcPr>
           <w:p>
             <w:pPr>
-              <w:pStyle w:val="Normal"/>
               <w:jc w:val="center"/>
               <w:pBdr>
                 <w:bottom w:val="none" w:sz="0" w:space="0" w:color="000000"/>
@@ -5984,7 +5898,6 @@
           </w:tcPr>
           <w:p>
             <w:pPr>
-              <w:pStyle w:val="Normal"/>
               <w:jc w:val="center"/>
               <w:pBdr>
                 <w:bottom w:val="none" w:sz="0" w:space="0" w:color="000000"/>
@@ -6039,7 +5952,6 @@
           </w:tcPr>
           <w:p>
             <w:pPr>
-              <w:pStyle w:val="Normal"/>
               <w:jc w:val="center"/>
               <w:pBdr>
                 <w:bottom w:val="none" w:sz="0" w:space="0" w:color="000000"/>
@@ -6094,7 +6006,6 @@
           </w:tcPr>
           <w:p>
             <w:pPr>
-              <w:pStyle w:val="Normal"/>
               <w:jc w:val="center"/>
               <w:pBdr>
                 <w:bottom w:val="none" w:sz="0" w:space="0" w:color="000000"/>
@@ -6149,7 +6060,6 @@
           </w:tcPr>
           <w:p>
             <w:pPr>
-              <w:pStyle w:val="Normal"/>
               <w:jc w:val="center"/>
               <w:pBdr>
                 <w:bottom w:val="none" w:sz="0" w:space="0" w:color="000000"/>
@@ -6190,26 +6100,26 @@
         <w:trPr>
           <w:trHeight w:val="270" w:hRule="exact"/>
         </w:trPr>
-        <w:tc>
-          <w:tcPr>
-            <w:tcBorders>
-              <w:bottom w:val="none" w:sz="0" w:space="0" w:color="000000"/>
-              <w:top w:val="none" w:sz="0" w:space="0" w:color="000000"/>
-              <w:left w:val="none" w:sz="0" w:space="0" w:color="000000"/>
-              <w:right w:val="none" w:sz="0" w:space="0" w:color="000000"/>
-            </w:tcBorders>
-            <w:shd w:val="clear" w:color="auto" w:fill="FFFFFF"/>
-            <w:tcMar>
-              <w:top w:w="0" w:type="dxa"/>
-              <w:bottom w:w="0" w:type="dxa"/>
-              <w:left w:w="0" w:type="dxa"/>
-              <w:right w:w="0" w:type="dxa"/>
-            </w:tcMar>
-            <w:vAlign w:val="center"/>
-          </w:tcPr>
-          <w:p>
-            <w:pPr>
-              <w:pStyle w:val="Normal"/>
+        body19
+        <w:tc>
+          <w:tcPr>
+            <w:tcBorders>
+              <w:bottom w:val="none" w:sz="0" w:space="0" w:color="000000"/>
+              <w:top w:val="none" w:sz="0" w:space="0" w:color="000000"/>
+              <w:left w:val="none" w:sz="0" w:space="0" w:color="000000"/>
+              <w:right w:val="none" w:sz="0" w:space="0" w:color="000000"/>
+            </w:tcBorders>
+            <w:shd w:val="clear" w:color="auto" w:fill="FFFFFF"/>
+            <w:tcMar>
+              <w:top w:w="0" w:type="dxa"/>
+              <w:bottom w:w="0" w:type="dxa"/>
+              <w:left w:w="0" w:type="dxa"/>
+              <w:right w:w="0" w:type="dxa"/>
+            </w:tcMar>
+            <w:vAlign w:val="center"/>
+          </w:tcPr>
+          <w:p>
+            <w:pPr>
               <w:jc w:val="left"/>
               <w:pBdr>
                 <w:bottom w:val="none" w:sz="0" w:space="0" w:color="000000"/>
@@ -6264,7 +6174,6 @@
           </w:tcPr>
           <w:p>
             <w:pPr>
-              <w:pStyle w:val="Normal"/>
               <w:jc w:val="center"/>
               <w:pBdr>
                 <w:bottom w:val="none" w:sz="0" w:space="0" w:color="000000"/>
@@ -6319,7 +6228,6 @@
           </w:tcPr>
           <w:p>
             <w:pPr>
-              <w:pStyle w:val="Normal"/>
               <w:jc w:val="center"/>
               <w:pBdr>
                 <w:bottom w:val="none" w:sz="0" w:space="0" w:color="000000"/>
@@ -6374,7 +6282,6 @@
           </w:tcPr>
           <w:p>
             <w:pPr>
-              <w:pStyle w:val="Normal"/>
               <w:jc w:val="center"/>
               <w:pBdr>
                 <w:bottom w:val="none" w:sz="0" w:space="0" w:color="000000"/>
@@ -6429,7 +6336,6 @@
           </w:tcPr>
           <w:p>
             <w:pPr>
-              <w:pStyle w:val="Normal"/>
               <w:jc w:val="center"/>
               <w:pBdr>
                 <w:bottom w:val="none" w:sz="0" w:space="0" w:color="000000"/>
@@ -6484,7 +6390,6 @@
           </w:tcPr>
           <w:p>
             <w:pPr>
-              <w:pStyle w:val="Normal"/>
               <w:jc w:val="center"/>
               <w:pBdr>
                 <w:bottom w:val="none" w:sz="0" w:space="0" w:color="000000"/>
@@ -6525,26 +6430,26 @@
         <w:trPr>
           <w:trHeight w:val="270" w:hRule="exact"/>
         </w:trPr>
-        <w:tc>
-          <w:tcPr>
-            <w:tcBorders>
-              <w:bottom w:val="none" w:sz="0" w:space="0" w:color="000000"/>
-              <w:top w:val="none" w:sz="0" w:space="0" w:color="000000"/>
-              <w:left w:val="none" w:sz="0" w:space="0" w:color="000000"/>
-              <w:right w:val="none" w:sz="0" w:space="0" w:color="000000"/>
-            </w:tcBorders>
-            <w:shd w:val="clear" w:color="auto" w:fill="FFFFFF"/>
-            <w:tcMar>
-              <w:top w:w="0" w:type="dxa"/>
-              <w:bottom w:w="0" w:type="dxa"/>
-              <w:left w:w="0" w:type="dxa"/>
-              <w:right w:w="0" w:type="dxa"/>
-            </w:tcMar>
-            <w:vAlign w:val="center"/>
-          </w:tcPr>
-          <w:p>
-            <w:pPr>
-              <w:pStyle w:val="Normal"/>
+        body20
+        <w:tc>
+          <w:tcPr>
+            <w:tcBorders>
+              <w:bottom w:val="none" w:sz="0" w:space="0" w:color="000000"/>
+              <w:top w:val="none" w:sz="0" w:space="0" w:color="000000"/>
+              <w:left w:val="none" w:sz="0" w:space="0" w:color="000000"/>
+              <w:right w:val="none" w:sz="0" w:space="0" w:color="000000"/>
+            </w:tcBorders>
+            <w:shd w:val="clear" w:color="auto" w:fill="FFFFFF"/>
+            <w:tcMar>
+              <w:top w:w="0" w:type="dxa"/>
+              <w:bottom w:w="0" w:type="dxa"/>
+              <w:left w:w="0" w:type="dxa"/>
+              <w:right w:w="0" w:type="dxa"/>
+            </w:tcMar>
+            <w:vAlign w:val="center"/>
+          </w:tcPr>
+          <w:p>
+            <w:pPr>
               <w:jc w:val="left"/>
               <w:pBdr>
                 <w:bottom w:val="none" w:sz="0" w:space="0" w:color="000000"/>
@@ -6599,7 +6504,6 @@
           </w:tcPr>
           <w:p>
             <w:pPr>
-              <w:pStyle w:val="Normal"/>
               <w:jc w:val="center"/>
               <w:pBdr>
                 <w:bottom w:val="none" w:sz="0" w:space="0" w:color="000000"/>
@@ -6654,7 +6558,6 @@
           </w:tcPr>
           <w:p>
             <w:pPr>
-              <w:pStyle w:val="Normal"/>
               <w:jc w:val="center"/>
               <w:pBdr>
                 <w:bottom w:val="none" w:sz="0" w:space="0" w:color="000000"/>
@@ -6709,7 +6612,6 @@
           </w:tcPr>
           <w:p>
             <w:pPr>
-              <w:pStyle w:val="Normal"/>
               <w:jc w:val="center"/>
               <w:pBdr>
                 <w:bottom w:val="none" w:sz="0" w:space="0" w:color="000000"/>
@@ -6764,7 +6666,6 @@
           </w:tcPr>
           <w:p>
             <w:pPr>
-              <w:pStyle w:val="Normal"/>
               <w:jc w:val="center"/>
               <w:pBdr>
                 <w:bottom w:val="none" w:sz="0" w:space="0" w:color="000000"/>
@@ -6819,7 +6720,6 @@
           </w:tcPr>
           <w:p>
             <w:pPr>
-              <w:pStyle w:val="Normal"/>
               <w:jc w:val="center"/>
               <w:pBdr>
                 <w:bottom w:val="none" w:sz="0" w:space="0" w:color="000000"/>
@@ -6860,26 +6760,26 @@
         <w:trPr>
           <w:trHeight w:val="270" w:hRule="exact"/>
         </w:trPr>
-        <w:tc>
-          <w:tcPr>
-            <w:tcBorders>
-              <w:bottom w:val="none" w:sz="0" w:space="0" w:color="000000"/>
-              <w:top w:val="none" w:sz="0" w:space="0" w:color="000000"/>
-              <w:left w:val="none" w:sz="0" w:space="0" w:color="000000"/>
-              <w:right w:val="none" w:sz="0" w:space="0" w:color="000000"/>
-            </w:tcBorders>
-            <w:shd w:val="clear" w:color="auto" w:fill="FFFFFF"/>
-            <w:tcMar>
-              <w:top w:w="0" w:type="dxa"/>
-              <w:bottom w:w="0" w:type="dxa"/>
-              <w:left w:w="0" w:type="dxa"/>
-              <w:right w:w="0" w:type="dxa"/>
-            </w:tcMar>
-            <w:vAlign w:val="center"/>
-          </w:tcPr>
-          <w:p>
-            <w:pPr>
-              <w:pStyle w:val="Normal"/>
+        body21
+        <w:tc>
+          <w:tcPr>
+            <w:tcBorders>
+              <w:bottom w:val="none" w:sz="0" w:space="0" w:color="000000"/>
+              <w:top w:val="none" w:sz="0" w:space="0" w:color="000000"/>
+              <w:left w:val="none" w:sz="0" w:space="0" w:color="000000"/>
+              <w:right w:val="none" w:sz="0" w:space="0" w:color="000000"/>
+            </w:tcBorders>
+            <w:shd w:val="clear" w:color="auto" w:fill="FFFFFF"/>
+            <w:tcMar>
+              <w:top w:w="0" w:type="dxa"/>
+              <w:bottom w:w="0" w:type="dxa"/>
+              <w:left w:w="0" w:type="dxa"/>
+              <w:right w:w="0" w:type="dxa"/>
+            </w:tcMar>
+            <w:vAlign w:val="center"/>
+          </w:tcPr>
+          <w:p>
+            <w:pPr>
               <w:jc w:val="left"/>
               <w:pBdr>
                 <w:bottom w:val="none" w:sz="0" w:space="0" w:color="000000"/>
@@ -6934,7 +6834,6 @@
           </w:tcPr>
           <w:p>
             <w:pPr>
-              <w:pStyle w:val="Normal"/>
               <w:jc w:val="center"/>
               <w:pBdr>
                 <w:bottom w:val="none" w:sz="0" w:space="0" w:color="000000"/>
@@ -6989,7 +6888,6 @@
           </w:tcPr>
           <w:p>
             <w:pPr>
-              <w:pStyle w:val="Normal"/>
               <w:jc w:val="center"/>
               <w:pBdr>
                 <w:bottom w:val="none" w:sz="0" w:space="0" w:color="000000"/>
@@ -7044,7 +6942,6 @@
           </w:tcPr>
           <w:p>
             <w:pPr>
-              <w:pStyle w:val="Normal"/>
               <w:jc w:val="center"/>
               <w:pBdr>
                 <w:bottom w:val="none" w:sz="0" w:space="0" w:color="000000"/>
@@ -7099,7 +6996,6 @@
           </w:tcPr>
           <w:p>
             <w:pPr>
-              <w:pStyle w:val="Normal"/>
               <w:jc w:val="center"/>
               <w:pBdr>
                 <w:bottom w:val="none" w:sz="0" w:space="0" w:color="000000"/>
@@ -7154,7 +7050,6 @@
           </w:tcPr>
           <w:p>
             <w:pPr>
-              <w:pStyle w:val="Normal"/>
               <w:jc w:val="center"/>
               <w:pBdr>
                 <w:bottom w:val="none" w:sz="0" w:space="0" w:color="000000"/>
@@ -7195,26 +7090,26 @@
         <w:trPr>
           <w:trHeight w:val="270" w:hRule="exact"/>
         </w:trPr>
-        <w:tc>
-          <w:tcPr>
-            <w:tcBorders>
-              <w:bottom w:val="none" w:sz="0" w:space="0" w:color="000000"/>
-              <w:top w:val="none" w:sz="0" w:space="0" w:color="000000"/>
-              <w:left w:val="none" w:sz="0" w:space="0" w:color="000000"/>
-              <w:right w:val="none" w:sz="0" w:space="0" w:color="000000"/>
-            </w:tcBorders>
-            <w:shd w:val="clear" w:color="auto" w:fill="FFFFFF"/>
-            <w:tcMar>
-              <w:top w:w="0" w:type="dxa"/>
-              <w:bottom w:w="0" w:type="dxa"/>
-              <w:left w:w="0" w:type="dxa"/>
-              <w:right w:w="0" w:type="dxa"/>
-            </w:tcMar>
-            <w:vAlign w:val="center"/>
-          </w:tcPr>
-          <w:p>
-            <w:pPr>
-              <w:pStyle w:val="Normal"/>
+        body22
+        <w:tc>
+          <w:tcPr>
+            <w:tcBorders>
+              <w:bottom w:val="none" w:sz="0" w:space="0" w:color="000000"/>
+              <w:top w:val="none" w:sz="0" w:space="0" w:color="000000"/>
+              <w:left w:val="none" w:sz="0" w:space="0" w:color="000000"/>
+              <w:right w:val="none" w:sz="0" w:space="0" w:color="000000"/>
+            </w:tcBorders>
+            <w:shd w:val="clear" w:color="auto" w:fill="FFFFFF"/>
+            <w:tcMar>
+              <w:top w:w="0" w:type="dxa"/>
+              <w:bottom w:w="0" w:type="dxa"/>
+              <w:left w:w="0" w:type="dxa"/>
+              <w:right w:w="0" w:type="dxa"/>
+            </w:tcMar>
+            <w:vAlign w:val="center"/>
+          </w:tcPr>
+          <w:p>
+            <w:pPr>
               <w:jc w:val="left"/>
               <w:pBdr>
                 <w:bottom w:val="none" w:sz="0" w:space="0" w:color="000000"/>
@@ -7269,7 +7164,6 @@
           </w:tcPr>
           <w:p>
             <w:pPr>
-              <w:pStyle w:val="Normal"/>
               <w:jc w:val="center"/>
               <w:pBdr>
                 <w:bottom w:val="none" w:sz="0" w:space="0" w:color="000000"/>
@@ -7324,7 +7218,6 @@
           </w:tcPr>
           <w:p>
             <w:pPr>
-              <w:pStyle w:val="Normal"/>
               <w:jc w:val="center"/>
               <w:pBdr>
                 <w:bottom w:val="none" w:sz="0" w:space="0" w:color="000000"/>
@@ -7379,7 +7272,6 @@
           </w:tcPr>
           <w:p>
             <w:pPr>
-              <w:pStyle w:val="Normal"/>
               <w:jc w:val="center"/>
               <w:pBdr>
                 <w:bottom w:val="none" w:sz="0" w:space="0" w:color="000000"/>
@@ -7434,7 +7326,6 @@
           </w:tcPr>
           <w:p>
             <w:pPr>
-              <w:pStyle w:val="Normal"/>
               <w:jc w:val="center"/>
               <w:pBdr>
                 <w:bottom w:val="none" w:sz="0" w:space="0" w:color="000000"/>
@@ -7489,7 +7380,6 @@
           </w:tcPr>
           <w:p>
             <w:pPr>
-              <w:pStyle w:val="Normal"/>
               <w:jc w:val="center"/>
               <w:pBdr>
                 <w:bottom w:val="none" w:sz="0" w:space="0" w:color="000000"/>
@@ -7530,26 +7420,26 @@
         <w:trPr>
           <w:trHeight w:val="270" w:hRule="exact"/>
         </w:trPr>
-        <w:tc>
-          <w:tcPr>
-            <w:tcBorders>
-              <w:bottom w:val="none" w:sz="0" w:space="0" w:color="000000"/>
-              <w:top w:val="none" w:sz="0" w:space="0" w:color="000000"/>
-              <w:left w:val="none" w:sz="0" w:space="0" w:color="000000"/>
-              <w:right w:val="none" w:sz="0" w:space="0" w:color="000000"/>
-            </w:tcBorders>
-            <w:shd w:val="clear" w:color="auto" w:fill="FFFFFF"/>
-            <w:tcMar>
-              <w:top w:w="0" w:type="dxa"/>
-              <w:bottom w:w="0" w:type="dxa"/>
-              <w:left w:w="0" w:type="dxa"/>
-              <w:right w:w="0" w:type="dxa"/>
-            </w:tcMar>
-            <w:vAlign w:val="center"/>
-          </w:tcPr>
-          <w:p>
-            <w:pPr>
-              <w:pStyle w:val="Normal"/>
+        body23
+        <w:tc>
+          <w:tcPr>
+            <w:tcBorders>
+              <w:bottom w:val="none" w:sz="0" w:space="0" w:color="000000"/>
+              <w:top w:val="none" w:sz="0" w:space="0" w:color="000000"/>
+              <w:left w:val="none" w:sz="0" w:space="0" w:color="000000"/>
+              <w:right w:val="none" w:sz="0" w:space="0" w:color="000000"/>
+            </w:tcBorders>
+            <w:shd w:val="clear" w:color="auto" w:fill="FFFFFF"/>
+            <w:tcMar>
+              <w:top w:w="0" w:type="dxa"/>
+              <w:bottom w:w="0" w:type="dxa"/>
+              <w:left w:w="0" w:type="dxa"/>
+              <w:right w:w="0" w:type="dxa"/>
+            </w:tcMar>
+            <w:vAlign w:val="center"/>
+          </w:tcPr>
+          <w:p>
+            <w:pPr>
               <w:jc w:val="left"/>
               <w:pBdr>
                 <w:bottom w:val="none" w:sz="0" w:space="0" w:color="000000"/>
@@ -7604,7 +7494,6 @@
           </w:tcPr>
           <w:p>
             <w:pPr>
-              <w:pStyle w:val="Normal"/>
               <w:jc w:val="center"/>
               <w:pBdr>
                 <w:bottom w:val="none" w:sz="0" w:space="0" w:color="000000"/>
@@ -7659,7 +7548,6 @@
           </w:tcPr>
           <w:p>
             <w:pPr>
-              <w:pStyle w:val="Normal"/>
               <w:jc w:val="center"/>
               <w:pBdr>
                 <w:bottom w:val="none" w:sz="0" w:space="0" w:color="000000"/>
@@ -7714,7 +7602,6 @@
           </w:tcPr>
           <w:p>
             <w:pPr>
-              <w:pStyle w:val="Normal"/>
               <w:jc w:val="center"/>
               <w:pBdr>
                 <w:bottom w:val="none" w:sz="0" w:space="0" w:color="000000"/>
@@ -7769,7 +7656,6 @@
           </w:tcPr>
           <w:p>
             <w:pPr>
-              <w:pStyle w:val="Normal"/>
               <w:jc w:val="center"/>
               <w:pBdr>
                 <w:bottom w:val="none" w:sz="0" w:space="0" w:color="000000"/>
@@ -7824,7 +7710,6 @@
           </w:tcPr>
           <w:p>
             <w:pPr>
-              <w:pStyle w:val="Normal"/>
               <w:jc w:val="center"/>
               <w:pBdr>
                 <w:bottom w:val="none" w:sz="0" w:space="0" w:color="000000"/>

</xml_diff>